<commit_message>
docker - architecture updated
</commit_message>
<xml_diff>
--- a/Docker/2-architecture.docx
+++ b/Docker/2-architecture.docx
@@ -13911,18 +13911,7 @@
           <w:szCs w:val="28"/>
           <w:lang w:bidi="fa-IR"/>
         </w:rPr>
-        <w:t>W</w:t>
-      </w:r>
-      <w:r>
-        <w:rPr>
-          <w:rFonts w:asciiTheme="majorBidi" w:hAnsiTheme="majorBidi" w:cstheme="majorBidi"/>
-          <w:b/>
-          <w:bCs/>
-          <w:sz w:val="28"/>
-          <w:szCs w:val="28"/>
-          <w:lang w:bidi="fa-IR"/>
-        </w:rPr>
-        <w:t>hy use shim at all if Linux already protects child processes?</w:t>
+        <w:t>Why use shim at all if Linux already protects child processes?</w:t>
       </w:r>
     </w:p>
     <w:p>
@@ -14433,6 +14422,506 @@
           <w:rFonts w:asciiTheme="majorBidi" w:hAnsiTheme="majorBidi" w:cstheme="majorBidi"/>
           <w:sz w:val="28"/>
           <w:szCs w:val="28"/>
+          <w:lang w:bidi="fa-IR"/>
+        </w:rPr>
+      </w:pPr>
+      <w:r>
+        <w:rPr>
+          <w:rFonts w:asciiTheme="majorBidi" w:hAnsiTheme="majorBidi" w:cstheme="majorBidi"/>
+          <w:sz w:val="28"/>
+          <w:szCs w:val="28"/>
+          <w:lang w:bidi="fa-IR"/>
+        </w:rPr>
+        <w:t>In Linux, when a parent dies, file descriptors connected to it may close. That can break communication streams. The shim keeps these streams open and stable.</w:t>
+      </w:r>
+    </w:p>
+    <w:p>
+      <w:pPr>
+        <w:jc w:val="both"/>
+        <w:rPr>
+          <w:rFonts w:asciiTheme="majorBidi" w:hAnsiTheme="majorBidi" w:cstheme="majorBidi"/>
+          <w:b/>
+          <w:bCs/>
+          <w:sz w:val="36"/>
+          <w:szCs w:val="36"/>
+          <w:lang w:bidi="fa-IR"/>
+        </w:rPr>
+      </w:pPr>
+      <w:r>
+        <w:rPr>
+          <w:rFonts w:asciiTheme="majorBidi" w:hAnsiTheme="majorBidi" w:cstheme="majorBidi"/>
+          <w:b/>
+          <w:bCs/>
+          <w:sz w:val="36"/>
+          <w:szCs w:val="36"/>
+          <w:lang w:bidi="fa-IR"/>
+        </w:rPr>
+        <w:lastRenderedPageBreak/>
+        <w:t>Engine Maintenance &amp; Cleanup:</w:t>
+      </w:r>
+    </w:p>
+    <w:p>
+      <w:pPr>
+        <w:jc w:val="both"/>
+        <w:rPr>
+          <w:rFonts w:asciiTheme="majorBidi" w:hAnsiTheme="majorBidi" w:cstheme="majorBidi"/>
+          <w:b/>
+          <w:bCs/>
+          <w:sz w:val="36"/>
+          <w:szCs w:val="36"/>
+          <w:lang w:bidi="fa-IR"/>
+        </w:rPr>
+      </w:pPr>
+      <w:r>
+        <w:rPr>
+          <w:rFonts w:asciiTheme="majorBidi" w:hAnsiTheme="majorBidi" w:cstheme="majorBidi"/>
+          <w:b/>
+          <w:bCs/>
+          <w:i/>
+          <w:iCs/>
+          <w:sz w:val="32"/>
+          <w:szCs w:val="32"/>
+          <w:lang w:bidi="fa-IR"/>
+        </w:rPr>
+        <w:t>docker system</w:t>
+      </w:r>
+      <w:r>
+        <w:rPr>
+          <w:rFonts w:asciiTheme="majorBidi" w:hAnsiTheme="majorBidi" w:cstheme="majorBidi"/>
+          <w:b/>
+          <w:bCs/>
+          <w:sz w:val="32"/>
+          <w:szCs w:val="32"/>
+          <w:lang w:bidi="fa-IR"/>
+        </w:rPr>
+        <w:t xml:space="preserve"> command:</w:t>
+      </w:r>
+    </w:p>
+    <w:p>
+      <w:pPr>
+        <w:rPr>
+          <w:rFonts w:asciiTheme="majorBidi" w:hAnsiTheme="majorBidi" w:cstheme="majorBidi"/>
+          <w:sz w:val="28"/>
+          <w:szCs w:val="28"/>
+          <w:lang w:bidi="fa-IR"/>
+        </w:rPr>
+      </w:pPr>
+      <w:r>
+        <w:rPr>
+          <w:rFonts w:asciiTheme="majorBidi" w:hAnsiTheme="majorBidi" w:cstheme="majorBidi"/>
+          <w:b/>
+          <w:bCs/>
+          <w:i/>
+          <w:iCs/>
+          <w:sz w:val="28"/>
+          <w:szCs w:val="28"/>
+          <w:lang w:bidi="fa-IR"/>
+        </w:rPr>
+        <w:t>docker system</w:t>
+      </w:r>
+      <w:r>
+        <w:rPr>
+          <w:rFonts w:asciiTheme="majorBidi" w:hAnsiTheme="majorBidi" w:cstheme="majorBidi"/>
+          <w:sz w:val="28"/>
+          <w:szCs w:val="28"/>
+          <w:lang w:bidi="fa-IR"/>
+        </w:rPr>
+        <w:t xml:space="preserve"> is about global Docker housekeeping </w:t>
+      </w:r>
+      <w:r>
+        <w:rPr>
+          <w:rFonts w:asciiTheme="majorBidi" w:hAnsiTheme="majorBidi" w:cstheme="majorBidi"/>
+          <w:sz w:val="28"/>
+          <w:szCs w:val="28"/>
+          <w:lang w:bidi="fa-IR"/>
+        </w:rPr>
+        <w:t>-</w:t>
+      </w:r>
+      <w:r>
+        <w:rPr>
+          <w:rFonts w:asciiTheme="majorBidi" w:hAnsiTheme="majorBidi" w:cstheme="majorBidi"/>
+          <w:sz w:val="28"/>
+          <w:szCs w:val="28"/>
+          <w:lang w:bidi="fa-IR"/>
+        </w:rPr>
+        <w:t xml:space="preserve"> storage, cleanup, and disk usage across the whole engine.</w:t>
+      </w:r>
+    </w:p>
+    <w:p>
+      <w:pPr>
+        <w:rPr>
+          <w:rFonts w:asciiTheme="majorBidi" w:hAnsiTheme="majorBidi" w:cstheme="majorBidi"/>
+          <w:b/>
+          <w:bCs/>
+          <w:sz w:val="28"/>
+          <w:szCs w:val="28"/>
+          <w:u w:val="single"/>
+          <w:lang w:bidi="fa-IR"/>
+        </w:rPr>
+      </w:pPr>
+      <w:r>
+        <w:rPr>
+          <w:rFonts w:asciiTheme="majorBidi" w:hAnsiTheme="majorBidi" w:cstheme="majorBidi"/>
+          <w:b/>
+          <w:bCs/>
+          <w:sz w:val="28"/>
+          <w:szCs w:val="28"/>
+          <w:u w:val="single"/>
+          <w:lang w:bidi="fa-IR"/>
+        </w:rPr>
+        <w:t>The most important subcommands:</w:t>
+      </w:r>
+    </w:p>
+    <w:p>
+      <w:pPr>
+        <w:pStyle w:val="ListParagraph"/>
+        <w:numPr>
+          <w:ilvl w:val="0"/>
+          <w:numId w:val="34"/>
+        </w:numPr>
+        <w:ind w:left="360"/>
+        <w:rPr>
+          <w:rFonts w:asciiTheme="majorBidi" w:hAnsiTheme="majorBidi" w:cstheme="majorBidi"/>
+          <w:sz w:val="28"/>
+          <w:szCs w:val="28"/>
+          <w:lang w:bidi="fa-IR"/>
+        </w:rPr>
+      </w:pPr>
+      <w:r>
+        <w:rPr>
+          <w:rFonts w:asciiTheme="majorBidi" w:hAnsiTheme="majorBidi" w:cstheme="majorBidi"/>
+          <w:b/>
+          <w:bCs/>
+          <w:i/>
+          <w:iCs/>
+          <w:sz w:val="28"/>
+          <w:szCs w:val="28"/>
+          <w:lang w:bidi="fa-IR"/>
+        </w:rPr>
+        <w:t xml:space="preserve">docker system </w:t>
+      </w:r>
+      <w:proofErr w:type="spellStart"/>
+      <w:r>
+        <w:rPr>
+          <w:rFonts w:asciiTheme="majorBidi" w:hAnsiTheme="majorBidi" w:cstheme="majorBidi"/>
+          <w:b/>
+          <w:bCs/>
+          <w:i/>
+          <w:iCs/>
+          <w:sz w:val="28"/>
+          <w:szCs w:val="28"/>
+          <w:lang w:bidi="fa-IR"/>
+        </w:rPr>
+        <w:t>df</w:t>
+      </w:r>
+      <w:proofErr w:type="spellEnd"/>
+      <w:r>
+        <w:rPr>
+          <w:rFonts w:asciiTheme="majorBidi" w:hAnsiTheme="majorBidi" w:cstheme="majorBidi"/>
+          <w:sz w:val="28"/>
+          <w:szCs w:val="28"/>
+          <w:lang w:bidi="fa-IR"/>
+        </w:rPr>
+        <w:t xml:space="preserve"> → Shows how much space images, containers, volumes, and build cache are using. Think of it as Docker’s disk usage report.</w:t>
+      </w:r>
+      <w:r>
+        <w:rPr>
+          <w:rFonts w:asciiTheme="majorBidi" w:hAnsiTheme="majorBidi" w:cstheme="majorBidi"/>
+          <w:sz w:val="28"/>
+          <w:szCs w:val="28"/>
+          <w:lang w:bidi="fa-IR"/>
+        </w:rPr>
+        <w:t xml:space="preserve"> (</w:t>
+      </w:r>
+      <w:r>
+        <w:rPr>
+          <w:rFonts w:asciiTheme="majorBidi" w:hAnsiTheme="majorBidi" w:cstheme="majorBidi"/>
+          <w:sz w:val="28"/>
+          <w:szCs w:val="28"/>
+          <w:lang w:bidi="fa-IR"/>
+        </w:rPr>
+        <w:t xml:space="preserve">Add </w:t>
+      </w:r>
+      <w:r>
+        <w:rPr>
+          <w:rFonts w:asciiTheme="majorBidi" w:hAnsiTheme="majorBidi" w:cstheme="majorBidi"/>
+          <w:b/>
+          <w:bCs/>
+          <w:i/>
+          <w:iCs/>
+          <w:sz w:val="28"/>
+          <w:szCs w:val="28"/>
+          <w:lang w:bidi="fa-IR"/>
+        </w:rPr>
+        <w:t>-v</w:t>
+      </w:r>
+      <w:r>
+        <w:rPr>
+          <w:rFonts w:asciiTheme="majorBidi" w:hAnsiTheme="majorBidi" w:cstheme="majorBidi"/>
+          <w:sz w:val="28"/>
+          <w:szCs w:val="28"/>
+          <w:lang w:bidi="fa-IR"/>
+        </w:rPr>
+        <w:t xml:space="preserve"> for more detailed output</w:t>
+      </w:r>
+      <w:r>
+        <w:rPr>
+          <w:rFonts w:asciiTheme="majorBidi" w:hAnsiTheme="majorBidi" w:cstheme="majorBidi"/>
+          <w:sz w:val="28"/>
+          <w:szCs w:val="28"/>
+          <w:lang w:bidi="fa-IR"/>
+        </w:rPr>
+        <w:t>)</w:t>
+      </w:r>
+    </w:p>
+    <w:p>
+      <w:pPr>
+        <w:pStyle w:val="ListParagraph"/>
+        <w:numPr>
+          <w:ilvl w:val="0"/>
+          <w:numId w:val="35"/>
+        </w:numPr>
+        <w:ind w:left="360"/>
+        <w:rPr>
+          <w:rFonts w:asciiTheme="majorBidi" w:hAnsiTheme="majorBidi" w:cstheme="majorBidi"/>
+          <w:sz w:val="28"/>
+          <w:szCs w:val="28"/>
+          <w:lang w:bidi="fa-IR"/>
+        </w:rPr>
+      </w:pPr>
+      <w:r>
+        <w:rPr>
+          <w:rFonts w:asciiTheme="majorBidi" w:hAnsiTheme="majorBidi" w:cstheme="majorBidi"/>
+          <w:b/>
+          <w:bCs/>
+          <w:i/>
+          <w:iCs/>
+          <w:sz w:val="28"/>
+          <w:szCs w:val="28"/>
+          <w:lang w:bidi="fa-IR"/>
+        </w:rPr>
+        <w:t>docker system prune</w:t>
+      </w:r>
+      <w:r>
+        <w:rPr>
+          <w:rFonts w:asciiTheme="majorBidi" w:hAnsiTheme="majorBidi" w:cstheme="majorBidi"/>
+          <w:sz w:val="28"/>
+          <w:szCs w:val="28"/>
+          <w:lang w:bidi="fa-IR"/>
+        </w:rPr>
+        <w:t xml:space="preserve"> → Removes unused data:</w:t>
+      </w:r>
+    </w:p>
+    <w:p>
+      <w:pPr>
+        <w:pStyle w:val="ListParagraph"/>
+        <w:numPr>
+          <w:ilvl w:val="1"/>
+          <w:numId w:val="35"/>
+        </w:numPr>
+        <w:ind w:left="720"/>
+        <w:rPr>
+          <w:rFonts w:asciiTheme="majorBidi" w:hAnsiTheme="majorBidi" w:cstheme="majorBidi"/>
+          <w:sz w:val="28"/>
+          <w:szCs w:val="28"/>
+          <w:lang w:bidi="fa-IR"/>
+        </w:rPr>
+      </w:pPr>
+      <w:r>
+        <w:rPr>
+          <w:rFonts w:asciiTheme="majorBidi" w:hAnsiTheme="majorBidi" w:cstheme="majorBidi"/>
+          <w:sz w:val="28"/>
+          <w:szCs w:val="28"/>
+          <w:lang w:bidi="fa-IR"/>
+        </w:rPr>
+        <w:t>stopped containers</w:t>
+      </w:r>
+    </w:p>
+    <w:p>
+      <w:pPr>
+        <w:pStyle w:val="ListParagraph"/>
+        <w:numPr>
+          <w:ilvl w:val="1"/>
+          <w:numId w:val="35"/>
+        </w:numPr>
+        <w:ind w:left="720"/>
+        <w:rPr>
+          <w:rFonts w:asciiTheme="majorBidi" w:hAnsiTheme="majorBidi" w:cstheme="majorBidi"/>
+          <w:sz w:val="28"/>
+          <w:szCs w:val="28"/>
+          <w:lang w:bidi="fa-IR"/>
+        </w:rPr>
+      </w:pPr>
+      <w:r>
+        <w:rPr>
+          <w:rFonts w:asciiTheme="majorBidi" w:hAnsiTheme="majorBidi" w:cstheme="majorBidi"/>
+          <w:sz w:val="28"/>
+          <w:szCs w:val="28"/>
+          <w:lang w:bidi="fa-IR"/>
+        </w:rPr>
+        <w:t>unused networks</w:t>
+      </w:r>
+    </w:p>
+    <w:p>
+      <w:pPr>
+        <w:pStyle w:val="ListParagraph"/>
+        <w:numPr>
+          <w:ilvl w:val="1"/>
+          <w:numId w:val="35"/>
+        </w:numPr>
+        <w:ind w:left="720"/>
+        <w:rPr>
+          <w:rFonts w:asciiTheme="majorBidi" w:hAnsiTheme="majorBidi" w:cstheme="majorBidi"/>
+          <w:sz w:val="28"/>
+          <w:szCs w:val="28"/>
+          <w:lang w:bidi="fa-IR"/>
+        </w:rPr>
+      </w:pPr>
+      <w:r>
+        <w:rPr>
+          <w:rFonts w:asciiTheme="majorBidi" w:hAnsiTheme="majorBidi" w:cstheme="majorBidi"/>
+          <w:sz w:val="28"/>
+          <w:szCs w:val="28"/>
+          <w:lang w:bidi="fa-IR"/>
+        </w:rPr>
+        <w:t>dangling images</w:t>
+      </w:r>
+    </w:p>
+    <w:p>
+      <w:pPr>
+        <w:pStyle w:val="ListParagraph"/>
+        <w:numPr>
+          <w:ilvl w:val="1"/>
+          <w:numId w:val="35"/>
+        </w:numPr>
+        <w:ind w:left="720"/>
+        <w:rPr>
+          <w:rFonts w:asciiTheme="majorBidi" w:hAnsiTheme="majorBidi" w:cstheme="majorBidi"/>
+          <w:sz w:val="28"/>
+          <w:szCs w:val="28"/>
+          <w:lang w:bidi="fa-IR"/>
+        </w:rPr>
+      </w:pPr>
+      <w:r>
+        <w:rPr>
+          <w:rFonts w:asciiTheme="majorBidi" w:hAnsiTheme="majorBidi" w:cstheme="majorBidi"/>
+          <w:sz w:val="28"/>
+          <w:szCs w:val="28"/>
+          <w:lang w:bidi="fa-IR"/>
+        </w:rPr>
+        <w:t>build cache</w:t>
+      </w:r>
+    </w:p>
+    <w:p>
+      <w:pPr>
+        <w:ind w:left="360"/>
+        <w:rPr>
+          <w:rFonts w:asciiTheme="majorBidi" w:hAnsiTheme="majorBidi" w:cstheme="majorBidi"/>
+          <w:sz w:val="28"/>
+          <w:szCs w:val="28"/>
+          <w:u w:val="single"/>
+          <w:lang w:bidi="fa-IR"/>
+        </w:rPr>
+      </w:pPr>
+      <w:r>
+        <w:rPr>
+          <w:rFonts w:asciiTheme="majorBidi" w:hAnsiTheme="majorBidi" w:cstheme="majorBidi"/>
+          <w:sz w:val="28"/>
+          <w:szCs w:val="28"/>
+          <w:u w:val="single"/>
+          <w:lang w:bidi="fa-IR"/>
+        </w:rPr>
+        <w:t>Important options for prune:</w:t>
+      </w:r>
+    </w:p>
+    <w:p>
+      <w:pPr>
+        <w:pStyle w:val="ListParagraph"/>
+        <w:numPr>
+          <w:ilvl w:val="1"/>
+          <w:numId w:val="35"/>
+        </w:numPr>
+        <w:ind w:left="720"/>
+        <w:rPr>
+          <w:rFonts w:asciiTheme="majorBidi" w:hAnsiTheme="majorBidi" w:cstheme="majorBidi"/>
+          <w:sz w:val="28"/>
+          <w:szCs w:val="28"/>
+          <w:lang w:bidi="fa-IR"/>
+        </w:rPr>
+      </w:pPr>
+      <w:r>
+        <w:rPr>
+          <w:rFonts w:asciiTheme="majorBidi" w:hAnsiTheme="majorBidi" w:cstheme="majorBidi"/>
+          <w:b/>
+          <w:bCs/>
+          <w:i/>
+          <w:iCs/>
+          <w:sz w:val="28"/>
+          <w:szCs w:val="28"/>
+          <w:lang w:bidi="fa-IR"/>
+        </w:rPr>
+        <w:t>-a</w:t>
+      </w:r>
+      <w:r>
+        <w:rPr>
+          <w:rFonts w:asciiTheme="majorBidi" w:hAnsiTheme="majorBidi" w:cstheme="majorBidi"/>
+          <w:sz w:val="28"/>
+          <w:szCs w:val="28"/>
+          <w:lang w:bidi="fa-IR"/>
+        </w:rPr>
+        <w:t xml:space="preserve"> → Removes all unused images, not just dangling ones. This is more aggressive.</w:t>
+      </w:r>
+    </w:p>
+    <w:p>
+      <w:pPr>
+        <w:pStyle w:val="ListParagraph"/>
+        <w:numPr>
+          <w:ilvl w:val="1"/>
+          <w:numId w:val="35"/>
+        </w:numPr>
+        <w:ind w:left="720"/>
+        <w:rPr>
+          <w:rFonts w:asciiTheme="majorBidi" w:hAnsiTheme="majorBidi" w:cstheme="majorBidi"/>
+          <w:sz w:val="28"/>
+          <w:szCs w:val="28"/>
+          <w:lang w:bidi="fa-IR"/>
+        </w:rPr>
+      </w:pPr>
+      <w:r>
+        <w:rPr>
+          <w:rFonts w:asciiTheme="majorBidi" w:hAnsiTheme="majorBidi" w:cstheme="majorBidi"/>
+          <w:b/>
+          <w:bCs/>
+          <w:i/>
+          <w:iCs/>
+          <w:sz w:val="28"/>
+          <w:szCs w:val="28"/>
+          <w:lang w:bidi="fa-IR"/>
+        </w:rPr>
+        <w:t>--volumes</w:t>
+      </w:r>
+      <w:r>
+        <w:rPr>
+          <w:rFonts w:asciiTheme="majorBidi" w:hAnsiTheme="majorBidi" w:cstheme="majorBidi"/>
+          <w:sz w:val="28"/>
+          <w:szCs w:val="28"/>
+          <w:lang w:bidi="fa-IR"/>
+        </w:rPr>
+        <w:t xml:space="preserve"> → Also removes unused volumes. Without this flag, volumes are kept.</w:t>
+      </w:r>
+    </w:p>
+    <w:p>
+      <w:pPr>
+        <w:pStyle w:val="ListParagraph"/>
+        <w:numPr>
+          <w:ilvl w:val="1"/>
+          <w:numId w:val="35"/>
+        </w:numPr>
+        <w:ind w:left="720"/>
+        <w:rPr>
+          <w:rFonts w:asciiTheme="majorBidi" w:hAnsiTheme="majorBidi" w:cstheme="majorBidi"/>
+          <w:sz w:val="28"/>
+          <w:szCs w:val="28"/>
           <w:rtl/>
           <w:lang w:bidi="fa-IR"/>
         </w:rPr>
@@ -14440,11 +14929,24 @@
       <w:r>
         <w:rPr>
           <w:rFonts w:asciiTheme="majorBidi" w:hAnsiTheme="majorBidi" w:cstheme="majorBidi"/>
-          <w:sz w:val="28"/>
-          <w:szCs w:val="28"/>
-          <w:lang w:bidi="fa-IR"/>
-        </w:rPr>
-        <w:t>In Linux, when a parent dies, file descriptors connected to it may close. That can break communication streams. The shim keeps these streams open and stable.</w:t>
+          <w:b/>
+          <w:bCs/>
+          <w:i/>
+          <w:iCs/>
+          <w:sz w:val="28"/>
+          <w:szCs w:val="28"/>
+          <w:lang w:bidi="fa-IR"/>
+        </w:rPr>
+        <w:t>-f</w:t>
+      </w:r>
+      <w:r>
+        <w:rPr>
+          <w:rFonts w:asciiTheme="majorBidi" w:hAnsiTheme="majorBidi" w:cstheme="majorBidi"/>
+          <w:sz w:val="28"/>
+          <w:szCs w:val="28"/>
+          <w:lang w:bidi="fa-IR"/>
+        </w:rPr>
+        <w:t xml:space="preserve"> → Force, no confirmation prompt.</w:t>
       </w:r>
     </w:p>
     <w:sectPr>
@@ -15138,6 +15640,119 @@
     </w:lvl>
   </w:abstractNum>
   <w:abstractNum w:abstractNumId="6" w15:restartNumberingAfterBreak="0">
+    <w:nsid w:val="14BF15F6"/>
+    <w:multiLevelType w:val="hybridMultilevel"/>
+    <w:tmpl w:val="0EAEA47E"/>
+    <w:lvl w:ilvl="0" w:tplc="04090001">
+      <w:start w:val="1"/>
+      <w:numFmt w:val="bullet"/>
+      <w:lvlText w:val=""/>
+      <w:lvlJc w:val="left"/>
+      <w:pPr>
+        <w:ind w:left="720" w:hanging="360"/>
+      </w:pPr>
+      <w:rPr>
+        <w:rFonts w:ascii="Symbol" w:hAnsi="Symbol" w:hint="default"/>
+      </w:rPr>
+    </w:lvl>
+    <w:lvl w:ilvl="1" w:tplc="04090003">
+      <w:start w:val="1"/>
+      <w:numFmt w:val="bullet"/>
+      <w:lvlText w:val="o"/>
+      <w:lvlJc w:val="left"/>
+      <w:pPr>
+        <w:ind w:left="1440" w:hanging="360"/>
+      </w:pPr>
+      <w:rPr>
+        <w:rFonts w:ascii="Courier New" w:hAnsi="Courier New" w:cs="Courier New" w:hint="default"/>
+      </w:rPr>
+    </w:lvl>
+    <w:lvl w:ilvl="2" w:tplc="04090005" w:tentative="1">
+      <w:start w:val="1"/>
+      <w:numFmt w:val="bullet"/>
+      <w:lvlText w:val=""/>
+      <w:lvlJc w:val="left"/>
+      <w:pPr>
+        <w:ind w:left="2160" w:hanging="360"/>
+      </w:pPr>
+      <w:rPr>
+        <w:rFonts w:ascii="Wingdings" w:hAnsi="Wingdings" w:hint="default"/>
+      </w:rPr>
+    </w:lvl>
+    <w:lvl w:ilvl="3" w:tplc="04090001" w:tentative="1">
+      <w:start w:val="1"/>
+      <w:numFmt w:val="bullet"/>
+      <w:lvlText w:val=""/>
+      <w:lvlJc w:val="left"/>
+      <w:pPr>
+        <w:ind w:left="2880" w:hanging="360"/>
+      </w:pPr>
+      <w:rPr>
+        <w:rFonts w:ascii="Symbol" w:hAnsi="Symbol" w:hint="default"/>
+      </w:rPr>
+    </w:lvl>
+    <w:lvl w:ilvl="4" w:tplc="04090003" w:tentative="1">
+      <w:start w:val="1"/>
+      <w:numFmt w:val="bullet"/>
+      <w:lvlText w:val="o"/>
+      <w:lvlJc w:val="left"/>
+      <w:pPr>
+        <w:ind w:left="3600" w:hanging="360"/>
+      </w:pPr>
+      <w:rPr>
+        <w:rFonts w:ascii="Courier New" w:hAnsi="Courier New" w:cs="Courier New" w:hint="default"/>
+      </w:rPr>
+    </w:lvl>
+    <w:lvl w:ilvl="5" w:tplc="04090005" w:tentative="1">
+      <w:start w:val="1"/>
+      <w:numFmt w:val="bullet"/>
+      <w:lvlText w:val=""/>
+      <w:lvlJc w:val="left"/>
+      <w:pPr>
+        <w:ind w:left="4320" w:hanging="360"/>
+      </w:pPr>
+      <w:rPr>
+        <w:rFonts w:ascii="Wingdings" w:hAnsi="Wingdings" w:hint="default"/>
+      </w:rPr>
+    </w:lvl>
+    <w:lvl w:ilvl="6" w:tplc="04090001" w:tentative="1">
+      <w:start w:val="1"/>
+      <w:numFmt w:val="bullet"/>
+      <w:lvlText w:val=""/>
+      <w:lvlJc w:val="left"/>
+      <w:pPr>
+        <w:ind w:left="5040" w:hanging="360"/>
+      </w:pPr>
+      <w:rPr>
+        <w:rFonts w:ascii="Symbol" w:hAnsi="Symbol" w:hint="default"/>
+      </w:rPr>
+    </w:lvl>
+    <w:lvl w:ilvl="7" w:tplc="04090003" w:tentative="1">
+      <w:start w:val="1"/>
+      <w:numFmt w:val="bullet"/>
+      <w:lvlText w:val="o"/>
+      <w:lvlJc w:val="left"/>
+      <w:pPr>
+        <w:ind w:left="5760" w:hanging="360"/>
+      </w:pPr>
+      <w:rPr>
+        <w:rFonts w:ascii="Courier New" w:hAnsi="Courier New" w:cs="Courier New" w:hint="default"/>
+      </w:rPr>
+    </w:lvl>
+    <w:lvl w:ilvl="8" w:tplc="04090005" w:tentative="1">
+      <w:start w:val="1"/>
+      <w:numFmt w:val="bullet"/>
+      <w:lvlText w:val=""/>
+      <w:lvlJc w:val="left"/>
+      <w:pPr>
+        <w:ind w:left="6480" w:hanging="360"/>
+      </w:pPr>
+      <w:rPr>
+        <w:rFonts w:ascii="Wingdings" w:hAnsi="Wingdings" w:hint="default"/>
+      </w:rPr>
+    </w:lvl>
+  </w:abstractNum>
+  <w:abstractNum w:abstractNumId="7" w15:restartNumberingAfterBreak="0">
     <w:nsid w:val="159C45AA"/>
     <w:multiLevelType w:val="hybridMultilevel"/>
     <w:tmpl w:val="A7F6150C"/>
@@ -15250,7 +15865,7 @@
       </w:rPr>
     </w:lvl>
   </w:abstractNum>
-  <w:abstractNum w:abstractNumId="7" w15:restartNumberingAfterBreak="0">
+  <w:abstractNum w:abstractNumId="8" w15:restartNumberingAfterBreak="0">
     <w:nsid w:val="1D6139FD"/>
     <w:multiLevelType w:val="hybridMultilevel"/>
     <w:tmpl w:val="98800234"/>
@@ -15363,7 +15978,7 @@
       </w:rPr>
     </w:lvl>
   </w:abstractNum>
-  <w:abstractNum w:abstractNumId="8" w15:restartNumberingAfterBreak="0">
+  <w:abstractNum w:abstractNumId="9" w15:restartNumberingAfterBreak="0">
     <w:nsid w:val="1E6A7732"/>
     <w:multiLevelType w:val="hybridMultilevel"/>
     <w:tmpl w:val="FA228F68"/>
@@ -15476,7 +16091,7 @@
       </w:rPr>
     </w:lvl>
   </w:abstractNum>
-  <w:abstractNum w:abstractNumId="9" w15:restartNumberingAfterBreak="0">
+  <w:abstractNum w:abstractNumId="10" w15:restartNumberingAfterBreak="0">
     <w:nsid w:val="22961FF0"/>
     <w:multiLevelType w:val="hybridMultilevel"/>
     <w:tmpl w:val="C7A83280"/>
@@ -15589,7 +16204,7 @@
       </w:rPr>
     </w:lvl>
   </w:abstractNum>
-  <w:abstractNum w:abstractNumId="10" w15:restartNumberingAfterBreak="0">
+  <w:abstractNum w:abstractNumId="11" w15:restartNumberingAfterBreak="0">
     <w:nsid w:val="27A816DA"/>
     <w:multiLevelType w:val="hybridMultilevel"/>
     <w:tmpl w:val="ACFCB710"/>
@@ -15702,7 +16317,7 @@
       </w:rPr>
     </w:lvl>
   </w:abstractNum>
-  <w:abstractNum w:abstractNumId="11" w15:restartNumberingAfterBreak="0">
+  <w:abstractNum w:abstractNumId="12" w15:restartNumberingAfterBreak="0">
     <w:nsid w:val="29AE2D59"/>
     <w:multiLevelType w:val="hybridMultilevel"/>
     <w:tmpl w:val="F30A7CE0"/>
@@ -15815,7 +16430,7 @@
       </w:rPr>
     </w:lvl>
   </w:abstractNum>
-  <w:abstractNum w:abstractNumId="12" w15:restartNumberingAfterBreak="0">
+  <w:abstractNum w:abstractNumId="13" w15:restartNumberingAfterBreak="0">
     <w:nsid w:val="29E903F9"/>
     <w:multiLevelType w:val="hybridMultilevel"/>
     <w:tmpl w:val="4BCAFC12"/>
@@ -15928,7 +16543,7 @@
       </w:rPr>
     </w:lvl>
   </w:abstractNum>
-  <w:abstractNum w:abstractNumId="13" w15:restartNumberingAfterBreak="0">
+  <w:abstractNum w:abstractNumId="14" w15:restartNumberingAfterBreak="0">
     <w:nsid w:val="301545F4"/>
     <w:multiLevelType w:val="hybridMultilevel"/>
     <w:tmpl w:val="30825530"/>
@@ -16041,7 +16656,7 @@
       </w:rPr>
     </w:lvl>
   </w:abstractNum>
-  <w:abstractNum w:abstractNumId="14" w15:restartNumberingAfterBreak="0">
+  <w:abstractNum w:abstractNumId="15" w15:restartNumberingAfterBreak="0">
     <w:nsid w:val="34850045"/>
     <w:multiLevelType w:val="hybridMultilevel"/>
     <w:tmpl w:val="24228F42"/>
@@ -16154,7 +16769,7 @@
       </w:rPr>
     </w:lvl>
   </w:abstractNum>
-  <w:abstractNum w:abstractNumId="15" w15:restartNumberingAfterBreak="0">
+  <w:abstractNum w:abstractNumId="16" w15:restartNumberingAfterBreak="0">
     <w:nsid w:val="354E3CE4"/>
     <w:multiLevelType w:val="hybridMultilevel"/>
     <w:tmpl w:val="6798CA5A"/>
@@ -16267,7 +16882,7 @@
       </w:rPr>
     </w:lvl>
   </w:abstractNum>
-  <w:abstractNum w:abstractNumId="16" w15:restartNumberingAfterBreak="0">
+  <w:abstractNum w:abstractNumId="17" w15:restartNumberingAfterBreak="0">
     <w:nsid w:val="356A5274"/>
     <w:multiLevelType w:val="hybridMultilevel"/>
     <w:tmpl w:val="0B447D8A"/>
@@ -16380,7 +16995,7 @@
       </w:rPr>
     </w:lvl>
   </w:abstractNum>
-  <w:abstractNum w:abstractNumId="17" w15:restartNumberingAfterBreak="0">
+  <w:abstractNum w:abstractNumId="18" w15:restartNumberingAfterBreak="0">
     <w:nsid w:val="35CD3632"/>
     <w:multiLevelType w:val="hybridMultilevel"/>
     <w:tmpl w:val="B3F0A506"/>
@@ -16493,7 +17108,7 @@
       </w:rPr>
     </w:lvl>
   </w:abstractNum>
-  <w:abstractNum w:abstractNumId="18" w15:restartNumberingAfterBreak="0">
+  <w:abstractNum w:abstractNumId="19" w15:restartNumberingAfterBreak="0">
     <w:nsid w:val="473461ED"/>
     <w:multiLevelType w:val="hybridMultilevel"/>
     <w:tmpl w:val="073CF6F4"/>
@@ -16606,7 +17221,7 @@
       </w:rPr>
     </w:lvl>
   </w:abstractNum>
-  <w:abstractNum w:abstractNumId="19" w15:restartNumberingAfterBreak="0">
+  <w:abstractNum w:abstractNumId="20" w15:restartNumberingAfterBreak="0">
     <w:nsid w:val="48CE4188"/>
     <w:multiLevelType w:val="hybridMultilevel"/>
     <w:tmpl w:val="A2F8A7D2"/>
@@ -16719,7 +17334,120 @@
       </w:rPr>
     </w:lvl>
   </w:abstractNum>
-  <w:abstractNum w:abstractNumId="20" w15:restartNumberingAfterBreak="0">
+  <w:abstractNum w:abstractNumId="21" w15:restartNumberingAfterBreak="0">
+    <w:nsid w:val="4FCB5865"/>
+    <w:multiLevelType w:val="hybridMultilevel"/>
+    <w:tmpl w:val="E3DE694E"/>
+    <w:lvl w:ilvl="0" w:tplc="04090001">
+      <w:start w:val="1"/>
+      <w:numFmt w:val="bullet"/>
+      <w:lvlText w:val=""/>
+      <w:lvlJc w:val="left"/>
+      <w:pPr>
+        <w:ind w:left="720" w:hanging="360"/>
+      </w:pPr>
+      <w:rPr>
+        <w:rFonts w:ascii="Symbol" w:hAnsi="Symbol" w:hint="default"/>
+      </w:rPr>
+    </w:lvl>
+    <w:lvl w:ilvl="1" w:tplc="04090003" w:tentative="1">
+      <w:start w:val="1"/>
+      <w:numFmt w:val="bullet"/>
+      <w:lvlText w:val="o"/>
+      <w:lvlJc w:val="left"/>
+      <w:pPr>
+        <w:ind w:left="1440" w:hanging="360"/>
+      </w:pPr>
+      <w:rPr>
+        <w:rFonts w:ascii="Courier New" w:hAnsi="Courier New" w:cs="Courier New" w:hint="default"/>
+      </w:rPr>
+    </w:lvl>
+    <w:lvl w:ilvl="2" w:tplc="04090005" w:tentative="1">
+      <w:start w:val="1"/>
+      <w:numFmt w:val="bullet"/>
+      <w:lvlText w:val=""/>
+      <w:lvlJc w:val="left"/>
+      <w:pPr>
+        <w:ind w:left="2160" w:hanging="360"/>
+      </w:pPr>
+      <w:rPr>
+        <w:rFonts w:ascii="Wingdings" w:hAnsi="Wingdings" w:hint="default"/>
+      </w:rPr>
+    </w:lvl>
+    <w:lvl w:ilvl="3" w:tplc="04090001" w:tentative="1">
+      <w:start w:val="1"/>
+      <w:numFmt w:val="bullet"/>
+      <w:lvlText w:val=""/>
+      <w:lvlJc w:val="left"/>
+      <w:pPr>
+        <w:ind w:left="2880" w:hanging="360"/>
+      </w:pPr>
+      <w:rPr>
+        <w:rFonts w:ascii="Symbol" w:hAnsi="Symbol" w:hint="default"/>
+      </w:rPr>
+    </w:lvl>
+    <w:lvl w:ilvl="4" w:tplc="04090003" w:tentative="1">
+      <w:start w:val="1"/>
+      <w:numFmt w:val="bullet"/>
+      <w:lvlText w:val="o"/>
+      <w:lvlJc w:val="left"/>
+      <w:pPr>
+        <w:ind w:left="3600" w:hanging="360"/>
+      </w:pPr>
+      <w:rPr>
+        <w:rFonts w:ascii="Courier New" w:hAnsi="Courier New" w:cs="Courier New" w:hint="default"/>
+      </w:rPr>
+    </w:lvl>
+    <w:lvl w:ilvl="5" w:tplc="04090005" w:tentative="1">
+      <w:start w:val="1"/>
+      <w:numFmt w:val="bullet"/>
+      <w:lvlText w:val=""/>
+      <w:lvlJc w:val="left"/>
+      <w:pPr>
+        <w:ind w:left="4320" w:hanging="360"/>
+      </w:pPr>
+      <w:rPr>
+        <w:rFonts w:ascii="Wingdings" w:hAnsi="Wingdings" w:hint="default"/>
+      </w:rPr>
+    </w:lvl>
+    <w:lvl w:ilvl="6" w:tplc="04090001" w:tentative="1">
+      <w:start w:val="1"/>
+      <w:numFmt w:val="bullet"/>
+      <w:lvlText w:val=""/>
+      <w:lvlJc w:val="left"/>
+      <w:pPr>
+        <w:ind w:left="5040" w:hanging="360"/>
+      </w:pPr>
+      <w:rPr>
+        <w:rFonts w:ascii="Symbol" w:hAnsi="Symbol" w:hint="default"/>
+      </w:rPr>
+    </w:lvl>
+    <w:lvl w:ilvl="7" w:tplc="04090003" w:tentative="1">
+      <w:start w:val="1"/>
+      <w:numFmt w:val="bullet"/>
+      <w:lvlText w:val="o"/>
+      <w:lvlJc w:val="left"/>
+      <w:pPr>
+        <w:ind w:left="5760" w:hanging="360"/>
+      </w:pPr>
+      <w:rPr>
+        <w:rFonts w:ascii="Courier New" w:hAnsi="Courier New" w:cs="Courier New" w:hint="default"/>
+      </w:rPr>
+    </w:lvl>
+    <w:lvl w:ilvl="8" w:tplc="04090005" w:tentative="1">
+      <w:start w:val="1"/>
+      <w:numFmt w:val="bullet"/>
+      <w:lvlText w:val=""/>
+      <w:lvlJc w:val="left"/>
+      <w:pPr>
+        <w:ind w:left="6480" w:hanging="360"/>
+      </w:pPr>
+      <w:rPr>
+        <w:rFonts w:ascii="Wingdings" w:hAnsi="Wingdings" w:hint="default"/>
+      </w:rPr>
+    </w:lvl>
+  </w:abstractNum>
+  <w:abstractNum w:abstractNumId="22" w15:restartNumberingAfterBreak="0">
     <w:nsid w:val="51F90A70"/>
     <w:multiLevelType w:val="hybridMultilevel"/>
     <w:tmpl w:val="2EFA942E"/>
@@ -16832,7 +17560,7 @@
       </w:rPr>
     </w:lvl>
   </w:abstractNum>
-  <w:abstractNum w:abstractNumId="21" w15:restartNumberingAfterBreak="0">
+  <w:abstractNum w:abstractNumId="23" w15:restartNumberingAfterBreak="0">
     <w:nsid w:val="557A6C2A"/>
     <w:multiLevelType w:val="hybridMultilevel"/>
     <w:tmpl w:val="9774AF78"/>
@@ -16918,7 +17646,7 @@
       </w:pPr>
     </w:lvl>
   </w:abstractNum>
-  <w:abstractNum w:abstractNumId="22" w15:restartNumberingAfterBreak="0">
+  <w:abstractNum w:abstractNumId="24" w15:restartNumberingAfterBreak="0">
     <w:nsid w:val="57786EF4"/>
     <w:multiLevelType w:val="hybridMultilevel"/>
     <w:tmpl w:val="ACBAD488"/>
@@ -17031,7 +17759,7 @@
       </w:rPr>
     </w:lvl>
   </w:abstractNum>
-  <w:abstractNum w:abstractNumId="23" w15:restartNumberingAfterBreak="0">
+  <w:abstractNum w:abstractNumId="25" w15:restartNumberingAfterBreak="0">
     <w:nsid w:val="604453DB"/>
     <w:multiLevelType w:val="hybridMultilevel"/>
     <w:tmpl w:val="8B0CAB98"/>
@@ -17144,7 +17872,7 @@
       </w:rPr>
     </w:lvl>
   </w:abstractNum>
-  <w:abstractNum w:abstractNumId="24" w15:restartNumberingAfterBreak="0">
+  <w:abstractNum w:abstractNumId="26" w15:restartNumberingAfterBreak="0">
     <w:nsid w:val="615E18EE"/>
     <w:multiLevelType w:val="hybridMultilevel"/>
     <w:tmpl w:val="30DCC388"/>
@@ -17257,7 +17985,7 @@
       </w:rPr>
     </w:lvl>
   </w:abstractNum>
-  <w:abstractNum w:abstractNumId="25" w15:restartNumberingAfterBreak="0">
+  <w:abstractNum w:abstractNumId="27" w15:restartNumberingAfterBreak="0">
     <w:nsid w:val="62B625C1"/>
     <w:multiLevelType w:val="hybridMultilevel"/>
     <w:tmpl w:val="4716A242"/>
@@ -17370,7 +18098,7 @@
       </w:rPr>
     </w:lvl>
   </w:abstractNum>
-  <w:abstractNum w:abstractNumId="26" w15:restartNumberingAfterBreak="0">
+  <w:abstractNum w:abstractNumId="28" w15:restartNumberingAfterBreak="0">
     <w:nsid w:val="6A57614C"/>
     <w:multiLevelType w:val="hybridMultilevel"/>
     <w:tmpl w:val="F0E05FF0"/>
@@ -17483,7 +18211,7 @@
       </w:rPr>
     </w:lvl>
   </w:abstractNum>
-  <w:abstractNum w:abstractNumId="27" w15:restartNumberingAfterBreak="0">
+  <w:abstractNum w:abstractNumId="29" w15:restartNumberingAfterBreak="0">
     <w:nsid w:val="6A7A2A86"/>
     <w:multiLevelType w:val="hybridMultilevel"/>
     <w:tmpl w:val="43A20626"/>
@@ -17596,7 +18324,7 @@
       </w:rPr>
     </w:lvl>
   </w:abstractNum>
-  <w:abstractNum w:abstractNumId="28" w15:restartNumberingAfterBreak="0">
+  <w:abstractNum w:abstractNumId="30" w15:restartNumberingAfterBreak="0">
     <w:nsid w:val="6C804B90"/>
     <w:multiLevelType w:val="hybridMultilevel"/>
     <w:tmpl w:val="C45CAB64"/>
@@ -17709,7 +18437,7 @@
       </w:rPr>
     </w:lvl>
   </w:abstractNum>
-  <w:abstractNum w:abstractNumId="29" w15:restartNumberingAfterBreak="0">
+  <w:abstractNum w:abstractNumId="31" w15:restartNumberingAfterBreak="0">
     <w:nsid w:val="6EF04610"/>
     <w:multiLevelType w:val="hybridMultilevel"/>
     <w:tmpl w:val="A8A8CDEC"/>
@@ -17822,7 +18550,7 @@
       </w:rPr>
     </w:lvl>
   </w:abstractNum>
-  <w:abstractNum w:abstractNumId="30" w15:restartNumberingAfterBreak="0">
+  <w:abstractNum w:abstractNumId="32" w15:restartNumberingAfterBreak="0">
     <w:nsid w:val="70460B59"/>
     <w:multiLevelType w:val="hybridMultilevel"/>
     <w:tmpl w:val="070CCA04"/>
@@ -17935,7 +18663,7 @@
       </w:rPr>
     </w:lvl>
   </w:abstractNum>
-  <w:abstractNum w:abstractNumId="31" w15:restartNumberingAfterBreak="0">
+  <w:abstractNum w:abstractNumId="33" w15:restartNumberingAfterBreak="0">
     <w:nsid w:val="76B26AAB"/>
     <w:multiLevelType w:val="hybridMultilevel"/>
     <w:tmpl w:val="04EE7918"/>
@@ -18048,7 +18776,7 @@
       </w:rPr>
     </w:lvl>
   </w:abstractNum>
-  <w:abstractNum w:abstractNumId="32" w15:restartNumberingAfterBreak="0">
+  <w:abstractNum w:abstractNumId="34" w15:restartNumberingAfterBreak="0">
     <w:nsid w:val="7BF36F25"/>
     <w:multiLevelType w:val="hybridMultilevel"/>
     <w:tmpl w:val="272AF9C2"/>
@@ -18165,100 +18893,106 @@
     <w:abstractNumId w:val="5"/>
   </w:num>
   <w:num w:numId="2" w16cid:durableId="615214838">
-    <w:abstractNumId w:val="16"/>
+    <w:abstractNumId w:val="17"/>
   </w:num>
   <w:num w:numId="3" w16cid:durableId="1660958139">
     <w:abstractNumId w:val="4"/>
   </w:num>
   <w:num w:numId="4" w16cid:durableId="775902420">
+    <w:abstractNumId w:val="10"/>
+  </w:num>
+  <w:num w:numId="5" w16cid:durableId="1241132537">
+    <w:abstractNumId w:val="24"/>
+  </w:num>
+  <w:num w:numId="6" w16cid:durableId="752317510">
+    <w:abstractNumId w:val="27"/>
+  </w:num>
+  <w:num w:numId="7" w16cid:durableId="951588871">
+    <w:abstractNumId w:val="29"/>
+  </w:num>
+  <w:num w:numId="8" w16cid:durableId="1200975953">
     <w:abstractNumId w:val="9"/>
   </w:num>
-  <w:num w:numId="5" w16cid:durableId="1241132537">
-    <w:abstractNumId w:val="22"/>
+  <w:num w:numId="9" w16cid:durableId="806553799">
+    <w:abstractNumId w:val="26"/>
   </w:num>
-  <w:num w:numId="6" w16cid:durableId="752317510">
+  <w:num w:numId="10" w16cid:durableId="931936962">
+    <w:abstractNumId w:val="23"/>
+  </w:num>
+  <w:num w:numId="11" w16cid:durableId="455150107">
+    <w:abstractNumId w:val="31"/>
+  </w:num>
+  <w:num w:numId="12" w16cid:durableId="1714619942">
+    <w:abstractNumId w:val="14"/>
+  </w:num>
+  <w:num w:numId="13" w16cid:durableId="1370033234">
     <w:abstractNumId w:val="25"/>
   </w:num>
-  <w:num w:numId="7" w16cid:durableId="951588871">
-    <w:abstractNumId w:val="27"/>
-  </w:num>
-  <w:num w:numId="8" w16cid:durableId="1200975953">
-    <w:abstractNumId w:val="8"/>
-  </w:num>
-  <w:num w:numId="9" w16cid:durableId="806553799">
-    <w:abstractNumId w:val="24"/>
-  </w:num>
-  <w:num w:numId="10" w16cid:durableId="931936962">
-    <w:abstractNumId w:val="21"/>
-  </w:num>
-  <w:num w:numId="11" w16cid:durableId="455150107">
-    <w:abstractNumId w:val="29"/>
-  </w:num>
-  <w:num w:numId="12" w16cid:durableId="1714619942">
+  <w:num w:numId="14" w16cid:durableId="525488901">
     <w:abstractNumId w:val="13"/>
-  </w:num>
-  <w:num w:numId="13" w16cid:durableId="1370033234">
-    <w:abstractNumId w:val="23"/>
-  </w:num>
-  <w:num w:numId="14" w16cid:durableId="525488901">
-    <w:abstractNumId w:val="12"/>
   </w:num>
   <w:num w:numId="15" w16cid:durableId="249974336">
     <w:abstractNumId w:val="1"/>
   </w:num>
   <w:num w:numId="16" w16cid:durableId="312149096">
-    <w:abstractNumId w:val="11"/>
+    <w:abstractNumId w:val="12"/>
   </w:num>
   <w:num w:numId="17" w16cid:durableId="1515075912">
-    <w:abstractNumId w:val="14"/>
+    <w:abstractNumId w:val="15"/>
   </w:num>
   <w:num w:numId="18" w16cid:durableId="583883089">
-    <w:abstractNumId w:val="18"/>
+    <w:abstractNumId w:val="19"/>
   </w:num>
   <w:num w:numId="19" w16cid:durableId="1822455147">
-    <w:abstractNumId w:val="20"/>
+    <w:abstractNumId w:val="22"/>
   </w:num>
   <w:num w:numId="20" w16cid:durableId="1983388459">
     <w:abstractNumId w:val="0"/>
   </w:num>
   <w:num w:numId="21" w16cid:durableId="2065907935">
-    <w:abstractNumId w:val="30"/>
+    <w:abstractNumId w:val="32"/>
   </w:num>
   <w:num w:numId="22" w16cid:durableId="894782939">
     <w:abstractNumId w:val="3"/>
   </w:num>
   <w:num w:numId="23" w16cid:durableId="107702253">
-    <w:abstractNumId w:val="15"/>
+    <w:abstractNumId w:val="16"/>
   </w:num>
   <w:num w:numId="24" w16cid:durableId="637029187">
-    <w:abstractNumId w:val="32"/>
+    <w:abstractNumId w:val="34"/>
   </w:num>
   <w:num w:numId="25" w16cid:durableId="536234325">
-    <w:abstractNumId w:val="6"/>
+    <w:abstractNumId w:val="7"/>
   </w:num>
   <w:num w:numId="26" w16cid:durableId="861816740">
-    <w:abstractNumId w:val="10"/>
+    <w:abstractNumId w:val="11"/>
   </w:num>
   <w:num w:numId="27" w16cid:durableId="1024672194">
-    <w:abstractNumId w:val="31"/>
+    <w:abstractNumId w:val="33"/>
   </w:num>
   <w:num w:numId="28" w16cid:durableId="507060498">
-    <w:abstractNumId w:val="26"/>
+    <w:abstractNumId w:val="28"/>
   </w:num>
   <w:num w:numId="29" w16cid:durableId="1787849106">
-    <w:abstractNumId w:val="7"/>
+    <w:abstractNumId w:val="8"/>
   </w:num>
   <w:num w:numId="30" w16cid:durableId="380516858">
-    <w:abstractNumId w:val="28"/>
+    <w:abstractNumId w:val="30"/>
   </w:num>
   <w:num w:numId="31" w16cid:durableId="1725251925">
     <w:abstractNumId w:val="2"/>
   </w:num>
   <w:num w:numId="32" w16cid:durableId="1663004310">
-    <w:abstractNumId w:val="17"/>
+    <w:abstractNumId w:val="18"/>
   </w:num>
   <w:num w:numId="33" w16cid:durableId="1759403709">
-    <w:abstractNumId w:val="19"/>
+    <w:abstractNumId w:val="20"/>
+  </w:num>
+  <w:num w:numId="34" w16cid:durableId="1201671550">
+    <w:abstractNumId w:val="21"/>
+  </w:num>
+  <w:num w:numId="35" w16cid:durableId="1320617864">
+    <w:abstractNumId w:val="6"/>
   </w:num>
 </w:numbering>
 </file>

</xml_diff>

<commit_message>
docker - architecture file updated
</commit_message>
<xml_diff>
--- a/Docker/2-architecture.docx
+++ b/Docker/2-architecture.docx
@@ -14467,8 +14467,8 @@
           <w:rFonts w:asciiTheme="majorBidi" w:hAnsiTheme="majorBidi" w:cstheme="majorBidi"/>
           <w:b/>
           <w:bCs/>
-          <w:sz w:val="36"/>
-          <w:szCs w:val="36"/>
+          <w:sz w:val="32"/>
+          <w:szCs w:val="32"/>
           <w:lang w:bidi="fa-IR"/>
         </w:rPr>
       </w:pPr>
@@ -14483,6 +14483,820 @@
           <w:szCs w:val="32"/>
           <w:lang w:bidi="fa-IR"/>
         </w:rPr>
+        <w:t>docker inspect</w:t>
+      </w:r>
+      <w:r>
+        <w:rPr>
+          <w:rFonts w:asciiTheme="majorBidi" w:hAnsiTheme="majorBidi" w:cstheme="majorBidi"/>
+          <w:b/>
+          <w:bCs/>
+          <w:sz w:val="32"/>
+          <w:szCs w:val="32"/>
+          <w:lang w:bidi="fa-IR"/>
+        </w:rPr>
+        <w:t xml:space="preserve"> command</w:t>
+      </w:r>
+    </w:p>
+    <w:p>
+      <w:pPr>
+        <w:jc w:val="both"/>
+        <w:rPr>
+          <w:rFonts w:asciiTheme="majorBidi" w:hAnsiTheme="majorBidi" w:cstheme="majorBidi"/>
+          <w:sz w:val="28"/>
+          <w:szCs w:val="28"/>
+          <w:lang w:bidi="fa-IR"/>
+        </w:rPr>
+      </w:pPr>
+      <w:r>
+        <w:rPr>
+          <w:rFonts w:asciiTheme="majorBidi" w:hAnsiTheme="majorBidi" w:cstheme="majorBidi"/>
+          <w:sz w:val="28"/>
+          <w:szCs w:val="28"/>
+          <w:lang w:bidi="fa-IR"/>
+        </w:rPr>
+        <w:t>It prints the full JSON metadata of almost any Docker object: container, image, volume, network, even a plugin. Not logs. Not summary. The raw, structured truth.</w:t>
+      </w:r>
+    </w:p>
+    <w:p>
+      <w:pPr>
+        <w:jc w:val="both"/>
+        <w:rPr>
+          <w:rFonts w:asciiTheme="majorBidi" w:hAnsiTheme="majorBidi" w:cstheme="majorBidi"/>
+          <w:sz w:val="28"/>
+          <w:szCs w:val="28"/>
+          <w:lang w:bidi="fa-IR"/>
+        </w:rPr>
+      </w:pPr>
+      <w:r>
+        <w:rPr>
+          <w:rFonts w:asciiTheme="majorBidi" w:hAnsiTheme="majorBidi" w:cstheme="majorBidi"/>
+          <w:sz w:val="28"/>
+          <w:szCs w:val="28"/>
+          <w:lang w:bidi="fa-IR"/>
+        </w:rPr>
+        <w:t>When you run</w:t>
+      </w:r>
+      <w:r>
+        <w:rPr>
+          <w:rFonts w:asciiTheme="majorBidi" w:hAnsiTheme="majorBidi" w:cstheme="majorBidi"/>
+          <w:sz w:val="28"/>
+          <w:szCs w:val="28"/>
+          <w:lang w:bidi="fa-IR"/>
+        </w:rPr>
+        <w:t xml:space="preserve"> </w:t>
+      </w:r>
+      <w:r>
+        <w:rPr>
+          <w:rFonts w:asciiTheme="majorBidi" w:hAnsiTheme="majorBidi" w:cstheme="majorBidi"/>
+          <w:b/>
+          <w:bCs/>
+          <w:i/>
+          <w:iCs/>
+          <w:sz w:val="28"/>
+          <w:szCs w:val="28"/>
+          <w:lang w:bidi="fa-IR"/>
+        </w:rPr>
+        <w:t>docker inspect my-container</w:t>
+      </w:r>
+      <w:r>
+        <w:rPr>
+          <w:rFonts w:asciiTheme="majorBidi" w:hAnsiTheme="majorBidi" w:cstheme="majorBidi"/>
+          <w:sz w:val="28"/>
+          <w:szCs w:val="28"/>
+          <w:lang w:bidi="fa-IR"/>
+        </w:rPr>
+        <w:t xml:space="preserve"> </w:t>
+      </w:r>
+      <w:r>
+        <w:rPr>
+          <w:rFonts w:asciiTheme="majorBidi" w:hAnsiTheme="majorBidi" w:cstheme="majorBidi"/>
+          <w:sz w:val="28"/>
+          <w:szCs w:val="28"/>
+          <w:lang w:bidi="fa-IR"/>
+        </w:rPr>
+        <w:t>→</w:t>
+      </w:r>
+      <w:r>
+        <w:rPr>
+          <w:rFonts w:asciiTheme="majorBidi" w:hAnsiTheme="majorBidi" w:cstheme="majorBidi"/>
+          <w:sz w:val="28"/>
+          <w:szCs w:val="28"/>
+          <w:lang w:bidi="fa-IR"/>
+        </w:rPr>
+        <w:t xml:space="preserve"> </w:t>
+      </w:r>
+      <w:r>
+        <w:rPr>
+          <w:rFonts w:asciiTheme="majorBidi" w:hAnsiTheme="majorBidi" w:cstheme="majorBidi"/>
+          <w:sz w:val="28"/>
+          <w:szCs w:val="28"/>
+          <w:lang w:bidi="fa-IR"/>
+        </w:rPr>
+        <w:t>Docker returns a big JSON document describing:</w:t>
+      </w:r>
+    </w:p>
+    <w:p>
+      <w:pPr>
+        <w:pStyle w:val="ListParagraph"/>
+        <w:numPr>
+          <w:ilvl w:val="0"/>
+          <w:numId w:val="36"/>
+        </w:numPr>
+        <w:ind w:left="360"/>
+        <w:jc w:val="both"/>
+        <w:rPr>
+          <w:rFonts w:asciiTheme="majorBidi" w:hAnsiTheme="majorBidi" w:cstheme="majorBidi"/>
+          <w:sz w:val="28"/>
+          <w:szCs w:val="28"/>
+          <w:lang w:bidi="fa-IR"/>
+        </w:rPr>
+      </w:pPr>
+      <w:r>
+        <w:rPr>
+          <w:rFonts w:asciiTheme="majorBidi" w:hAnsiTheme="majorBidi" w:cstheme="majorBidi"/>
+          <w:sz w:val="28"/>
+          <w:szCs w:val="28"/>
+          <w:lang w:bidi="fa-IR"/>
+        </w:rPr>
+        <w:t xml:space="preserve">Container config (environment variables, </w:t>
+      </w:r>
+      <w:proofErr w:type="spellStart"/>
+      <w:r>
+        <w:rPr>
+          <w:rFonts w:asciiTheme="majorBidi" w:hAnsiTheme="majorBidi" w:cstheme="majorBidi"/>
+          <w:sz w:val="28"/>
+          <w:szCs w:val="28"/>
+          <w:lang w:bidi="fa-IR"/>
+        </w:rPr>
+        <w:t>entrypoint</w:t>
+      </w:r>
+      <w:proofErr w:type="spellEnd"/>
+      <w:r>
+        <w:rPr>
+          <w:rFonts w:asciiTheme="majorBidi" w:hAnsiTheme="majorBidi" w:cstheme="majorBidi"/>
+          <w:sz w:val="28"/>
+          <w:szCs w:val="28"/>
+          <w:lang w:bidi="fa-IR"/>
+        </w:rPr>
+        <w:t xml:space="preserve">, </w:t>
+      </w:r>
+      <w:proofErr w:type="spellStart"/>
+      <w:r>
+        <w:rPr>
+          <w:rFonts w:asciiTheme="majorBidi" w:hAnsiTheme="majorBidi" w:cstheme="majorBidi"/>
+          <w:sz w:val="28"/>
+          <w:szCs w:val="28"/>
+          <w:lang w:bidi="fa-IR"/>
+        </w:rPr>
+        <w:t>cmd</w:t>
+      </w:r>
+      <w:proofErr w:type="spellEnd"/>
+      <w:r>
+        <w:rPr>
+          <w:rFonts w:asciiTheme="majorBidi" w:hAnsiTheme="majorBidi" w:cstheme="majorBidi"/>
+          <w:sz w:val="28"/>
+          <w:szCs w:val="28"/>
+          <w:lang w:bidi="fa-IR"/>
+        </w:rPr>
+        <w:t>)</w:t>
+      </w:r>
+    </w:p>
+    <w:p>
+      <w:pPr>
+        <w:pStyle w:val="ListParagraph"/>
+        <w:numPr>
+          <w:ilvl w:val="0"/>
+          <w:numId w:val="36"/>
+        </w:numPr>
+        <w:ind w:left="360"/>
+        <w:jc w:val="both"/>
+        <w:rPr>
+          <w:rFonts w:asciiTheme="majorBidi" w:hAnsiTheme="majorBidi" w:cstheme="majorBidi"/>
+          <w:sz w:val="28"/>
+          <w:szCs w:val="28"/>
+          <w:lang w:bidi="fa-IR"/>
+        </w:rPr>
+      </w:pPr>
+      <w:r>
+        <w:rPr>
+          <w:rFonts w:asciiTheme="majorBidi" w:hAnsiTheme="majorBidi" w:cstheme="majorBidi"/>
+          <w:sz w:val="28"/>
+          <w:szCs w:val="28"/>
+          <w:lang w:bidi="fa-IR"/>
+        </w:rPr>
+        <w:t>Runtime state (PID, IP address, status, restart count)</w:t>
+      </w:r>
+    </w:p>
+    <w:p>
+      <w:pPr>
+        <w:pStyle w:val="ListParagraph"/>
+        <w:numPr>
+          <w:ilvl w:val="0"/>
+          <w:numId w:val="36"/>
+        </w:numPr>
+        <w:ind w:left="360"/>
+        <w:jc w:val="both"/>
+        <w:rPr>
+          <w:rFonts w:asciiTheme="majorBidi" w:hAnsiTheme="majorBidi" w:cstheme="majorBidi"/>
+          <w:sz w:val="28"/>
+          <w:szCs w:val="28"/>
+          <w:lang w:bidi="fa-IR"/>
+        </w:rPr>
+      </w:pPr>
+      <w:r>
+        <w:rPr>
+          <w:rFonts w:asciiTheme="majorBidi" w:hAnsiTheme="majorBidi" w:cstheme="majorBidi"/>
+          <w:sz w:val="28"/>
+          <w:szCs w:val="28"/>
+          <w:lang w:bidi="fa-IR"/>
+        </w:rPr>
+        <w:t>Mounted volumes</w:t>
+      </w:r>
+    </w:p>
+    <w:p>
+      <w:pPr>
+        <w:pStyle w:val="ListParagraph"/>
+        <w:numPr>
+          <w:ilvl w:val="0"/>
+          <w:numId w:val="36"/>
+        </w:numPr>
+        <w:ind w:left="360"/>
+        <w:jc w:val="both"/>
+        <w:rPr>
+          <w:rFonts w:asciiTheme="majorBidi" w:hAnsiTheme="majorBidi" w:cstheme="majorBidi"/>
+          <w:sz w:val="28"/>
+          <w:szCs w:val="28"/>
+          <w:lang w:bidi="fa-IR"/>
+        </w:rPr>
+      </w:pPr>
+      <w:r>
+        <w:rPr>
+          <w:rFonts w:asciiTheme="majorBidi" w:hAnsiTheme="majorBidi" w:cstheme="majorBidi"/>
+          <w:sz w:val="28"/>
+          <w:szCs w:val="28"/>
+          <w:lang w:bidi="fa-IR"/>
+        </w:rPr>
+        <w:t>Network settings</w:t>
+      </w:r>
+    </w:p>
+    <w:p>
+      <w:pPr>
+        <w:pStyle w:val="ListParagraph"/>
+        <w:numPr>
+          <w:ilvl w:val="0"/>
+          <w:numId w:val="36"/>
+        </w:numPr>
+        <w:ind w:left="360"/>
+        <w:jc w:val="both"/>
+        <w:rPr>
+          <w:rFonts w:asciiTheme="majorBidi" w:hAnsiTheme="majorBidi" w:cstheme="majorBidi"/>
+          <w:sz w:val="28"/>
+          <w:szCs w:val="28"/>
+          <w:lang w:bidi="fa-IR"/>
+        </w:rPr>
+      </w:pPr>
+      <w:r>
+        <w:rPr>
+          <w:rFonts w:asciiTheme="majorBidi" w:hAnsiTheme="majorBidi" w:cstheme="majorBidi"/>
+          <w:sz w:val="28"/>
+          <w:szCs w:val="28"/>
+          <w:lang w:bidi="fa-IR"/>
+        </w:rPr>
+        <w:t>Resource limits</w:t>
+      </w:r>
+    </w:p>
+    <w:p>
+      <w:pPr>
+        <w:pStyle w:val="ListParagraph"/>
+        <w:numPr>
+          <w:ilvl w:val="0"/>
+          <w:numId w:val="36"/>
+        </w:numPr>
+        <w:ind w:left="360"/>
+        <w:jc w:val="both"/>
+        <w:rPr>
+          <w:rFonts w:asciiTheme="majorBidi" w:hAnsiTheme="majorBidi" w:cstheme="majorBidi"/>
+          <w:sz w:val="28"/>
+          <w:szCs w:val="28"/>
+          <w:lang w:bidi="fa-IR"/>
+        </w:rPr>
+      </w:pPr>
+      <w:r>
+        <w:rPr>
+          <w:rFonts w:asciiTheme="majorBidi" w:hAnsiTheme="majorBidi" w:cstheme="majorBidi"/>
+          <w:sz w:val="28"/>
+          <w:szCs w:val="28"/>
+          <w:lang w:bidi="fa-IR"/>
+        </w:rPr>
+        <w:t>Image it was created from</w:t>
+      </w:r>
+    </w:p>
+    <w:p>
+      <w:pPr>
+        <w:jc w:val="both"/>
+        <w:rPr>
+          <w:rFonts w:asciiTheme="majorBidi" w:hAnsiTheme="majorBidi" w:cstheme="majorBidi"/>
+          <w:sz w:val="28"/>
+          <w:szCs w:val="28"/>
+          <w:lang w:bidi="fa-IR"/>
+        </w:rPr>
+      </w:pPr>
+      <w:r>
+        <w:rPr>
+          <w:rFonts w:asciiTheme="majorBidi" w:hAnsiTheme="majorBidi" w:cstheme="majorBidi"/>
+          <w:sz w:val="28"/>
+          <w:szCs w:val="28"/>
+          <w:lang w:bidi="fa-IR"/>
+        </w:rPr>
+        <w:t>It’s basically asking Docker: “Tell me everything you know about this thing.”</w:t>
+      </w:r>
+    </w:p>
+    <w:p>
+      <w:pPr>
+        <w:pStyle w:val="ListParagraph"/>
+        <w:numPr>
+          <w:ilvl w:val="0"/>
+          <w:numId w:val="37"/>
+        </w:numPr>
+        <w:ind w:left="360"/>
+        <w:jc w:val="both"/>
+        <w:rPr>
+          <w:rFonts w:asciiTheme="majorBidi" w:hAnsiTheme="majorBidi" w:cstheme="majorBidi"/>
+          <w:sz w:val="28"/>
+          <w:szCs w:val="28"/>
+          <w:lang w:bidi="fa-IR"/>
+        </w:rPr>
+      </w:pPr>
+      <w:r>
+        <w:rPr>
+          <w:rFonts w:asciiTheme="majorBidi" w:hAnsiTheme="majorBidi" w:cstheme="majorBidi"/>
+          <w:sz w:val="28"/>
+          <w:szCs w:val="28"/>
+          <w:lang w:bidi="fa-IR"/>
+        </w:rPr>
+        <w:t>For images</w:t>
+      </w:r>
+      <w:r>
+        <w:rPr>
+          <w:rFonts w:asciiTheme="majorBidi" w:hAnsiTheme="majorBidi" w:cstheme="majorBidi"/>
+          <w:sz w:val="28"/>
+          <w:szCs w:val="28"/>
+          <w:lang w:bidi="fa-IR"/>
+        </w:rPr>
+        <w:t xml:space="preserve"> </w:t>
+      </w:r>
+      <w:r>
+        <w:rPr>
+          <w:rFonts w:asciiTheme="majorBidi" w:hAnsiTheme="majorBidi" w:cstheme="majorBidi"/>
+          <w:sz w:val="28"/>
+          <w:szCs w:val="28"/>
+          <w:lang w:bidi="fa-IR"/>
+        </w:rPr>
+        <w:t xml:space="preserve">→ it shows layers, architecture, </w:t>
+      </w:r>
+      <w:proofErr w:type="spellStart"/>
+      <w:r>
+        <w:rPr>
+          <w:rFonts w:asciiTheme="majorBidi" w:hAnsiTheme="majorBidi" w:cstheme="majorBidi"/>
+          <w:sz w:val="28"/>
+          <w:szCs w:val="28"/>
+          <w:lang w:bidi="fa-IR"/>
+        </w:rPr>
+        <w:t>entrypoint</w:t>
+      </w:r>
+      <w:proofErr w:type="spellEnd"/>
+      <w:r>
+        <w:rPr>
+          <w:rFonts w:asciiTheme="majorBidi" w:hAnsiTheme="majorBidi" w:cstheme="majorBidi"/>
+          <w:sz w:val="28"/>
+          <w:szCs w:val="28"/>
+          <w:lang w:bidi="fa-IR"/>
+        </w:rPr>
+        <w:t>, default command, labels, etc.</w:t>
+      </w:r>
+    </w:p>
+    <w:p>
+      <w:pPr>
+        <w:pStyle w:val="ListParagraph"/>
+        <w:numPr>
+          <w:ilvl w:val="0"/>
+          <w:numId w:val="37"/>
+        </w:numPr>
+        <w:ind w:left="360"/>
+        <w:jc w:val="both"/>
+        <w:rPr>
+          <w:rFonts w:asciiTheme="majorBidi" w:hAnsiTheme="majorBidi" w:cstheme="majorBidi"/>
+          <w:sz w:val="28"/>
+          <w:szCs w:val="28"/>
+          <w:lang w:bidi="fa-IR"/>
+        </w:rPr>
+      </w:pPr>
+      <w:r>
+        <w:rPr>
+          <w:rFonts w:asciiTheme="majorBidi" w:hAnsiTheme="majorBidi" w:cstheme="majorBidi"/>
+          <w:sz w:val="28"/>
+          <w:szCs w:val="28"/>
+          <w:lang w:bidi="fa-IR"/>
+        </w:rPr>
+        <w:t>For networks</w:t>
+      </w:r>
+      <w:r>
+        <w:rPr>
+          <w:rFonts w:asciiTheme="majorBidi" w:hAnsiTheme="majorBidi" w:cstheme="majorBidi"/>
+          <w:sz w:val="28"/>
+          <w:szCs w:val="28"/>
+          <w:lang w:bidi="fa-IR"/>
+        </w:rPr>
+        <w:t xml:space="preserve"> </w:t>
+      </w:r>
+      <w:r>
+        <w:rPr>
+          <w:rFonts w:asciiTheme="majorBidi" w:hAnsiTheme="majorBidi" w:cstheme="majorBidi"/>
+          <w:sz w:val="28"/>
+          <w:szCs w:val="28"/>
+          <w:lang w:bidi="fa-IR"/>
+        </w:rPr>
+        <w:t>→ it shows connected containers and driver type.</w:t>
+      </w:r>
+    </w:p>
+    <w:p>
+      <w:pPr>
+        <w:pStyle w:val="ListParagraph"/>
+        <w:numPr>
+          <w:ilvl w:val="0"/>
+          <w:numId w:val="37"/>
+        </w:numPr>
+        <w:ind w:left="360"/>
+        <w:jc w:val="both"/>
+        <w:rPr>
+          <w:rFonts w:asciiTheme="majorBidi" w:hAnsiTheme="majorBidi" w:cstheme="majorBidi"/>
+          <w:sz w:val="28"/>
+          <w:szCs w:val="28"/>
+          <w:lang w:bidi="fa-IR"/>
+        </w:rPr>
+      </w:pPr>
+      <w:r>
+        <w:rPr>
+          <w:rFonts w:asciiTheme="majorBidi" w:hAnsiTheme="majorBidi" w:cstheme="majorBidi"/>
+          <w:sz w:val="28"/>
+          <w:szCs w:val="28"/>
+          <w:lang w:bidi="fa-IR"/>
+        </w:rPr>
+        <w:t>For volumes</w:t>
+      </w:r>
+      <w:r>
+        <w:rPr>
+          <w:rFonts w:asciiTheme="majorBidi" w:hAnsiTheme="majorBidi" w:cstheme="majorBidi"/>
+          <w:sz w:val="28"/>
+          <w:szCs w:val="28"/>
+          <w:lang w:bidi="fa-IR"/>
+        </w:rPr>
+        <w:t xml:space="preserve"> </w:t>
+      </w:r>
+      <w:r>
+        <w:rPr>
+          <w:rFonts w:asciiTheme="majorBidi" w:hAnsiTheme="majorBidi" w:cstheme="majorBidi"/>
+          <w:sz w:val="28"/>
+          <w:szCs w:val="28"/>
+          <w:lang w:bidi="fa-IR"/>
+        </w:rPr>
+        <w:t>→ mountpoints and driver info.</w:t>
+      </w:r>
+    </w:p>
+    <w:p>
+      <w:pPr>
+        <w:jc w:val="both"/>
+        <w:rPr>
+          <w:rFonts w:asciiTheme="majorBidi" w:hAnsiTheme="majorBidi" w:cstheme="majorBidi"/>
+          <w:b/>
+          <w:bCs/>
+          <w:sz w:val="28"/>
+          <w:szCs w:val="28"/>
+          <w:lang w:bidi="fa-IR"/>
+        </w:rPr>
+      </w:pPr>
+      <w:r>
+        <w:rPr>
+          <w:rFonts w:asciiTheme="majorBidi" w:hAnsiTheme="majorBidi" w:cstheme="majorBidi"/>
+          <w:b/>
+          <w:bCs/>
+          <w:sz w:val="28"/>
+          <w:szCs w:val="28"/>
+          <w:lang w:bidi="fa-IR"/>
+        </w:rPr>
+        <w:t>F</w:t>
+      </w:r>
+      <w:r>
+        <w:rPr>
+          <w:rFonts w:asciiTheme="majorBidi" w:hAnsiTheme="majorBidi" w:cstheme="majorBidi"/>
+          <w:b/>
+          <w:bCs/>
+          <w:sz w:val="28"/>
+          <w:szCs w:val="28"/>
+          <w:lang w:bidi="fa-IR"/>
+        </w:rPr>
+        <w:t>ormatting</w:t>
+      </w:r>
+      <w:r>
+        <w:rPr>
+          <w:rFonts w:asciiTheme="majorBidi" w:hAnsiTheme="majorBidi" w:cstheme="majorBidi"/>
+          <w:b/>
+          <w:bCs/>
+          <w:sz w:val="28"/>
+          <w:szCs w:val="28"/>
+          <w:lang w:bidi="fa-IR"/>
+        </w:rPr>
+        <w:t>:</w:t>
+      </w:r>
+    </w:p>
+    <w:p>
+      <w:pPr>
+        <w:jc w:val="both"/>
+        <w:rPr>
+          <w:rFonts w:asciiTheme="majorBidi" w:hAnsiTheme="majorBidi" w:cstheme="majorBidi"/>
+          <w:sz w:val="28"/>
+          <w:szCs w:val="28"/>
+          <w:lang w:bidi="fa-IR"/>
+        </w:rPr>
+      </w:pPr>
+      <w:r>
+        <w:rPr>
+          <w:rFonts w:asciiTheme="majorBidi" w:hAnsiTheme="majorBidi" w:cstheme="majorBidi"/>
+          <w:sz w:val="28"/>
+          <w:szCs w:val="28"/>
+          <w:lang w:bidi="fa-IR"/>
+        </w:rPr>
+        <w:t>Instead of drowning in JSON, you can extract exactly what you want:</w:t>
+      </w:r>
+    </w:p>
+    <w:p>
+      <w:pPr>
+        <w:jc w:val="both"/>
+        <w:rPr>
+          <w:rFonts w:asciiTheme="majorBidi" w:hAnsiTheme="majorBidi" w:cstheme="majorBidi"/>
+          <w:b/>
+          <w:bCs/>
+          <w:i/>
+          <w:iCs/>
+          <w:sz w:val="28"/>
+          <w:szCs w:val="28"/>
+          <w:lang w:bidi="fa-IR"/>
+        </w:rPr>
+      </w:pPr>
+      <w:r>
+        <w:rPr>
+          <w:rFonts w:asciiTheme="majorBidi" w:hAnsiTheme="majorBidi" w:cstheme="majorBidi"/>
+          <w:b/>
+          <w:bCs/>
+          <w:i/>
+          <w:iCs/>
+          <w:sz w:val="28"/>
+          <w:szCs w:val="28"/>
+          <w:lang w:bidi="fa-IR"/>
+        </w:rPr>
+        <w:t>docker inspect -f '{</w:t>
+      </w:r>
+      <w:proofErr w:type="gramStart"/>
+      <w:r>
+        <w:rPr>
+          <w:rFonts w:asciiTheme="majorBidi" w:hAnsiTheme="majorBidi" w:cstheme="majorBidi"/>
+          <w:b/>
+          <w:bCs/>
+          <w:i/>
+          <w:iCs/>
+          <w:sz w:val="28"/>
+          <w:szCs w:val="28"/>
+          <w:lang w:bidi="fa-IR"/>
+        </w:rPr>
+        <w:t>{.</w:t>
+      </w:r>
+      <w:proofErr w:type="spellStart"/>
+      <w:r>
+        <w:rPr>
+          <w:rFonts w:asciiTheme="majorBidi" w:hAnsiTheme="majorBidi" w:cstheme="majorBidi"/>
+          <w:b/>
+          <w:bCs/>
+          <w:i/>
+          <w:iCs/>
+          <w:sz w:val="28"/>
+          <w:szCs w:val="28"/>
+          <w:lang w:bidi="fa-IR"/>
+        </w:rPr>
+        <w:t>State.Pid</w:t>
+      </w:r>
+      <w:proofErr w:type="spellEnd"/>
+      <w:proofErr w:type="gramEnd"/>
+      <w:r>
+        <w:rPr>
+          <w:rFonts w:asciiTheme="majorBidi" w:hAnsiTheme="majorBidi" w:cstheme="majorBidi"/>
+          <w:b/>
+          <w:bCs/>
+          <w:i/>
+          <w:iCs/>
+          <w:sz w:val="28"/>
+          <w:szCs w:val="28"/>
+          <w:lang w:bidi="fa-IR"/>
+        </w:rPr>
+        <w:t>}}' my-container</w:t>
+      </w:r>
+      <w:r>
+        <w:rPr>
+          <w:rFonts w:asciiTheme="majorBidi" w:hAnsiTheme="majorBidi" w:cstheme="majorBidi"/>
+          <w:b/>
+          <w:bCs/>
+          <w:i/>
+          <w:iCs/>
+          <w:sz w:val="28"/>
+          <w:szCs w:val="28"/>
+          <w:lang w:bidi="fa-IR"/>
+        </w:rPr>
+        <w:t xml:space="preserve"> </w:t>
+      </w:r>
+      <w:r>
+        <w:rPr>
+          <w:rFonts w:asciiTheme="majorBidi" w:hAnsiTheme="majorBidi" w:cstheme="majorBidi"/>
+          <w:sz w:val="28"/>
+          <w:szCs w:val="28"/>
+          <w:lang w:bidi="fa-IR"/>
+        </w:rPr>
+        <w:t>→ That prints only the container’s PID on the host.</w:t>
+      </w:r>
+    </w:p>
+    <w:p>
+      <w:pPr>
+        <w:jc w:val="both"/>
+        <w:rPr>
+          <w:rFonts w:asciiTheme="majorBidi" w:hAnsiTheme="majorBidi" w:cstheme="majorBidi"/>
+          <w:sz w:val="28"/>
+          <w:szCs w:val="28"/>
+          <w:lang w:bidi="fa-IR"/>
+        </w:rPr>
+      </w:pPr>
+      <w:r>
+        <w:rPr>
+          <w:rFonts w:asciiTheme="majorBidi" w:hAnsiTheme="majorBidi" w:cstheme="majorBidi"/>
+          <w:sz w:val="28"/>
+          <w:szCs w:val="28"/>
+          <w:lang w:bidi="fa-IR"/>
+        </w:rPr>
+        <w:t>So conceptually:</w:t>
+      </w:r>
+    </w:p>
+    <w:p>
+      <w:pPr>
+        <w:pStyle w:val="ListParagraph"/>
+        <w:numPr>
+          <w:ilvl w:val="0"/>
+          <w:numId w:val="38"/>
+        </w:numPr>
+        <w:ind w:left="360"/>
+        <w:jc w:val="both"/>
+        <w:rPr>
+          <w:rFonts w:asciiTheme="majorBidi" w:hAnsiTheme="majorBidi" w:cstheme="majorBidi"/>
+          <w:sz w:val="28"/>
+          <w:szCs w:val="28"/>
+          <w:lang w:bidi="fa-IR"/>
+        </w:rPr>
+      </w:pPr>
+      <w:r>
+        <w:rPr>
+          <w:rFonts w:asciiTheme="majorBidi" w:hAnsiTheme="majorBidi" w:cstheme="majorBidi"/>
+          <w:b/>
+          <w:bCs/>
+          <w:i/>
+          <w:iCs/>
+          <w:sz w:val="28"/>
+          <w:szCs w:val="28"/>
+          <w:lang w:bidi="fa-IR"/>
+        </w:rPr>
+        <w:t xml:space="preserve">docker </w:t>
+      </w:r>
+      <w:proofErr w:type="spellStart"/>
+      <w:r>
+        <w:rPr>
+          <w:rFonts w:asciiTheme="majorBidi" w:hAnsiTheme="majorBidi" w:cstheme="majorBidi"/>
+          <w:b/>
+          <w:bCs/>
+          <w:i/>
+          <w:iCs/>
+          <w:sz w:val="28"/>
+          <w:szCs w:val="28"/>
+          <w:lang w:bidi="fa-IR"/>
+        </w:rPr>
+        <w:t>ps</w:t>
+      </w:r>
+      <w:proofErr w:type="spellEnd"/>
+      <w:r>
+        <w:rPr>
+          <w:rFonts w:asciiTheme="majorBidi" w:hAnsiTheme="majorBidi" w:cstheme="majorBidi"/>
+          <w:sz w:val="28"/>
+          <w:szCs w:val="28"/>
+          <w:lang w:bidi="fa-IR"/>
+        </w:rPr>
+        <w:t xml:space="preserve"> → summary</w:t>
+      </w:r>
+    </w:p>
+    <w:p>
+      <w:pPr>
+        <w:pStyle w:val="ListParagraph"/>
+        <w:numPr>
+          <w:ilvl w:val="0"/>
+          <w:numId w:val="38"/>
+        </w:numPr>
+        <w:ind w:left="360"/>
+        <w:jc w:val="both"/>
+        <w:rPr>
+          <w:rFonts w:asciiTheme="majorBidi" w:hAnsiTheme="majorBidi" w:cstheme="majorBidi"/>
+          <w:sz w:val="28"/>
+          <w:szCs w:val="28"/>
+          <w:lang w:bidi="fa-IR"/>
+        </w:rPr>
+      </w:pPr>
+      <w:r>
+        <w:rPr>
+          <w:rFonts w:asciiTheme="majorBidi" w:hAnsiTheme="majorBidi" w:cstheme="majorBidi"/>
+          <w:b/>
+          <w:bCs/>
+          <w:i/>
+          <w:iCs/>
+          <w:sz w:val="28"/>
+          <w:szCs w:val="28"/>
+          <w:lang w:bidi="fa-IR"/>
+        </w:rPr>
+        <w:t>docker stats</w:t>
+      </w:r>
+      <w:r>
+        <w:rPr>
+          <w:rFonts w:asciiTheme="majorBidi" w:hAnsiTheme="majorBidi" w:cstheme="majorBidi"/>
+          <w:sz w:val="28"/>
+          <w:szCs w:val="28"/>
+          <w:lang w:bidi="fa-IR"/>
+        </w:rPr>
+        <w:t xml:space="preserve"> → live resource usage</w:t>
+      </w:r>
+    </w:p>
+    <w:p>
+      <w:pPr>
+        <w:pStyle w:val="ListParagraph"/>
+        <w:numPr>
+          <w:ilvl w:val="0"/>
+          <w:numId w:val="38"/>
+        </w:numPr>
+        <w:ind w:left="360"/>
+        <w:jc w:val="both"/>
+        <w:rPr>
+          <w:rFonts w:asciiTheme="majorBidi" w:hAnsiTheme="majorBidi" w:cstheme="majorBidi"/>
+          <w:sz w:val="28"/>
+          <w:szCs w:val="28"/>
+          <w:lang w:bidi="fa-IR"/>
+        </w:rPr>
+      </w:pPr>
+      <w:r>
+        <w:rPr>
+          <w:rFonts w:asciiTheme="majorBidi" w:hAnsiTheme="majorBidi" w:cstheme="majorBidi"/>
+          <w:b/>
+          <w:bCs/>
+          <w:i/>
+          <w:iCs/>
+          <w:sz w:val="28"/>
+          <w:szCs w:val="28"/>
+          <w:lang w:bidi="fa-IR"/>
+        </w:rPr>
+        <w:t>docker inspect</w:t>
+      </w:r>
+      <w:r>
+        <w:rPr>
+          <w:rFonts w:asciiTheme="majorBidi" w:hAnsiTheme="majorBidi" w:cstheme="majorBidi"/>
+          <w:sz w:val="28"/>
+          <w:szCs w:val="28"/>
+          <w:lang w:bidi="fa-IR"/>
+        </w:rPr>
+        <w:t xml:space="preserve"> → full structured metadata</w:t>
+      </w:r>
+    </w:p>
+    <w:p>
+      <w:pPr>
+        <w:jc w:val="both"/>
+        <w:rPr>
+          <w:rFonts w:asciiTheme="majorBidi" w:hAnsiTheme="majorBidi" w:cstheme="majorBidi"/>
+          <w:b/>
+          <w:bCs/>
+          <w:sz w:val="36"/>
+          <w:szCs w:val="36"/>
+          <w:lang w:bidi="fa-IR"/>
+        </w:rPr>
+      </w:pPr>
+      <w:r>
+        <w:rPr>
+          <w:rFonts w:asciiTheme="majorBidi" w:hAnsiTheme="majorBidi" w:cstheme="majorBidi"/>
+          <w:b/>
+          <w:bCs/>
+          <w:i/>
+          <w:iCs/>
+          <w:sz w:val="32"/>
+          <w:szCs w:val="32"/>
+          <w:lang w:bidi="fa-IR"/>
+        </w:rPr>
         <w:t>docker system</w:t>
       </w:r>
       <w:r>
@@ -14809,6 +15623,7 @@
           <w:szCs w:val="28"/>
           <w:lang w:bidi="fa-IR"/>
         </w:rPr>
+        <w:lastRenderedPageBreak/>
         <w:t>build cache</w:t>
       </w:r>
     </w:p>
@@ -15188,6 +16003,119 @@
     </w:lvl>
   </w:abstractNum>
   <w:abstractNum w:abstractNumId="2" w15:restartNumberingAfterBreak="0">
+    <w:nsid w:val="07C36458"/>
+    <w:multiLevelType w:val="hybridMultilevel"/>
+    <w:tmpl w:val="B75AABF0"/>
+    <w:lvl w:ilvl="0" w:tplc="04090001">
+      <w:start w:val="1"/>
+      <w:numFmt w:val="bullet"/>
+      <w:lvlText w:val=""/>
+      <w:lvlJc w:val="left"/>
+      <w:pPr>
+        <w:ind w:left="720" w:hanging="360"/>
+      </w:pPr>
+      <w:rPr>
+        <w:rFonts w:ascii="Symbol" w:hAnsi="Symbol" w:hint="default"/>
+      </w:rPr>
+    </w:lvl>
+    <w:lvl w:ilvl="1" w:tplc="04090003" w:tentative="1">
+      <w:start w:val="1"/>
+      <w:numFmt w:val="bullet"/>
+      <w:lvlText w:val="o"/>
+      <w:lvlJc w:val="left"/>
+      <w:pPr>
+        <w:ind w:left="1440" w:hanging="360"/>
+      </w:pPr>
+      <w:rPr>
+        <w:rFonts w:ascii="Courier New" w:hAnsi="Courier New" w:cs="Courier New" w:hint="default"/>
+      </w:rPr>
+    </w:lvl>
+    <w:lvl w:ilvl="2" w:tplc="04090005" w:tentative="1">
+      <w:start w:val="1"/>
+      <w:numFmt w:val="bullet"/>
+      <w:lvlText w:val=""/>
+      <w:lvlJc w:val="left"/>
+      <w:pPr>
+        <w:ind w:left="2160" w:hanging="360"/>
+      </w:pPr>
+      <w:rPr>
+        <w:rFonts w:ascii="Wingdings" w:hAnsi="Wingdings" w:hint="default"/>
+      </w:rPr>
+    </w:lvl>
+    <w:lvl w:ilvl="3" w:tplc="04090001" w:tentative="1">
+      <w:start w:val="1"/>
+      <w:numFmt w:val="bullet"/>
+      <w:lvlText w:val=""/>
+      <w:lvlJc w:val="left"/>
+      <w:pPr>
+        <w:ind w:left="2880" w:hanging="360"/>
+      </w:pPr>
+      <w:rPr>
+        <w:rFonts w:ascii="Symbol" w:hAnsi="Symbol" w:hint="default"/>
+      </w:rPr>
+    </w:lvl>
+    <w:lvl w:ilvl="4" w:tplc="04090003" w:tentative="1">
+      <w:start w:val="1"/>
+      <w:numFmt w:val="bullet"/>
+      <w:lvlText w:val="o"/>
+      <w:lvlJc w:val="left"/>
+      <w:pPr>
+        <w:ind w:left="3600" w:hanging="360"/>
+      </w:pPr>
+      <w:rPr>
+        <w:rFonts w:ascii="Courier New" w:hAnsi="Courier New" w:cs="Courier New" w:hint="default"/>
+      </w:rPr>
+    </w:lvl>
+    <w:lvl w:ilvl="5" w:tplc="04090005" w:tentative="1">
+      <w:start w:val="1"/>
+      <w:numFmt w:val="bullet"/>
+      <w:lvlText w:val=""/>
+      <w:lvlJc w:val="left"/>
+      <w:pPr>
+        <w:ind w:left="4320" w:hanging="360"/>
+      </w:pPr>
+      <w:rPr>
+        <w:rFonts w:ascii="Wingdings" w:hAnsi="Wingdings" w:hint="default"/>
+      </w:rPr>
+    </w:lvl>
+    <w:lvl w:ilvl="6" w:tplc="04090001" w:tentative="1">
+      <w:start w:val="1"/>
+      <w:numFmt w:val="bullet"/>
+      <w:lvlText w:val=""/>
+      <w:lvlJc w:val="left"/>
+      <w:pPr>
+        <w:ind w:left="5040" w:hanging="360"/>
+      </w:pPr>
+      <w:rPr>
+        <w:rFonts w:ascii="Symbol" w:hAnsi="Symbol" w:hint="default"/>
+      </w:rPr>
+    </w:lvl>
+    <w:lvl w:ilvl="7" w:tplc="04090003" w:tentative="1">
+      <w:start w:val="1"/>
+      <w:numFmt w:val="bullet"/>
+      <w:lvlText w:val="o"/>
+      <w:lvlJc w:val="left"/>
+      <w:pPr>
+        <w:ind w:left="5760" w:hanging="360"/>
+      </w:pPr>
+      <w:rPr>
+        <w:rFonts w:ascii="Courier New" w:hAnsi="Courier New" w:cs="Courier New" w:hint="default"/>
+      </w:rPr>
+    </w:lvl>
+    <w:lvl w:ilvl="8" w:tplc="04090005" w:tentative="1">
+      <w:start w:val="1"/>
+      <w:numFmt w:val="bullet"/>
+      <w:lvlText w:val=""/>
+      <w:lvlJc w:val="left"/>
+      <w:pPr>
+        <w:ind w:left="6480" w:hanging="360"/>
+      </w:pPr>
+      <w:rPr>
+        <w:rFonts w:ascii="Wingdings" w:hAnsi="Wingdings" w:hint="default"/>
+      </w:rPr>
+    </w:lvl>
+  </w:abstractNum>
+  <w:abstractNum w:abstractNumId="3" w15:restartNumberingAfterBreak="0">
     <w:nsid w:val="08803949"/>
     <w:multiLevelType w:val="hybridMultilevel"/>
     <w:tmpl w:val="2A92734C"/>
@@ -15300,7 +16228,7 @@
       </w:rPr>
     </w:lvl>
   </w:abstractNum>
-  <w:abstractNum w:abstractNumId="3" w15:restartNumberingAfterBreak="0">
+  <w:abstractNum w:abstractNumId="4" w15:restartNumberingAfterBreak="0">
     <w:nsid w:val="0A2140A7"/>
     <w:multiLevelType w:val="hybridMultilevel"/>
     <w:tmpl w:val="18FCF8A4"/>
@@ -15413,7 +16341,7 @@
       </w:rPr>
     </w:lvl>
   </w:abstractNum>
-  <w:abstractNum w:abstractNumId="4" w15:restartNumberingAfterBreak="0">
+  <w:abstractNum w:abstractNumId="5" w15:restartNumberingAfterBreak="0">
     <w:nsid w:val="0B3F31E0"/>
     <w:multiLevelType w:val="hybridMultilevel"/>
     <w:tmpl w:val="566268F0"/>
@@ -15526,7 +16454,7 @@
       </w:rPr>
     </w:lvl>
   </w:abstractNum>
-  <w:abstractNum w:abstractNumId="5" w15:restartNumberingAfterBreak="0">
+  <w:abstractNum w:abstractNumId="6" w15:restartNumberingAfterBreak="0">
     <w:nsid w:val="146461AC"/>
     <w:multiLevelType w:val="hybridMultilevel"/>
     <w:tmpl w:val="BEDA3CD2"/>
@@ -15639,7 +16567,7 @@
       </w:rPr>
     </w:lvl>
   </w:abstractNum>
-  <w:abstractNum w:abstractNumId="6" w15:restartNumberingAfterBreak="0">
+  <w:abstractNum w:abstractNumId="7" w15:restartNumberingAfterBreak="0">
     <w:nsid w:val="14BF15F6"/>
     <w:multiLevelType w:val="hybridMultilevel"/>
     <w:tmpl w:val="0EAEA47E"/>
@@ -15752,7 +16680,7 @@
       </w:rPr>
     </w:lvl>
   </w:abstractNum>
-  <w:abstractNum w:abstractNumId="7" w15:restartNumberingAfterBreak="0">
+  <w:abstractNum w:abstractNumId="8" w15:restartNumberingAfterBreak="0">
     <w:nsid w:val="159C45AA"/>
     <w:multiLevelType w:val="hybridMultilevel"/>
     <w:tmpl w:val="A7F6150C"/>
@@ -15865,7 +16793,7 @@
       </w:rPr>
     </w:lvl>
   </w:abstractNum>
-  <w:abstractNum w:abstractNumId="8" w15:restartNumberingAfterBreak="0">
+  <w:abstractNum w:abstractNumId="9" w15:restartNumberingAfterBreak="0">
     <w:nsid w:val="1D6139FD"/>
     <w:multiLevelType w:val="hybridMultilevel"/>
     <w:tmpl w:val="98800234"/>
@@ -15978,7 +16906,7 @@
       </w:rPr>
     </w:lvl>
   </w:abstractNum>
-  <w:abstractNum w:abstractNumId="9" w15:restartNumberingAfterBreak="0">
+  <w:abstractNum w:abstractNumId="10" w15:restartNumberingAfterBreak="0">
     <w:nsid w:val="1E6A7732"/>
     <w:multiLevelType w:val="hybridMultilevel"/>
     <w:tmpl w:val="FA228F68"/>
@@ -16091,7 +17019,7 @@
       </w:rPr>
     </w:lvl>
   </w:abstractNum>
-  <w:abstractNum w:abstractNumId="10" w15:restartNumberingAfterBreak="0">
+  <w:abstractNum w:abstractNumId="11" w15:restartNumberingAfterBreak="0">
     <w:nsid w:val="22961FF0"/>
     <w:multiLevelType w:val="hybridMultilevel"/>
     <w:tmpl w:val="C7A83280"/>
@@ -16204,7 +17132,7 @@
       </w:rPr>
     </w:lvl>
   </w:abstractNum>
-  <w:abstractNum w:abstractNumId="11" w15:restartNumberingAfterBreak="0">
+  <w:abstractNum w:abstractNumId="12" w15:restartNumberingAfterBreak="0">
     <w:nsid w:val="27A816DA"/>
     <w:multiLevelType w:val="hybridMultilevel"/>
     <w:tmpl w:val="ACFCB710"/>
@@ -16317,7 +17245,120 @@
       </w:rPr>
     </w:lvl>
   </w:abstractNum>
-  <w:abstractNum w:abstractNumId="12" w15:restartNumberingAfterBreak="0">
+  <w:abstractNum w:abstractNumId="13" w15:restartNumberingAfterBreak="0">
+    <w:nsid w:val="282145A8"/>
+    <w:multiLevelType w:val="hybridMultilevel"/>
+    <w:tmpl w:val="27E00D7E"/>
+    <w:lvl w:ilvl="0" w:tplc="04090001">
+      <w:start w:val="1"/>
+      <w:numFmt w:val="bullet"/>
+      <w:lvlText w:val=""/>
+      <w:lvlJc w:val="left"/>
+      <w:pPr>
+        <w:ind w:left="720" w:hanging="360"/>
+      </w:pPr>
+      <w:rPr>
+        <w:rFonts w:ascii="Symbol" w:hAnsi="Symbol" w:hint="default"/>
+      </w:rPr>
+    </w:lvl>
+    <w:lvl w:ilvl="1" w:tplc="04090003" w:tentative="1">
+      <w:start w:val="1"/>
+      <w:numFmt w:val="bullet"/>
+      <w:lvlText w:val="o"/>
+      <w:lvlJc w:val="left"/>
+      <w:pPr>
+        <w:ind w:left="1440" w:hanging="360"/>
+      </w:pPr>
+      <w:rPr>
+        <w:rFonts w:ascii="Courier New" w:hAnsi="Courier New" w:cs="Courier New" w:hint="default"/>
+      </w:rPr>
+    </w:lvl>
+    <w:lvl w:ilvl="2" w:tplc="04090005" w:tentative="1">
+      <w:start w:val="1"/>
+      <w:numFmt w:val="bullet"/>
+      <w:lvlText w:val=""/>
+      <w:lvlJc w:val="left"/>
+      <w:pPr>
+        <w:ind w:left="2160" w:hanging="360"/>
+      </w:pPr>
+      <w:rPr>
+        <w:rFonts w:ascii="Wingdings" w:hAnsi="Wingdings" w:hint="default"/>
+      </w:rPr>
+    </w:lvl>
+    <w:lvl w:ilvl="3" w:tplc="04090001" w:tentative="1">
+      <w:start w:val="1"/>
+      <w:numFmt w:val="bullet"/>
+      <w:lvlText w:val=""/>
+      <w:lvlJc w:val="left"/>
+      <w:pPr>
+        <w:ind w:left="2880" w:hanging="360"/>
+      </w:pPr>
+      <w:rPr>
+        <w:rFonts w:ascii="Symbol" w:hAnsi="Symbol" w:hint="default"/>
+      </w:rPr>
+    </w:lvl>
+    <w:lvl w:ilvl="4" w:tplc="04090003" w:tentative="1">
+      <w:start w:val="1"/>
+      <w:numFmt w:val="bullet"/>
+      <w:lvlText w:val="o"/>
+      <w:lvlJc w:val="left"/>
+      <w:pPr>
+        <w:ind w:left="3600" w:hanging="360"/>
+      </w:pPr>
+      <w:rPr>
+        <w:rFonts w:ascii="Courier New" w:hAnsi="Courier New" w:cs="Courier New" w:hint="default"/>
+      </w:rPr>
+    </w:lvl>
+    <w:lvl w:ilvl="5" w:tplc="04090005" w:tentative="1">
+      <w:start w:val="1"/>
+      <w:numFmt w:val="bullet"/>
+      <w:lvlText w:val=""/>
+      <w:lvlJc w:val="left"/>
+      <w:pPr>
+        <w:ind w:left="4320" w:hanging="360"/>
+      </w:pPr>
+      <w:rPr>
+        <w:rFonts w:ascii="Wingdings" w:hAnsi="Wingdings" w:hint="default"/>
+      </w:rPr>
+    </w:lvl>
+    <w:lvl w:ilvl="6" w:tplc="04090001" w:tentative="1">
+      <w:start w:val="1"/>
+      <w:numFmt w:val="bullet"/>
+      <w:lvlText w:val=""/>
+      <w:lvlJc w:val="left"/>
+      <w:pPr>
+        <w:ind w:left="5040" w:hanging="360"/>
+      </w:pPr>
+      <w:rPr>
+        <w:rFonts w:ascii="Symbol" w:hAnsi="Symbol" w:hint="default"/>
+      </w:rPr>
+    </w:lvl>
+    <w:lvl w:ilvl="7" w:tplc="04090003" w:tentative="1">
+      <w:start w:val="1"/>
+      <w:numFmt w:val="bullet"/>
+      <w:lvlText w:val="o"/>
+      <w:lvlJc w:val="left"/>
+      <w:pPr>
+        <w:ind w:left="5760" w:hanging="360"/>
+      </w:pPr>
+      <w:rPr>
+        <w:rFonts w:ascii="Courier New" w:hAnsi="Courier New" w:cs="Courier New" w:hint="default"/>
+      </w:rPr>
+    </w:lvl>
+    <w:lvl w:ilvl="8" w:tplc="04090005" w:tentative="1">
+      <w:start w:val="1"/>
+      <w:numFmt w:val="bullet"/>
+      <w:lvlText w:val=""/>
+      <w:lvlJc w:val="left"/>
+      <w:pPr>
+        <w:ind w:left="6480" w:hanging="360"/>
+      </w:pPr>
+      <w:rPr>
+        <w:rFonts w:ascii="Wingdings" w:hAnsi="Wingdings" w:hint="default"/>
+      </w:rPr>
+    </w:lvl>
+  </w:abstractNum>
+  <w:abstractNum w:abstractNumId="14" w15:restartNumberingAfterBreak="0">
     <w:nsid w:val="29AE2D59"/>
     <w:multiLevelType w:val="hybridMultilevel"/>
     <w:tmpl w:val="F30A7CE0"/>
@@ -16430,7 +17471,7 @@
       </w:rPr>
     </w:lvl>
   </w:abstractNum>
-  <w:abstractNum w:abstractNumId="13" w15:restartNumberingAfterBreak="0">
+  <w:abstractNum w:abstractNumId="15" w15:restartNumberingAfterBreak="0">
     <w:nsid w:val="29E903F9"/>
     <w:multiLevelType w:val="hybridMultilevel"/>
     <w:tmpl w:val="4BCAFC12"/>
@@ -16543,7 +17584,7 @@
       </w:rPr>
     </w:lvl>
   </w:abstractNum>
-  <w:abstractNum w:abstractNumId="14" w15:restartNumberingAfterBreak="0">
+  <w:abstractNum w:abstractNumId="16" w15:restartNumberingAfterBreak="0">
     <w:nsid w:val="301545F4"/>
     <w:multiLevelType w:val="hybridMultilevel"/>
     <w:tmpl w:val="30825530"/>
@@ -16656,7 +17697,7 @@
       </w:rPr>
     </w:lvl>
   </w:abstractNum>
-  <w:abstractNum w:abstractNumId="15" w15:restartNumberingAfterBreak="0">
+  <w:abstractNum w:abstractNumId="17" w15:restartNumberingAfterBreak="0">
     <w:nsid w:val="34850045"/>
     <w:multiLevelType w:val="hybridMultilevel"/>
     <w:tmpl w:val="24228F42"/>
@@ -16769,7 +17810,7 @@
       </w:rPr>
     </w:lvl>
   </w:abstractNum>
-  <w:abstractNum w:abstractNumId="16" w15:restartNumberingAfterBreak="0">
+  <w:abstractNum w:abstractNumId="18" w15:restartNumberingAfterBreak="0">
     <w:nsid w:val="354E3CE4"/>
     <w:multiLevelType w:val="hybridMultilevel"/>
     <w:tmpl w:val="6798CA5A"/>
@@ -16882,7 +17923,7 @@
       </w:rPr>
     </w:lvl>
   </w:abstractNum>
-  <w:abstractNum w:abstractNumId="17" w15:restartNumberingAfterBreak="0">
+  <w:abstractNum w:abstractNumId="19" w15:restartNumberingAfterBreak="0">
     <w:nsid w:val="356A5274"/>
     <w:multiLevelType w:val="hybridMultilevel"/>
     <w:tmpl w:val="0B447D8A"/>
@@ -16995,7 +18036,7 @@
       </w:rPr>
     </w:lvl>
   </w:abstractNum>
-  <w:abstractNum w:abstractNumId="18" w15:restartNumberingAfterBreak="0">
+  <w:abstractNum w:abstractNumId="20" w15:restartNumberingAfterBreak="0">
     <w:nsid w:val="35CD3632"/>
     <w:multiLevelType w:val="hybridMultilevel"/>
     <w:tmpl w:val="B3F0A506"/>
@@ -17108,7 +18149,7 @@
       </w:rPr>
     </w:lvl>
   </w:abstractNum>
-  <w:abstractNum w:abstractNumId="19" w15:restartNumberingAfterBreak="0">
+  <w:abstractNum w:abstractNumId="21" w15:restartNumberingAfterBreak="0">
     <w:nsid w:val="473461ED"/>
     <w:multiLevelType w:val="hybridMultilevel"/>
     <w:tmpl w:val="073CF6F4"/>
@@ -17221,7 +18262,7 @@
       </w:rPr>
     </w:lvl>
   </w:abstractNum>
-  <w:abstractNum w:abstractNumId="20" w15:restartNumberingAfterBreak="0">
+  <w:abstractNum w:abstractNumId="22" w15:restartNumberingAfterBreak="0">
     <w:nsid w:val="48CE4188"/>
     <w:multiLevelType w:val="hybridMultilevel"/>
     <w:tmpl w:val="A2F8A7D2"/>
@@ -17334,7 +18375,7 @@
       </w:rPr>
     </w:lvl>
   </w:abstractNum>
-  <w:abstractNum w:abstractNumId="21" w15:restartNumberingAfterBreak="0">
+  <w:abstractNum w:abstractNumId="23" w15:restartNumberingAfterBreak="0">
     <w:nsid w:val="4FCB5865"/>
     <w:multiLevelType w:val="hybridMultilevel"/>
     <w:tmpl w:val="E3DE694E"/>
@@ -17447,7 +18488,7 @@
       </w:rPr>
     </w:lvl>
   </w:abstractNum>
-  <w:abstractNum w:abstractNumId="22" w15:restartNumberingAfterBreak="0">
+  <w:abstractNum w:abstractNumId="24" w15:restartNumberingAfterBreak="0">
     <w:nsid w:val="51F90A70"/>
     <w:multiLevelType w:val="hybridMultilevel"/>
     <w:tmpl w:val="2EFA942E"/>
@@ -17560,7 +18601,7 @@
       </w:rPr>
     </w:lvl>
   </w:abstractNum>
-  <w:abstractNum w:abstractNumId="23" w15:restartNumberingAfterBreak="0">
+  <w:abstractNum w:abstractNumId="25" w15:restartNumberingAfterBreak="0">
     <w:nsid w:val="557A6C2A"/>
     <w:multiLevelType w:val="hybridMultilevel"/>
     <w:tmpl w:val="9774AF78"/>
@@ -17646,7 +18687,7 @@
       </w:pPr>
     </w:lvl>
   </w:abstractNum>
-  <w:abstractNum w:abstractNumId="24" w15:restartNumberingAfterBreak="0">
+  <w:abstractNum w:abstractNumId="26" w15:restartNumberingAfterBreak="0">
     <w:nsid w:val="57786EF4"/>
     <w:multiLevelType w:val="hybridMultilevel"/>
     <w:tmpl w:val="ACBAD488"/>
@@ -17759,7 +18800,7 @@
       </w:rPr>
     </w:lvl>
   </w:abstractNum>
-  <w:abstractNum w:abstractNumId="25" w15:restartNumberingAfterBreak="0">
+  <w:abstractNum w:abstractNumId="27" w15:restartNumberingAfterBreak="0">
     <w:nsid w:val="604453DB"/>
     <w:multiLevelType w:val="hybridMultilevel"/>
     <w:tmpl w:val="8B0CAB98"/>
@@ -17872,7 +18913,7 @@
       </w:rPr>
     </w:lvl>
   </w:abstractNum>
-  <w:abstractNum w:abstractNumId="26" w15:restartNumberingAfterBreak="0">
+  <w:abstractNum w:abstractNumId="28" w15:restartNumberingAfterBreak="0">
     <w:nsid w:val="615E18EE"/>
     <w:multiLevelType w:val="hybridMultilevel"/>
     <w:tmpl w:val="30DCC388"/>
@@ -17985,7 +19026,7 @@
       </w:rPr>
     </w:lvl>
   </w:abstractNum>
-  <w:abstractNum w:abstractNumId="27" w15:restartNumberingAfterBreak="0">
+  <w:abstractNum w:abstractNumId="29" w15:restartNumberingAfterBreak="0">
     <w:nsid w:val="62B625C1"/>
     <w:multiLevelType w:val="hybridMultilevel"/>
     <w:tmpl w:val="4716A242"/>
@@ -18098,7 +19139,120 @@
       </w:rPr>
     </w:lvl>
   </w:abstractNum>
-  <w:abstractNum w:abstractNumId="28" w15:restartNumberingAfterBreak="0">
+  <w:abstractNum w:abstractNumId="30" w15:restartNumberingAfterBreak="0">
+    <w:nsid w:val="65913D32"/>
+    <w:multiLevelType w:val="hybridMultilevel"/>
+    <w:tmpl w:val="ED64C604"/>
+    <w:lvl w:ilvl="0" w:tplc="04090001">
+      <w:start w:val="1"/>
+      <w:numFmt w:val="bullet"/>
+      <w:lvlText w:val=""/>
+      <w:lvlJc w:val="left"/>
+      <w:pPr>
+        <w:ind w:left="720" w:hanging="360"/>
+      </w:pPr>
+      <w:rPr>
+        <w:rFonts w:ascii="Symbol" w:hAnsi="Symbol" w:hint="default"/>
+      </w:rPr>
+    </w:lvl>
+    <w:lvl w:ilvl="1" w:tplc="04090003" w:tentative="1">
+      <w:start w:val="1"/>
+      <w:numFmt w:val="bullet"/>
+      <w:lvlText w:val="o"/>
+      <w:lvlJc w:val="left"/>
+      <w:pPr>
+        <w:ind w:left="1440" w:hanging="360"/>
+      </w:pPr>
+      <w:rPr>
+        <w:rFonts w:ascii="Courier New" w:hAnsi="Courier New" w:cs="Courier New" w:hint="default"/>
+      </w:rPr>
+    </w:lvl>
+    <w:lvl w:ilvl="2" w:tplc="04090005" w:tentative="1">
+      <w:start w:val="1"/>
+      <w:numFmt w:val="bullet"/>
+      <w:lvlText w:val=""/>
+      <w:lvlJc w:val="left"/>
+      <w:pPr>
+        <w:ind w:left="2160" w:hanging="360"/>
+      </w:pPr>
+      <w:rPr>
+        <w:rFonts w:ascii="Wingdings" w:hAnsi="Wingdings" w:hint="default"/>
+      </w:rPr>
+    </w:lvl>
+    <w:lvl w:ilvl="3" w:tplc="04090001" w:tentative="1">
+      <w:start w:val="1"/>
+      <w:numFmt w:val="bullet"/>
+      <w:lvlText w:val=""/>
+      <w:lvlJc w:val="left"/>
+      <w:pPr>
+        <w:ind w:left="2880" w:hanging="360"/>
+      </w:pPr>
+      <w:rPr>
+        <w:rFonts w:ascii="Symbol" w:hAnsi="Symbol" w:hint="default"/>
+      </w:rPr>
+    </w:lvl>
+    <w:lvl w:ilvl="4" w:tplc="04090003" w:tentative="1">
+      <w:start w:val="1"/>
+      <w:numFmt w:val="bullet"/>
+      <w:lvlText w:val="o"/>
+      <w:lvlJc w:val="left"/>
+      <w:pPr>
+        <w:ind w:left="3600" w:hanging="360"/>
+      </w:pPr>
+      <w:rPr>
+        <w:rFonts w:ascii="Courier New" w:hAnsi="Courier New" w:cs="Courier New" w:hint="default"/>
+      </w:rPr>
+    </w:lvl>
+    <w:lvl w:ilvl="5" w:tplc="04090005" w:tentative="1">
+      <w:start w:val="1"/>
+      <w:numFmt w:val="bullet"/>
+      <w:lvlText w:val=""/>
+      <w:lvlJc w:val="left"/>
+      <w:pPr>
+        <w:ind w:left="4320" w:hanging="360"/>
+      </w:pPr>
+      <w:rPr>
+        <w:rFonts w:ascii="Wingdings" w:hAnsi="Wingdings" w:hint="default"/>
+      </w:rPr>
+    </w:lvl>
+    <w:lvl w:ilvl="6" w:tplc="04090001" w:tentative="1">
+      <w:start w:val="1"/>
+      <w:numFmt w:val="bullet"/>
+      <w:lvlText w:val=""/>
+      <w:lvlJc w:val="left"/>
+      <w:pPr>
+        <w:ind w:left="5040" w:hanging="360"/>
+      </w:pPr>
+      <w:rPr>
+        <w:rFonts w:ascii="Symbol" w:hAnsi="Symbol" w:hint="default"/>
+      </w:rPr>
+    </w:lvl>
+    <w:lvl w:ilvl="7" w:tplc="04090003" w:tentative="1">
+      <w:start w:val="1"/>
+      <w:numFmt w:val="bullet"/>
+      <w:lvlText w:val="o"/>
+      <w:lvlJc w:val="left"/>
+      <w:pPr>
+        <w:ind w:left="5760" w:hanging="360"/>
+      </w:pPr>
+      <w:rPr>
+        <w:rFonts w:ascii="Courier New" w:hAnsi="Courier New" w:cs="Courier New" w:hint="default"/>
+      </w:rPr>
+    </w:lvl>
+    <w:lvl w:ilvl="8" w:tplc="04090005" w:tentative="1">
+      <w:start w:val="1"/>
+      <w:numFmt w:val="bullet"/>
+      <w:lvlText w:val=""/>
+      <w:lvlJc w:val="left"/>
+      <w:pPr>
+        <w:ind w:left="6480" w:hanging="360"/>
+      </w:pPr>
+      <w:rPr>
+        <w:rFonts w:ascii="Wingdings" w:hAnsi="Wingdings" w:hint="default"/>
+      </w:rPr>
+    </w:lvl>
+  </w:abstractNum>
+  <w:abstractNum w:abstractNumId="31" w15:restartNumberingAfterBreak="0">
     <w:nsid w:val="6A57614C"/>
     <w:multiLevelType w:val="hybridMultilevel"/>
     <w:tmpl w:val="F0E05FF0"/>
@@ -18211,7 +19365,7 @@
       </w:rPr>
     </w:lvl>
   </w:abstractNum>
-  <w:abstractNum w:abstractNumId="29" w15:restartNumberingAfterBreak="0">
+  <w:abstractNum w:abstractNumId="32" w15:restartNumberingAfterBreak="0">
     <w:nsid w:val="6A7A2A86"/>
     <w:multiLevelType w:val="hybridMultilevel"/>
     <w:tmpl w:val="43A20626"/>
@@ -18324,7 +19478,7 @@
       </w:rPr>
     </w:lvl>
   </w:abstractNum>
-  <w:abstractNum w:abstractNumId="30" w15:restartNumberingAfterBreak="0">
+  <w:abstractNum w:abstractNumId="33" w15:restartNumberingAfterBreak="0">
     <w:nsid w:val="6C804B90"/>
     <w:multiLevelType w:val="hybridMultilevel"/>
     <w:tmpl w:val="C45CAB64"/>
@@ -18437,7 +19591,7 @@
       </w:rPr>
     </w:lvl>
   </w:abstractNum>
-  <w:abstractNum w:abstractNumId="31" w15:restartNumberingAfterBreak="0">
+  <w:abstractNum w:abstractNumId="34" w15:restartNumberingAfterBreak="0">
     <w:nsid w:val="6EF04610"/>
     <w:multiLevelType w:val="hybridMultilevel"/>
     <w:tmpl w:val="A8A8CDEC"/>
@@ -18550,7 +19704,7 @@
       </w:rPr>
     </w:lvl>
   </w:abstractNum>
-  <w:abstractNum w:abstractNumId="32" w15:restartNumberingAfterBreak="0">
+  <w:abstractNum w:abstractNumId="35" w15:restartNumberingAfterBreak="0">
     <w:nsid w:val="70460B59"/>
     <w:multiLevelType w:val="hybridMultilevel"/>
     <w:tmpl w:val="070CCA04"/>
@@ -18663,7 +19817,7 @@
       </w:rPr>
     </w:lvl>
   </w:abstractNum>
-  <w:abstractNum w:abstractNumId="33" w15:restartNumberingAfterBreak="0">
+  <w:abstractNum w:abstractNumId="36" w15:restartNumberingAfterBreak="0">
     <w:nsid w:val="76B26AAB"/>
     <w:multiLevelType w:val="hybridMultilevel"/>
     <w:tmpl w:val="04EE7918"/>
@@ -18776,7 +19930,7 @@
       </w:rPr>
     </w:lvl>
   </w:abstractNum>
-  <w:abstractNum w:abstractNumId="34" w15:restartNumberingAfterBreak="0">
+  <w:abstractNum w:abstractNumId="37" w15:restartNumberingAfterBreak="0">
     <w:nsid w:val="7BF36F25"/>
     <w:multiLevelType w:val="hybridMultilevel"/>
     <w:tmpl w:val="272AF9C2"/>
@@ -18890,109 +20044,118 @@
     </w:lvl>
   </w:abstractNum>
   <w:num w:numId="1" w16cid:durableId="787049342">
+    <w:abstractNumId w:val="6"/>
+  </w:num>
+  <w:num w:numId="2" w16cid:durableId="615214838">
+    <w:abstractNumId w:val="19"/>
+  </w:num>
+  <w:num w:numId="3" w16cid:durableId="1660958139">
     <w:abstractNumId w:val="5"/>
   </w:num>
-  <w:num w:numId="2" w16cid:durableId="615214838">
-    <w:abstractNumId w:val="17"/>
+  <w:num w:numId="4" w16cid:durableId="775902420">
+    <w:abstractNumId w:val="11"/>
   </w:num>
-  <w:num w:numId="3" w16cid:durableId="1660958139">
-    <w:abstractNumId w:val="4"/>
+  <w:num w:numId="5" w16cid:durableId="1241132537">
+    <w:abstractNumId w:val="26"/>
   </w:num>
-  <w:num w:numId="4" w16cid:durableId="775902420">
+  <w:num w:numId="6" w16cid:durableId="752317510">
+    <w:abstractNumId w:val="29"/>
+  </w:num>
+  <w:num w:numId="7" w16cid:durableId="951588871">
+    <w:abstractNumId w:val="32"/>
+  </w:num>
+  <w:num w:numId="8" w16cid:durableId="1200975953">
     <w:abstractNumId w:val="10"/>
   </w:num>
-  <w:num w:numId="5" w16cid:durableId="1241132537">
-    <w:abstractNumId w:val="24"/>
+  <w:num w:numId="9" w16cid:durableId="806553799">
+    <w:abstractNumId w:val="28"/>
   </w:num>
-  <w:num w:numId="6" w16cid:durableId="752317510">
+  <w:num w:numId="10" w16cid:durableId="931936962">
+    <w:abstractNumId w:val="25"/>
+  </w:num>
+  <w:num w:numId="11" w16cid:durableId="455150107">
+    <w:abstractNumId w:val="34"/>
+  </w:num>
+  <w:num w:numId="12" w16cid:durableId="1714619942">
+    <w:abstractNumId w:val="16"/>
+  </w:num>
+  <w:num w:numId="13" w16cid:durableId="1370033234">
     <w:abstractNumId w:val="27"/>
   </w:num>
-  <w:num w:numId="7" w16cid:durableId="951588871">
-    <w:abstractNumId w:val="29"/>
-  </w:num>
-  <w:num w:numId="8" w16cid:durableId="1200975953">
-    <w:abstractNumId w:val="9"/>
-  </w:num>
-  <w:num w:numId="9" w16cid:durableId="806553799">
-    <w:abstractNumId w:val="26"/>
-  </w:num>
-  <w:num w:numId="10" w16cid:durableId="931936962">
-    <w:abstractNumId w:val="23"/>
-  </w:num>
-  <w:num w:numId="11" w16cid:durableId="455150107">
-    <w:abstractNumId w:val="31"/>
-  </w:num>
-  <w:num w:numId="12" w16cid:durableId="1714619942">
-    <w:abstractNumId w:val="14"/>
-  </w:num>
-  <w:num w:numId="13" w16cid:durableId="1370033234">
-    <w:abstractNumId w:val="25"/>
-  </w:num>
   <w:num w:numId="14" w16cid:durableId="525488901">
-    <w:abstractNumId w:val="13"/>
+    <w:abstractNumId w:val="15"/>
   </w:num>
   <w:num w:numId="15" w16cid:durableId="249974336">
     <w:abstractNumId w:val="1"/>
   </w:num>
   <w:num w:numId="16" w16cid:durableId="312149096">
-    <w:abstractNumId w:val="12"/>
+    <w:abstractNumId w:val="14"/>
   </w:num>
   <w:num w:numId="17" w16cid:durableId="1515075912">
-    <w:abstractNumId w:val="15"/>
+    <w:abstractNumId w:val="17"/>
   </w:num>
   <w:num w:numId="18" w16cid:durableId="583883089">
-    <w:abstractNumId w:val="19"/>
+    <w:abstractNumId w:val="21"/>
   </w:num>
   <w:num w:numId="19" w16cid:durableId="1822455147">
-    <w:abstractNumId w:val="22"/>
+    <w:abstractNumId w:val="24"/>
   </w:num>
   <w:num w:numId="20" w16cid:durableId="1983388459">
     <w:abstractNumId w:val="0"/>
   </w:num>
   <w:num w:numId="21" w16cid:durableId="2065907935">
-    <w:abstractNumId w:val="32"/>
+    <w:abstractNumId w:val="35"/>
   </w:num>
   <w:num w:numId="22" w16cid:durableId="894782939">
+    <w:abstractNumId w:val="4"/>
+  </w:num>
+  <w:num w:numId="23" w16cid:durableId="107702253">
+    <w:abstractNumId w:val="18"/>
+  </w:num>
+  <w:num w:numId="24" w16cid:durableId="637029187">
+    <w:abstractNumId w:val="37"/>
+  </w:num>
+  <w:num w:numId="25" w16cid:durableId="536234325">
+    <w:abstractNumId w:val="8"/>
+  </w:num>
+  <w:num w:numId="26" w16cid:durableId="861816740">
+    <w:abstractNumId w:val="12"/>
+  </w:num>
+  <w:num w:numId="27" w16cid:durableId="1024672194">
+    <w:abstractNumId w:val="36"/>
+  </w:num>
+  <w:num w:numId="28" w16cid:durableId="507060498">
+    <w:abstractNumId w:val="31"/>
+  </w:num>
+  <w:num w:numId="29" w16cid:durableId="1787849106">
+    <w:abstractNumId w:val="9"/>
+  </w:num>
+  <w:num w:numId="30" w16cid:durableId="380516858">
+    <w:abstractNumId w:val="33"/>
+  </w:num>
+  <w:num w:numId="31" w16cid:durableId="1725251925">
     <w:abstractNumId w:val="3"/>
   </w:num>
-  <w:num w:numId="23" w16cid:durableId="107702253">
-    <w:abstractNumId w:val="16"/>
+  <w:num w:numId="32" w16cid:durableId="1663004310">
+    <w:abstractNumId w:val="20"/>
   </w:num>
-  <w:num w:numId="24" w16cid:durableId="637029187">
-    <w:abstractNumId w:val="34"/>
+  <w:num w:numId="33" w16cid:durableId="1759403709">
+    <w:abstractNumId w:val="22"/>
   </w:num>
-  <w:num w:numId="25" w16cid:durableId="536234325">
+  <w:num w:numId="34" w16cid:durableId="1201671550">
+    <w:abstractNumId w:val="23"/>
+  </w:num>
+  <w:num w:numId="35" w16cid:durableId="1320617864">
     <w:abstractNumId w:val="7"/>
   </w:num>
-  <w:num w:numId="26" w16cid:durableId="861816740">
-    <w:abstractNumId w:val="11"/>
-  </w:num>
-  <w:num w:numId="27" w16cid:durableId="1024672194">
-    <w:abstractNumId w:val="33"/>
-  </w:num>
-  <w:num w:numId="28" w16cid:durableId="507060498">
-    <w:abstractNumId w:val="28"/>
-  </w:num>
-  <w:num w:numId="29" w16cid:durableId="1787849106">
-    <w:abstractNumId w:val="8"/>
-  </w:num>
-  <w:num w:numId="30" w16cid:durableId="380516858">
+  <w:num w:numId="36" w16cid:durableId="1806001911">
     <w:abstractNumId w:val="30"/>
   </w:num>
-  <w:num w:numId="31" w16cid:durableId="1725251925">
+  <w:num w:numId="37" w16cid:durableId="2078091630">
+    <w:abstractNumId w:val="13"/>
+  </w:num>
+  <w:num w:numId="38" w16cid:durableId="1197817206">
     <w:abstractNumId w:val="2"/>
-  </w:num>
-  <w:num w:numId="32" w16cid:durableId="1663004310">
-    <w:abstractNumId w:val="18"/>
-  </w:num>
-  <w:num w:numId="33" w16cid:durableId="1759403709">
-    <w:abstractNumId w:val="20"/>
-  </w:num>
-  <w:num w:numId="34" w16cid:durableId="1201671550">
-    <w:abstractNumId w:val="21"/>
-  </w:num>
-  <w:num w:numId="35" w16cid:durableId="1320617864">
-    <w:abstractNumId w:val="6"/>
   </w:num>
 </w:numbering>
 </file>

</xml_diff>

<commit_message>
docker & kuber - kubernetes created and arcgitecture file updated
</commit_message>
<xml_diff>
--- a/Docker/2-architecture.docx
+++ b/Docker/2-architecture.docx
@@ -48,25 +48,7 @@
           <w:sz w:val="28"/>
           <w:szCs w:val="28"/>
         </w:rPr>
-        <w:t xml:space="preserve">Docker uses a Client–Server Architecture consisting of the following </w:t>
-      </w:r>
-      <w:proofErr w:type="spellStart"/>
-      <w:r>
-        <w:rPr>
-          <w:rFonts w:asciiTheme="majorBidi" w:hAnsiTheme="majorBidi" w:cstheme="majorBidi"/>
-          <w:sz w:val="28"/>
-          <w:szCs w:val="28"/>
-        </w:rPr>
-        <w:t>mainparts</w:t>
-      </w:r>
-      <w:proofErr w:type="spellEnd"/>
-      <w:r>
-        <w:rPr>
-          <w:rFonts w:asciiTheme="majorBidi" w:hAnsiTheme="majorBidi" w:cstheme="majorBidi"/>
-          <w:sz w:val="28"/>
-          <w:szCs w:val="28"/>
-        </w:rPr>
-        <w:t>:</w:t>
+        <w:t>Docker uses a Client–Server Architecture consisting of the following mainparts:</w:t>
       </w:r>
     </w:p>
     <w:p>
@@ -306,29 +288,7 @@
           <w:sz w:val="32"/>
           <w:szCs w:val="32"/>
         </w:rPr>
-        <w:t>Docker Daemon (</w:t>
-      </w:r>
-      <w:proofErr w:type="spellStart"/>
-      <w:r>
-        <w:rPr>
-          <w:rFonts w:asciiTheme="majorBidi" w:hAnsiTheme="majorBidi" w:cstheme="majorBidi"/>
-          <w:b/>
-          <w:bCs/>
-          <w:sz w:val="32"/>
-          <w:szCs w:val="32"/>
-        </w:rPr>
-        <w:t>dockerd</w:t>
-      </w:r>
-      <w:proofErr w:type="spellEnd"/>
-      <w:r>
-        <w:rPr>
-          <w:rFonts w:asciiTheme="majorBidi" w:hAnsiTheme="majorBidi" w:cstheme="majorBidi"/>
-          <w:b/>
-          <w:bCs/>
-          <w:sz w:val="32"/>
-          <w:szCs w:val="32"/>
-        </w:rPr>
-        <w:t>)</w:t>
+        <w:t>Docker Daemon (dockerd)</w:t>
       </w:r>
       <w:r>
         <w:rPr>
@@ -722,25 +682,7 @@
           <w:sz w:val="28"/>
           <w:szCs w:val="28"/>
         </w:rPr>
-        <w:t>Docker daemon (</w:t>
-      </w:r>
-      <w:proofErr w:type="spellStart"/>
-      <w:r>
-        <w:rPr>
-          <w:rFonts w:asciiTheme="majorBidi" w:hAnsiTheme="majorBidi" w:cstheme="majorBidi"/>
-          <w:sz w:val="28"/>
-          <w:szCs w:val="28"/>
-        </w:rPr>
-        <w:t>dockerd</w:t>
-      </w:r>
-      <w:proofErr w:type="spellEnd"/>
-      <w:r>
-        <w:rPr>
-          <w:rFonts w:asciiTheme="majorBidi" w:hAnsiTheme="majorBidi" w:cstheme="majorBidi"/>
-          <w:sz w:val="28"/>
-          <w:szCs w:val="28"/>
-        </w:rPr>
-        <w:t xml:space="preserve">) </w:t>
+        <w:t xml:space="preserve">Docker daemon (dockerd) </w:t>
       </w:r>
       <w:r>
         <w:rPr>
@@ -749,14 +691,6 @@
           <w:szCs w:val="28"/>
         </w:rPr>
         <w:t>-</w:t>
-      </w:r>
-      <w:r>
-        <w:rPr>
-          <w:rFonts w:asciiTheme="majorBidi" w:hAnsiTheme="majorBidi" w:cstheme="majorBidi"/>
-          <w:sz w:val="28"/>
-          <w:szCs w:val="28"/>
-        </w:rPr>
-        <w:t>++</w:t>
       </w:r>
       <w:r>
         <w:rPr>
@@ -870,22 +804,8 @@
           <w:sz w:val="28"/>
           <w:szCs w:val="28"/>
         </w:rPr>
-        <w:t>/var/run/</w:t>
-      </w:r>
-      <w:proofErr w:type="spellStart"/>
-      <w:r>
-        <w:rPr>
-          <w:rFonts w:asciiTheme="majorBidi" w:hAnsiTheme="majorBidi" w:cstheme="majorBidi"/>
-          <w:b/>
-          <w:bCs/>
-          <w:i/>
-          <w:iCs/>
-          <w:sz w:val="28"/>
-          <w:szCs w:val="28"/>
-        </w:rPr>
-        <w:t>docker.sock</w:t>
-      </w:r>
-      <w:proofErr w:type="spellEnd"/>
+        <w:t>/var/run/docker.sock</w:t>
+      </w:r>
       <w:r>
         <w:rPr>
           <w:rFonts w:asciiTheme="majorBidi" w:hAnsiTheme="majorBidi" w:cstheme="majorBidi"/>
@@ -1125,22 +1045,8 @@
           <w:sz w:val="28"/>
           <w:szCs w:val="28"/>
         </w:rPr>
-        <w:t>/var/run/</w:t>
-      </w:r>
-      <w:proofErr w:type="spellStart"/>
-      <w:r>
-        <w:rPr>
-          <w:rFonts w:asciiTheme="majorBidi" w:hAnsiTheme="majorBidi" w:cstheme="majorBidi"/>
-          <w:b/>
-          <w:bCs/>
-          <w:i/>
-          <w:iCs/>
-          <w:sz w:val="28"/>
-          <w:szCs w:val="28"/>
-        </w:rPr>
-        <w:t>docker.sock</w:t>
-      </w:r>
-      <w:proofErr w:type="spellEnd"/>
+        <w:t>/var/run/docker.sock</w:t>
+      </w:r>
       <w:r>
         <w:rPr>
           <w:rFonts w:asciiTheme="majorBidi" w:hAnsiTheme="majorBidi" w:cstheme="majorBidi"/>
@@ -1413,9 +1319,8 @@
           <w:sz w:val="28"/>
           <w:szCs w:val="28"/>
         </w:rPr>
-        <w:t xml:space="preserve">docker </w:t>
-      </w:r>
-      <w:proofErr w:type="spellStart"/>
+        <w:t>docker ps</w:t>
+      </w:r>
       <w:r>
         <w:rPr>
           <w:rFonts w:asciiTheme="majorBidi" w:hAnsiTheme="majorBidi" w:cstheme="majorBidi"/>
@@ -1426,19 +1331,6 @@
           <w:sz w:val="28"/>
           <w:szCs w:val="28"/>
         </w:rPr>
-        <w:t>ps</w:t>
-      </w:r>
-      <w:proofErr w:type="spellEnd"/>
-      <w:r>
-        <w:rPr>
-          <w:rFonts w:asciiTheme="majorBidi" w:hAnsiTheme="majorBidi" w:cstheme="majorBidi"/>
-          <w:b/>
-          <w:bCs/>
-          <w:i/>
-          <w:iCs/>
-          <w:sz w:val="28"/>
-          <w:szCs w:val="28"/>
-        </w:rPr>
         <w:t xml:space="preserve"> </w:t>
       </w:r>
       <w:r>
@@ -1481,25 +1373,7 @@
           <w:sz w:val="28"/>
           <w:szCs w:val="28"/>
         </w:rPr>
-        <w:t>CLI → sends HTTP request → to /var/run/</w:t>
-      </w:r>
-      <w:proofErr w:type="spellStart"/>
-      <w:r>
-        <w:rPr>
-          <w:rFonts w:asciiTheme="majorBidi" w:hAnsiTheme="majorBidi" w:cstheme="majorBidi"/>
-          <w:sz w:val="28"/>
-          <w:szCs w:val="28"/>
-        </w:rPr>
-        <w:t>docker.sock</w:t>
-      </w:r>
-      <w:proofErr w:type="spellEnd"/>
-      <w:r>
-        <w:rPr>
-          <w:rFonts w:asciiTheme="majorBidi" w:hAnsiTheme="majorBidi" w:cstheme="majorBidi"/>
-          <w:sz w:val="28"/>
-          <w:szCs w:val="28"/>
-        </w:rPr>
-        <w:t xml:space="preserve"> → daemon responds with JSON → CLI formats output</w:t>
+        <w:t>CLI → sends HTTP request → to /var/run/docker.sock → daemon responds with JSON → CLI formats output</w:t>
       </w:r>
     </w:p>
     <w:p>
@@ -1760,61 +1634,7 @@
                                 <w:sz w:val="28"/>
                                 <w:szCs w:val="28"/>
                               </w:rPr>
-                              <w:t xml:space="preserve">  "hosts": ["</w:t>
-                            </w:r>
-                            <w:proofErr w:type="spellStart"/>
-                            <w:r>
-                              <w:rPr>
-                                <w:rFonts w:asciiTheme="majorBidi" w:hAnsiTheme="majorBidi" w:cstheme="majorBidi"/>
-                                <w:sz w:val="28"/>
-                                <w:szCs w:val="28"/>
-                              </w:rPr>
-                              <w:t>unix</w:t>
-                            </w:r>
-                            <w:proofErr w:type="spellEnd"/>
-                            <w:r>
-                              <w:rPr>
-                                <w:rFonts w:asciiTheme="majorBidi" w:hAnsiTheme="majorBidi" w:cstheme="majorBidi"/>
-                                <w:sz w:val="28"/>
-                                <w:szCs w:val="28"/>
-                              </w:rPr>
-                              <w:t>:///var/run/</w:t>
-                            </w:r>
-                            <w:proofErr w:type="spellStart"/>
-                            <w:r>
-                              <w:rPr>
-                                <w:rFonts w:asciiTheme="majorBidi" w:hAnsiTheme="majorBidi" w:cstheme="majorBidi"/>
-                                <w:sz w:val="28"/>
-                                <w:szCs w:val="28"/>
-                              </w:rPr>
-                              <w:t>docker.sock</w:t>
-                            </w:r>
-                            <w:proofErr w:type="spellEnd"/>
-                            <w:r>
-                              <w:rPr>
-                                <w:rFonts w:asciiTheme="majorBidi" w:hAnsiTheme="majorBidi" w:cstheme="majorBidi"/>
-                                <w:sz w:val="28"/>
-                                <w:szCs w:val="28"/>
-                              </w:rPr>
-                              <w:t>", "</w:t>
-                            </w:r>
-                            <w:proofErr w:type="spellStart"/>
-                            <w:r>
-                              <w:rPr>
-                                <w:rFonts w:asciiTheme="majorBidi" w:hAnsiTheme="majorBidi" w:cstheme="majorBidi"/>
-                                <w:sz w:val="28"/>
-                                <w:szCs w:val="28"/>
-                              </w:rPr>
-                              <w:t>tcp</w:t>
-                            </w:r>
-                            <w:proofErr w:type="spellEnd"/>
-                            <w:r>
-                              <w:rPr>
-                                <w:rFonts w:asciiTheme="majorBidi" w:hAnsiTheme="majorBidi" w:cstheme="majorBidi"/>
-                                <w:sz w:val="28"/>
-                                <w:szCs w:val="28"/>
-                              </w:rPr>
-                              <w:t>://0.0.0.0:2375"]</w:t>
+                              <w:t xml:space="preserve">  "hosts": ["unix:///var/run/docker.sock", "tcp://0.0.0.0:2375"]</w:t>
                             </w:r>
                           </w:p>
                           <w:p>
@@ -2271,18 +2091,8 @@
           <w:sz w:val="28"/>
           <w:szCs w:val="28"/>
         </w:rPr>
-        <w:t xml:space="preserve">CLI sends HTTP request via Unix socket to </w:t>
-      </w:r>
-      <w:proofErr w:type="spellStart"/>
-      <w:r>
-        <w:rPr>
-          <w:rFonts w:asciiTheme="majorBidi" w:hAnsiTheme="majorBidi" w:cstheme="majorBidi"/>
-          <w:sz w:val="28"/>
-          <w:szCs w:val="28"/>
-        </w:rPr>
-        <w:t>dockerd</w:t>
-      </w:r>
-      <w:proofErr w:type="spellEnd"/>
+        <w:t>CLI sends HTTP request via Unix socket to dockerd</w:t>
+      </w:r>
     </w:p>
     <w:p>
       <w:pPr>
@@ -2299,41 +2109,13 @@
           <w:szCs w:val="28"/>
         </w:rPr>
       </w:pPr>
-      <w:proofErr w:type="spellStart"/>
-      <w:r>
-        <w:rPr>
-          <w:rFonts w:asciiTheme="majorBidi" w:hAnsiTheme="majorBidi" w:cstheme="majorBidi"/>
-          <w:sz w:val="28"/>
-          <w:szCs w:val="28"/>
-        </w:rPr>
-        <w:t>dockerd</w:t>
-      </w:r>
-      <w:proofErr w:type="spellEnd"/>
-      <w:r>
-        <w:rPr>
-          <w:rFonts w:asciiTheme="majorBidi" w:hAnsiTheme="majorBidi" w:cstheme="majorBidi"/>
-          <w:sz w:val="28"/>
-          <w:szCs w:val="28"/>
-        </w:rPr>
-        <w:t xml:space="preserve"> talks to container runtime (</w:t>
-      </w:r>
-      <w:proofErr w:type="spellStart"/>
-      <w:r>
-        <w:rPr>
-          <w:rFonts w:asciiTheme="majorBidi" w:hAnsiTheme="majorBidi" w:cstheme="majorBidi"/>
-          <w:sz w:val="28"/>
-          <w:szCs w:val="28"/>
-        </w:rPr>
-        <w:t>containerd</w:t>
-      </w:r>
-      <w:proofErr w:type="spellEnd"/>
-      <w:r>
-        <w:rPr>
-          <w:rFonts w:asciiTheme="majorBidi" w:hAnsiTheme="majorBidi" w:cstheme="majorBidi"/>
-          <w:sz w:val="28"/>
-          <w:szCs w:val="28"/>
-        </w:rPr>
-        <w:t>)</w:t>
+      <w:r>
+        <w:rPr>
+          <w:rFonts w:asciiTheme="majorBidi" w:hAnsiTheme="majorBidi" w:cstheme="majorBidi"/>
+          <w:sz w:val="28"/>
+          <w:szCs w:val="28"/>
+        </w:rPr>
+        <w:t>dockerd talks to container runtime (containerd)</w:t>
       </w:r>
     </w:p>
     <w:p>
@@ -2351,34 +2133,14 @@
           <w:szCs w:val="28"/>
         </w:rPr>
       </w:pPr>
-      <w:proofErr w:type="spellStart"/>
-      <w:r>
-        <w:rPr>
-          <w:rFonts w:asciiTheme="majorBidi" w:hAnsiTheme="majorBidi" w:cstheme="majorBidi"/>
-          <w:sz w:val="28"/>
-          <w:szCs w:val="28"/>
-        </w:rPr>
-        <w:t>containerd</w:t>
-      </w:r>
-      <w:proofErr w:type="spellEnd"/>
-      <w:r>
-        <w:rPr>
-          <w:rFonts w:asciiTheme="majorBidi" w:hAnsiTheme="majorBidi" w:cstheme="majorBidi"/>
-          <w:sz w:val="28"/>
-          <w:szCs w:val="28"/>
-        </w:rPr>
-        <w:t xml:space="preserve"> uses </w:t>
-      </w:r>
-      <w:proofErr w:type="spellStart"/>
-      <w:r>
-        <w:rPr>
-          <w:rFonts w:asciiTheme="majorBidi" w:hAnsiTheme="majorBidi" w:cstheme="majorBidi"/>
-          <w:sz w:val="28"/>
-          <w:szCs w:val="28"/>
-        </w:rPr>
-        <w:t>runc</w:t>
-      </w:r>
-      <w:proofErr w:type="spellEnd"/>
+      <w:r>
+        <w:rPr>
+          <w:rFonts w:asciiTheme="majorBidi" w:hAnsiTheme="majorBidi" w:cstheme="majorBidi"/>
+          <w:sz w:val="28"/>
+          <w:szCs w:val="28"/>
+        </w:rPr>
+        <w:t>containerd uses runc</w:t>
+      </w:r>
     </w:p>
     <w:p>
       <w:pPr>
@@ -2395,41 +2157,13 @@
           <w:szCs w:val="28"/>
         </w:rPr>
       </w:pPr>
-      <w:proofErr w:type="spellStart"/>
-      <w:r>
-        <w:rPr>
-          <w:rFonts w:asciiTheme="majorBidi" w:hAnsiTheme="majorBidi" w:cstheme="majorBidi"/>
-          <w:sz w:val="28"/>
-          <w:szCs w:val="28"/>
-        </w:rPr>
-        <w:t>runc</w:t>
-      </w:r>
-      <w:proofErr w:type="spellEnd"/>
-      <w:r>
-        <w:rPr>
-          <w:rFonts w:asciiTheme="majorBidi" w:hAnsiTheme="majorBidi" w:cstheme="majorBidi"/>
-          <w:sz w:val="28"/>
-          <w:szCs w:val="28"/>
-        </w:rPr>
-        <w:t xml:space="preserve"> interacts with kernel (namespaces, </w:t>
-      </w:r>
-      <w:proofErr w:type="spellStart"/>
-      <w:r>
-        <w:rPr>
-          <w:rFonts w:asciiTheme="majorBidi" w:hAnsiTheme="majorBidi" w:cstheme="majorBidi"/>
-          <w:sz w:val="28"/>
-          <w:szCs w:val="28"/>
-        </w:rPr>
-        <w:t>cgroups</w:t>
-      </w:r>
-      <w:proofErr w:type="spellEnd"/>
-      <w:r>
-        <w:rPr>
-          <w:rFonts w:asciiTheme="majorBidi" w:hAnsiTheme="majorBidi" w:cstheme="majorBidi"/>
-          <w:sz w:val="28"/>
-          <w:szCs w:val="28"/>
-        </w:rPr>
-        <w:t>)</w:t>
+      <w:r>
+        <w:rPr>
+          <w:rFonts w:asciiTheme="majorBidi" w:hAnsiTheme="majorBidi" w:cstheme="majorBidi"/>
+          <w:sz w:val="28"/>
+          <w:szCs w:val="28"/>
+        </w:rPr>
+        <w:t>runc interacts with kernel (namespaces, cgroups)</w:t>
       </w:r>
     </w:p>
     <w:p>
@@ -2487,25 +2221,7 @@
           <w:sz w:val="28"/>
           <w:szCs w:val="28"/>
         </w:rPr>
-        <w:t xml:space="preserve">The API is the HTTP interface exposed by </w:t>
-      </w:r>
-      <w:proofErr w:type="spellStart"/>
-      <w:r>
-        <w:rPr>
-          <w:rFonts w:asciiTheme="majorBidi" w:hAnsiTheme="majorBidi" w:cstheme="majorBidi"/>
-          <w:sz w:val="28"/>
-          <w:szCs w:val="28"/>
-        </w:rPr>
-        <w:t>dockerd</w:t>
-      </w:r>
-      <w:proofErr w:type="spellEnd"/>
-      <w:r>
-        <w:rPr>
-          <w:rFonts w:asciiTheme="majorBidi" w:hAnsiTheme="majorBidi" w:cstheme="majorBidi"/>
-          <w:sz w:val="28"/>
-          <w:szCs w:val="28"/>
-        </w:rPr>
-        <w:t>.</w:t>
+        <w:t>The API is the HTTP interface exposed by dockerd.</w:t>
       </w:r>
       <w:r>
         <w:rPr>
@@ -2619,63 +2335,7 @@
           <w:szCs w:val="28"/>
           <w:lang w:bidi="fa-IR"/>
         </w:rPr>
-        <w:t>curl --</w:t>
-      </w:r>
-      <w:proofErr w:type="spellStart"/>
-      <w:r>
-        <w:rPr>
-          <w:rFonts w:asciiTheme="majorBidi" w:hAnsiTheme="majorBidi" w:cstheme="majorBidi"/>
-          <w:b/>
-          <w:bCs/>
-          <w:i/>
-          <w:iCs/>
-          <w:sz w:val="28"/>
-          <w:szCs w:val="28"/>
-          <w:lang w:bidi="fa-IR"/>
-        </w:rPr>
-        <w:t>unix</w:t>
-      </w:r>
-      <w:proofErr w:type="spellEnd"/>
-      <w:r>
-        <w:rPr>
-          <w:rFonts w:asciiTheme="majorBidi" w:hAnsiTheme="majorBidi" w:cstheme="majorBidi"/>
-          <w:b/>
-          <w:bCs/>
-          <w:i/>
-          <w:iCs/>
-          <w:sz w:val="28"/>
-          <w:szCs w:val="28"/>
-          <w:lang w:bidi="fa-IR"/>
-        </w:rPr>
-        <w:t>-socket /var/run/</w:t>
-      </w:r>
-      <w:proofErr w:type="spellStart"/>
-      <w:r>
-        <w:rPr>
-          <w:rFonts w:asciiTheme="majorBidi" w:hAnsiTheme="majorBidi" w:cstheme="majorBidi"/>
-          <w:b/>
-          <w:bCs/>
-          <w:i/>
-          <w:iCs/>
-          <w:sz w:val="28"/>
-          <w:szCs w:val="28"/>
-          <w:lang w:bidi="fa-IR"/>
-        </w:rPr>
-        <w:t>docker.sock</w:t>
-      </w:r>
-      <w:proofErr w:type="spellEnd"/>
-      <w:r>
-        <w:rPr>
-          <w:rFonts w:asciiTheme="majorBidi" w:hAnsiTheme="majorBidi" w:cstheme="majorBidi"/>
-          <w:b/>
-          <w:bCs/>
-          <w:i/>
-          <w:iCs/>
-          <w:sz w:val="28"/>
-          <w:szCs w:val="28"/>
-          <w:lang w:bidi="fa-IR"/>
-        </w:rPr>
-        <w:t xml:space="preserve"> </w:t>
+        <w:t xml:space="preserve">curl --unix-socket /var/run/docker.sock </w:t>
       </w:r>
       <w:hyperlink r:id="rId5" w:history="1">
         <w:r>
@@ -3088,22 +2748,8 @@
                                 <w:sz w:val="28"/>
                                 <w:szCs w:val="28"/>
                               </w:rPr>
-                              <w:t>/var/run/</w:t>
+                              <w:t>/var/run/docker.sock</w:t>
                             </w:r>
-                            <w:proofErr w:type="spellStart"/>
-                            <w:r>
-                              <w:rPr>
-                                <w:rFonts w:asciiTheme="majorBidi" w:hAnsiTheme="majorBidi" w:cstheme="majorBidi"/>
-                                <w:b/>
-                                <w:bCs/>
-                                <w:i/>
-                                <w:iCs/>
-                                <w:sz w:val="28"/>
-                                <w:szCs w:val="28"/>
-                              </w:rPr>
-                              <w:t>docker.sock</w:t>
-                            </w:r>
-                            <w:proofErr w:type="spellEnd"/>
                           </w:p>
                           <w:p>
                             <w:pPr>
@@ -3708,23 +3354,8 @@
           <w:szCs w:val="28"/>
           <w:lang w:bidi="fa-IR"/>
         </w:rPr>
-        <w:t>/var/run/</w:t>
-      </w:r>
-      <w:proofErr w:type="spellStart"/>
-      <w:r>
-        <w:rPr>
-          <w:rFonts w:asciiTheme="majorBidi" w:hAnsiTheme="majorBidi" w:cstheme="majorBidi"/>
-          <w:b/>
-          <w:bCs/>
-          <w:i/>
-          <w:iCs/>
-          <w:sz w:val="28"/>
-          <w:szCs w:val="28"/>
-          <w:lang w:bidi="fa-IR"/>
-        </w:rPr>
-        <w:t>docker.sock</w:t>
-      </w:r>
-      <w:proofErr w:type="spellEnd"/>
+        <w:t>/var/run/docker.sock</w:t>
+      </w:r>
       <w:r>
         <w:rPr>
           <w:rFonts w:asciiTheme="majorBidi" w:hAnsiTheme="majorBidi" w:cstheme="majorBidi"/>
@@ -4007,33 +3638,7 @@
                                 <w:sz w:val="28"/>
                                 <w:szCs w:val="28"/>
                               </w:rPr>
-                              <w:t>/var/run/</w:t>
-                            </w:r>
-                            <w:proofErr w:type="spellStart"/>
-                            <w:r>
-                              <w:rPr>
-                                <w:rFonts w:asciiTheme="majorBidi" w:hAnsiTheme="majorBidi" w:cstheme="majorBidi"/>
-                                <w:b/>
-                                <w:bCs/>
-                                <w:i/>
-                                <w:iCs/>
-                                <w:sz w:val="28"/>
-                                <w:szCs w:val="28"/>
-                              </w:rPr>
-                              <w:t>docker.sock</w:t>
-                            </w:r>
-                            <w:proofErr w:type="spellEnd"/>
-                            <w:r>
-                              <w:rPr>
-                                <w:rFonts w:asciiTheme="majorBidi" w:hAnsiTheme="majorBidi" w:cstheme="majorBidi"/>
-                                <w:b/>
-                                <w:bCs/>
-                                <w:i/>
-                                <w:iCs/>
-                                <w:sz w:val="28"/>
-                                <w:szCs w:val="28"/>
-                              </w:rPr>
-                              <w:t xml:space="preserve"> </w:t>
+                              <w:t xml:space="preserve">/var/run/docker.sock </w:t>
                             </w:r>
                             <w:r>
                               <w:rPr>
@@ -4627,18 +4232,8 @@
                                 <w:sz w:val="28"/>
                                 <w:szCs w:val="28"/>
                               </w:rPr>
-                              <w:t xml:space="preserve"> → </w:t>
+                              <w:t xml:space="preserve"> → dockerd</w:t>
                             </w:r>
-                            <w:proofErr w:type="spellStart"/>
-                            <w:r>
-                              <w:rPr>
-                                <w:rFonts w:asciiTheme="majorBidi" w:hAnsiTheme="majorBidi" w:cstheme="majorBidi"/>
-                                <w:sz w:val="28"/>
-                                <w:szCs w:val="28"/>
-                              </w:rPr>
-                              <w:t>dockerd</w:t>
-                            </w:r>
-                            <w:proofErr w:type="spellEnd"/>
                           </w:p>
                           <w:p>
                             <w:pPr>
@@ -4693,18 +4288,8 @@
                                 <w:sz w:val="28"/>
                                 <w:szCs w:val="28"/>
                               </w:rPr>
-                              <w:t xml:space="preserve"> → </w:t>
+                              <w:t xml:space="preserve"> → dockerd</w:t>
                             </w:r>
-                            <w:proofErr w:type="spellStart"/>
-                            <w:r>
-                              <w:rPr>
-                                <w:rFonts w:asciiTheme="majorBidi" w:hAnsiTheme="majorBidi" w:cstheme="majorBidi"/>
-                                <w:sz w:val="28"/>
-                                <w:szCs w:val="28"/>
-                              </w:rPr>
-                              <w:t>dockerd</w:t>
-                            </w:r>
-                            <w:proofErr w:type="spellEnd"/>
                           </w:p>
                           <w:p>
                             <w:pPr>
@@ -6347,22 +5932,8 @@
                                 <w:sz w:val="28"/>
                                 <w:szCs w:val="28"/>
                               </w:rPr>
-                              <w:t>/var/run/</w:t>
+                              <w:t>/var/run/docker.sock</w:t>
                             </w:r>
-                            <w:proofErr w:type="spellStart"/>
-                            <w:r>
-                              <w:rPr>
-                                <w:rFonts w:asciiTheme="majorBidi" w:hAnsiTheme="majorBidi" w:cstheme="majorBidi"/>
-                                <w:b/>
-                                <w:bCs/>
-                                <w:i/>
-                                <w:iCs/>
-                                <w:sz w:val="28"/>
-                                <w:szCs w:val="28"/>
-                              </w:rPr>
-                              <w:t>docker.sock</w:t>
-                            </w:r>
-                            <w:proofErr w:type="spellEnd"/>
                             <w:r>
                               <w:rPr>
                                 <w:rFonts w:asciiTheme="majorBidi" w:hAnsiTheme="majorBidi" w:cstheme="majorBidi"/>
@@ -6563,19 +6134,8 @@
                                       <w:sz w:val="28"/>
                                       <w:szCs w:val="28"/>
                                     </w:rPr>
-                                    <w:t>/var/run/</w:t>
+                                    <w:t>/var/run/docker.sock</w:t>
                                   </w:r>
-                                  <w:proofErr w:type="spellStart"/>
-                                  <w:r>
-                                    <w:rPr>
-                                      <w:rStyle w:val="HTMLCode"/>
-                                      <w:rFonts w:asciiTheme="majorBidi" w:eastAsiaTheme="minorHAnsi" w:hAnsiTheme="majorBidi" w:cstheme="majorBidi"/>
-                                      <w:sz w:val="28"/>
-                                      <w:szCs w:val="28"/>
-                                    </w:rPr>
-                                    <w:t>docker.sock</w:t>
-                                  </w:r>
-                                  <w:proofErr w:type="spellEnd"/>
                                 </w:p>
                               </w:tc>
                             </w:tr>
@@ -6730,19 +6290,8 @@
                                       <w:sz w:val="28"/>
                                       <w:szCs w:val="28"/>
                                     </w:rPr>
-                                    <w:t>/var/run/</w:t>
+                                    <w:t>/var/run/docker.sock</w:t>
                                   </w:r>
-                                  <w:proofErr w:type="spellStart"/>
-                                  <w:r>
-                                    <w:rPr>
-                                      <w:rStyle w:val="HTMLCode"/>
-                                      <w:rFonts w:asciiTheme="majorBidi" w:eastAsiaTheme="minorHAnsi" w:hAnsiTheme="majorBidi" w:cstheme="majorBidi"/>
-                                      <w:sz w:val="28"/>
-                                      <w:szCs w:val="28"/>
-                                    </w:rPr>
-                                    <w:t>docker.sock</w:t>
-                                  </w:r>
-                                  <w:proofErr w:type="spellEnd"/>
                                 </w:p>
                               </w:tc>
                             </w:tr>
@@ -7209,22 +6758,8 @@
                           <w:sz w:val="28"/>
                           <w:szCs w:val="28"/>
                         </w:rPr>
-                        <w:t>/var/run/</w:t>
-                      </w:r>
-                      <w:proofErr w:type="spellStart"/>
-                      <w:r>
-                        <w:rPr>
-                          <w:rFonts w:asciiTheme="majorBidi" w:hAnsiTheme="majorBidi" w:cstheme="majorBidi"/>
-                          <w:b/>
-                          <w:bCs/>
-                          <w:i/>
-                          <w:iCs/>
-                          <w:sz w:val="28"/>
-                          <w:szCs w:val="28"/>
-                        </w:rPr>
-                        <w:t>docker.sock</w:t>
-                      </w:r>
-                      <w:proofErr w:type="spellEnd"/>
+                        <w:t>/var/run/docker.sock</w:t>
+                      </w:r>
                       <w:r>
                         <w:rPr>
                           <w:rFonts w:asciiTheme="majorBidi" w:hAnsiTheme="majorBidi" w:cstheme="majorBidi"/>
@@ -7425,19 +6960,8 @@
                                 <w:sz w:val="28"/>
                                 <w:szCs w:val="28"/>
                               </w:rPr>
-                              <w:t>/var/run/</w:t>
+                              <w:t>/var/run/docker.sock</w:t>
                             </w:r>
-                            <w:proofErr w:type="spellStart"/>
-                            <w:r>
-                              <w:rPr>
-                                <w:rStyle w:val="HTMLCode"/>
-                                <w:rFonts w:asciiTheme="majorBidi" w:eastAsiaTheme="minorHAnsi" w:hAnsiTheme="majorBidi" w:cstheme="majorBidi"/>
-                                <w:sz w:val="28"/>
-                                <w:szCs w:val="28"/>
-                              </w:rPr>
-                              <w:t>docker.sock</w:t>
-                            </w:r>
-                            <w:proofErr w:type="spellEnd"/>
                           </w:p>
                         </w:tc>
                       </w:tr>
@@ -7592,19 +7116,8 @@
                                 <w:sz w:val="28"/>
                                 <w:szCs w:val="28"/>
                               </w:rPr>
-                              <w:t>/var/run/</w:t>
+                              <w:t>/var/run/docker.sock</w:t>
                             </w:r>
-                            <w:proofErr w:type="spellStart"/>
-                            <w:r>
-                              <w:rPr>
-                                <w:rStyle w:val="HTMLCode"/>
-                                <w:rFonts w:asciiTheme="majorBidi" w:eastAsiaTheme="minorHAnsi" w:hAnsiTheme="majorBidi" w:cstheme="majorBidi"/>
-                                <w:sz w:val="28"/>
-                                <w:szCs w:val="28"/>
-                              </w:rPr>
-                              <w:t>docker.sock</w:t>
-                            </w:r>
-                            <w:proofErr w:type="spellEnd"/>
                           </w:p>
                         </w:tc>
                       </w:tr>
@@ -8479,7 +7992,6 @@
                                 <w:szCs w:val="28"/>
                               </w:rPr>
                             </w:pPr>
-                            <w:proofErr w:type="spellStart"/>
                             <w:r>
                               <w:rPr>
                                 <w:rFonts w:asciiTheme="majorBidi" w:hAnsiTheme="majorBidi" w:cstheme="majorBidi"/>
@@ -8488,7 +8000,6 @@
                               </w:rPr>
                               <w:t>gRPC</w:t>
                             </w:r>
-                            <w:proofErr w:type="spellEnd"/>
                           </w:p>
                           <w:p>
                             <w:pPr>
@@ -8574,7 +8085,6 @@
                                 <w:szCs w:val="28"/>
                               </w:rPr>
                             </w:pPr>
-                            <w:proofErr w:type="spellStart"/>
                             <w:r>
                               <w:rPr>
                                 <w:rFonts w:asciiTheme="majorBidi" w:hAnsiTheme="majorBidi" w:cstheme="majorBidi"/>
@@ -8585,20 +8095,7 @@
                                 <w:sz w:val="28"/>
                                 <w:szCs w:val="28"/>
                               </w:rPr>
-                              <w:t>dockerd</w:t>
-                            </w:r>
-                            <w:proofErr w:type="spellEnd"/>
-                            <w:r>
-                              <w:rPr>
-                                <w:rFonts w:asciiTheme="majorBidi" w:hAnsiTheme="majorBidi" w:cstheme="majorBidi"/>
-                                <w:b/>
-                                <w:bCs/>
-                                <w:i/>
-                                <w:iCs/>
-                                <w:sz w:val="28"/>
-                                <w:szCs w:val="28"/>
-                              </w:rPr>
-                              <w:t xml:space="preserve"> -H unix:///var/run/docker.sock -H tcp://127.0.0.1:2375</w:t>
+                              <w:t>dockerd -H unix:///var/run/docker.sock -H tcp://127.0.0.1:2375</w:t>
                             </w:r>
                           </w:p>
                           <w:p>
@@ -8640,10 +8137,12 @@
                                 <w:sz w:val="28"/>
                                 <w:szCs w:val="28"/>
                               </w:rPr>
-                              <w:t xml:space="preserve">docker -H unix:///var/run/docker.sock </w:t>
+                              <w:t>docker -H unix:///var/run/docker.sock ps</w:t>
                             </w:r>
-                            <w:proofErr w:type="spellStart"/>
-                            <w:r>
+                          </w:p>
+                          <w:p>
+                            <w:pPr>
+                              <w:jc w:val="both"/>
                               <w:rPr>
                                 <w:rFonts w:asciiTheme="majorBidi" w:hAnsiTheme="majorBidi" w:cstheme="majorBidi"/>
                                 <w:b/>
@@ -8653,13 +8152,8 @@
                                 <w:sz w:val="28"/>
                                 <w:szCs w:val="28"/>
                               </w:rPr>
-                              <w:t>ps</w:t>
-                            </w:r>
-                            <w:proofErr w:type="spellEnd"/>
-                          </w:p>
-                          <w:p>
-                            <w:pPr>
-                              <w:jc w:val="both"/>
+                            </w:pPr>
+                            <w:r>
                               <w:rPr>
                                 <w:rFonts w:asciiTheme="majorBidi" w:hAnsiTheme="majorBidi" w:cstheme="majorBidi"/>
                                 <w:b/>
@@ -8669,33 +8163,8 @@
                                 <w:sz w:val="28"/>
                                 <w:szCs w:val="28"/>
                               </w:rPr>
-                            </w:pPr>
-                            <w:r>
-                              <w:rPr>
-                                <w:rFonts w:asciiTheme="majorBidi" w:hAnsiTheme="majorBidi" w:cstheme="majorBidi"/>
-                                <w:b/>
-                                <w:bCs/>
-                                <w:i/>
-                                <w:iCs/>
-                                <w:sz w:val="28"/>
-                                <w:szCs w:val="28"/>
-                              </w:rPr>
-                              <w:t xml:space="preserve">docker -H tcp://127.0.0.1:2375 </w:t>
+                              <w:t>docker -H tcp://127.0.0.1:2375 ps</w:t>
                             </w:r>
-                            <w:proofErr w:type="spellStart"/>
-                            <w:r>
-                              <w:rPr>
-                                <w:rFonts w:asciiTheme="majorBidi" w:hAnsiTheme="majorBidi" w:cstheme="majorBidi"/>
-                                <w:b/>
-                                <w:bCs/>
-                                <w:i/>
-                                <w:iCs/>
-                                <w:sz w:val="28"/>
-                                <w:szCs w:val="28"/>
-                              </w:rPr>
-                              <w:t>ps</w:t>
-                            </w:r>
-                            <w:proofErr w:type="spellEnd"/>
                           </w:p>
                           <w:p>
                             <w:pPr>
@@ -10215,567 +9684,67 @@
           <w:szCs w:val="28"/>
           <w:lang w:bidi="fa-IR"/>
         </w:rPr>
-        <w:t>In the early days of Docker, the Docker daemon (</w:t>
-      </w:r>
-      <w:proofErr w:type="spellStart"/>
-      <w:r>
-        <w:rPr>
-          <w:rFonts w:asciiTheme="majorBidi" w:hAnsiTheme="majorBidi" w:cstheme="majorBidi"/>
-          <w:sz w:val="28"/>
-          <w:szCs w:val="28"/>
-          <w:lang w:bidi="fa-IR"/>
-        </w:rPr>
-        <w:t>dockerd</w:t>
-      </w:r>
-      <w:proofErr w:type="spellEnd"/>
-      <w:r>
-        <w:rPr>
-          <w:rFonts w:asciiTheme="majorBidi" w:hAnsiTheme="majorBidi" w:cstheme="majorBidi"/>
-          <w:sz w:val="28"/>
-          <w:szCs w:val="28"/>
-          <w:lang w:bidi="fa-IR"/>
-        </w:rPr>
-        <w:t xml:space="preserve">) was a large monolithic program that relied on LXC (Linux Containers) to actually create containers. LXC was responsible for interacting with kernel features like namespaces and </w:t>
-      </w:r>
-      <w:proofErr w:type="spellStart"/>
-      <w:r>
-        <w:rPr>
-          <w:rFonts w:asciiTheme="majorBidi" w:hAnsiTheme="majorBidi" w:cstheme="majorBidi"/>
-          <w:sz w:val="28"/>
-          <w:szCs w:val="28"/>
-          <w:lang w:bidi="fa-IR"/>
-        </w:rPr>
-        <w:t>cgroups</w:t>
-      </w:r>
-      <w:proofErr w:type="spellEnd"/>
-      <w:r>
-        <w:rPr>
-          <w:rFonts w:asciiTheme="majorBidi" w:hAnsiTheme="majorBidi" w:cstheme="majorBidi"/>
-          <w:sz w:val="28"/>
-          <w:szCs w:val="28"/>
-          <w:lang w:bidi="fa-IR"/>
-        </w:rPr>
-        <w:t xml:space="preserve">, because Docker itself did not directly manage those low-level kernel primitives. This created two problems. First, LXC was a general Linux project, not designed specifically for Docker, so Docker was dependent on external design decisions. Second, LXC was tightly coupled to Linux, which made it difficult for Docker to evolve toward supporting other platforms like Windows. To solve this, Docker developers created their own library called </w:t>
-      </w:r>
-      <w:proofErr w:type="spellStart"/>
-      <w:r>
-        <w:rPr>
-          <w:rFonts w:asciiTheme="majorBidi" w:hAnsiTheme="majorBidi" w:cstheme="majorBidi"/>
-          <w:sz w:val="28"/>
-          <w:szCs w:val="28"/>
-          <w:lang w:bidi="fa-IR"/>
-        </w:rPr>
-        <w:t>libcontainer</w:t>
-      </w:r>
-      <w:proofErr w:type="spellEnd"/>
-      <w:r>
-        <w:rPr>
-          <w:rFonts w:asciiTheme="majorBidi" w:hAnsiTheme="majorBidi" w:cstheme="majorBidi"/>
-          <w:sz w:val="28"/>
-          <w:szCs w:val="28"/>
-          <w:lang w:bidi="fa-IR"/>
-        </w:rPr>
-        <w:t xml:space="preserve">, which directly interacted with the Linux kernel to configure namespaces, </w:t>
-      </w:r>
-      <w:proofErr w:type="spellStart"/>
-      <w:r>
-        <w:rPr>
-          <w:rFonts w:asciiTheme="majorBidi" w:hAnsiTheme="majorBidi" w:cstheme="majorBidi"/>
-          <w:sz w:val="28"/>
-          <w:szCs w:val="28"/>
-          <w:lang w:bidi="fa-IR"/>
-        </w:rPr>
-        <w:t>cgroups</w:t>
-      </w:r>
-      <w:proofErr w:type="spellEnd"/>
-      <w:r>
-        <w:rPr>
-          <w:rFonts w:asciiTheme="majorBidi" w:hAnsiTheme="majorBidi" w:cstheme="majorBidi"/>
-          <w:sz w:val="28"/>
-          <w:szCs w:val="28"/>
-          <w:lang w:bidi="fa-IR"/>
-        </w:rPr>
-        <w:t xml:space="preserve">, mounts, and other isolation features. This removed Docker’s dependency on LXC and gave Docker full control over container creation. Later, </w:t>
-      </w:r>
-      <w:proofErr w:type="spellStart"/>
-      <w:r>
-        <w:rPr>
-          <w:rFonts w:asciiTheme="majorBidi" w:hAnsiTheme="majorBidi" w:cstheme="majorBidi"/>
-          <w:sz w:val="28"/>
-          <w:szCs w:val="28"/>
-          <w:lang w:bidi="fa-IR"/>
-        </w:rPr>
-        <w:t>libcontainer</w:t>
-      </w:r>
-      <w:proofErr w:type="spellEnd"/>
-      <w:r>
-        <w:rPr>
-          <w:rFonts w:asciiTheme="majorBidi" w:hAnsiTheme="majorBidi" w:cstheme="majorBidi"/>
-          <w:sz w:val="28"/>
-          <w:szCs w:val="28"/>
-          <w:lang w:bidi="fa-IR"/>
-        </w:rPr>
-        <w:t xml:space="preserve"> was extracted and standardized as </w:t>
-      </w:r>
-      <w:proofErr w:type="spellStart"/>
-      <w:r>
-        <w:rPr>
-          <w:rFonts w:asciiTheme="majorBidi" w:hAnsiTheme="majorBidi" w:cstheme="majorBidi"/>
-          <w:sz w:val="28"/>
-          <w:szCs w:val="28"/>
-          <w:lang w:bidi="fa-IR"/>
-        </w:rPr>
-        <w:t>runC</w:t>
-      </w:r>
-      <w:proofErr w:type="spellEnd"/>
-      <w:r>
-        <w:rPr>
-          <w:rFonts w:asciiTheme="majorBidi" w:hAnsiTheme="majorBidi" w:cstheme="majorBidi"/>
-          <w:sz w:val="28"/>
-          <w:szCs w:val="28"/>
-          <w:lang w:bidi="fa-IR"/>
-        </w:rPr>
-        <w:t>, which became a reference implementation of the OCI (Open Container Initiative) runtime specification.</w:t>
-      </w:r>
-    </w:p>
-    <w:p>
-      <w:pPr>
-        <w:jc w:val="both"/>
-        <w:rPr>
-          <w:rFonts w:asciiTheme="majorBidi" w:hAnsiTheme="majorBidi" w:cstheme="majorBidi"/>
-          <w:sz w:val="28"/>
-          <w:szCs w:val="28"/>
-          <w:lang w:bidi="fa-IR"/>
-        </w:rPr>
-      </w:pPr>
-      <w:r>
-        <w:rPr>
-          <w:rFonts w:asciiTheme="majorBidi" w:hAnsiTheme="majorBidi" w:cstheme="majorBidi"/>
-          <w:sz w:val="28"/>
-          <w:szCs w:val="28"/>
-          <w:lang w:bidi="fa-IR"/>
-        </w:rPr>
-        <w:t>As Docker evolved further, its architecture was refactored from a monolithic daemon into a more modular system. Today, when you run a command like docker run, the Docker CLI sends the request to the Docker daemon (</w:t>
-      </w:r>
-      <w:proofErr w:type="spellStart"/>
-      <w:r>
-        <w:rPr>
-          <w:rFonts w:asciiTheme="majorBidi" w:hAnsiTheme="majorBidi" w:cstheme="majorBidi"/>
-          <w:sz w:val="28"/>
-          <w:szCs w:val="28"/>
-          <w:lang w:bidi="fa-IR"/>
-        </w:rPr>
-        <w:t>dockerd</w:t>
-      </w:r>
-      <w:proofErr w:type="spellEnd"/>
-      <w:r>
-        <w:rPr>
-          <w:rFonts w:asciiTheme="majorBidi" w:hAnsiTheme="majorBidi" w:cstheme="majorBidi"/>
-          <w:sz w:val="28"/>
-          <w:szCs w:val="28"/>
-          <w:lang w:bidi="fa-IR"/>
-        </w:rPr>
-        <w:t xml:space="preserve">) through a Unix socket or TCP connection. The Docker daemon does not create containers directly anymore. Instead, it delegates container lifecycle management to </w:t>
-      </w:r>
-      <w:proofErr w:type="spellStart"/>
-      <w:r>
-        <w:rPr>
-          <w:rFonts w:asciiTheme="majorBidi" w:hAnsiTheme="majorBidi" w:cstheme="majorBidi"/>
-          <w:sz w:val="28"/>
-          <w:szCs w:val="28"/>
-          <w:lang w:bidi="fa-IR"/>
-        </w:rPr>
-        <w:t>containerd</w:t>
-      </w:r>
-      <w:proofErr w:type="spellEnd"/>
-      <w:r>
-        <w:rPr>
-          <w:rFonts w:asciiTheme="majorBidi" w:hAnsiTheme="majorBidi" w:cstheme="majorBidi"/>
-          <w:sz w:val="28"/>
-          <w:szCs w:val="28"/>
-          <w:lang w:bidi="fa-IR"/>
-        </w:rPr>
-        <w:t xml:space="preserve">, which is a specialized container manager responsible for tasks like pulling images, managing container state, and supervising execution. However, </w:t>
-      </w:r>
-      <w:proofErr w:type="spellStart"/>
-      <w:r>
-        <w:rPr>
-          <w:rFonts w:asciiTheme="majorBidi" w:hAnsiTheme="majorBidi" w:cstheme="majorBidi"/>
-          <w:sz w:val="28"/>
-          <w:szCs w:val="28"/>
-          <w:lang w:bidi="fa-IR"/>
-        </w:rPr>
-        <w:t>containerd</w:t>
-      </w:r>
-      <w:proofErr w:type="spellEnd"/>
-      <w:r>
-        <w:rPr>
-          <w:rFonts w:asciiTheme="majorBidi" w:hAnsiTheme="majorBidi" w:cstheme="majorBidi"/>
-          <w:sz w:val="28"/>
-          <w:szCs w:val="28"/>
-          <w:lang w:bidi="fa-IR"/>
-        </w:rPr>
-        <w:t xml:space="preserve"> itself still does not directly create containers at the kernel level. For that, it uses a low-level runtime called </w:t>
-      </w:r>
-      <w:proofErr w:type="spellStart"/>
-      <w:r>
-        <w:rPr>
-          <w:rFonts w:asciiTheme="majorBidi" w:hAnsiTheme="majorBidi" w:cstheme="majorBidi"/>
-          <w:sz w:val="28"/>
-          <w:szCs w:val="28"/>
-          <w:lang w:bidi="fa-IR"/>
-        </w:rPr>
-        <w:t>runC</w:t>
-      </w:r>
-      <w:proofErr w:type="spellEnd"/>
-      <w:r>
-        <w:rPr>
-          <w:rFonts w:asciiTheme="majorBidi" w:hAnsiTheme="majorBidi" w:cstheme="majorBidi"/>
-          <w:sz w:val="28"/>
-          <w:szCs w:val="28"/>
-          <w:lang w:bidi="fa-IR"/>
-        </w:rPr>
-        <w:t xml:space="preserve">. The </w:t>
-      </w:r>
-      <w:proofErr w:type="spellStart"/>
-      <w:r>
-        <w:rPr>
-          <w:rFonts w:asciiTheme="majorBidi" w:hAnsiTheme="majorBidi" w:cstheme="majorBidi"/>
-          <w:sz w:val="28"/>
-          <w:szCs w:val="28"/>
-          <w:lang w:bidi="fa-IR"/>
-        </w:rPr>
-        <w:t>runC</w:t>
-      </w:r>
-      <w:proofErr w:type="spellEnd"/>
-      <w:r>
-        <w:rPr>
-          <w:rFonts w:asciiTheme="majorBidi" w:hAnsiTheme="majorBidi" w:cstheme="majorBidi"/>
-          <w:sz w:val="28"/>
-          <w:szCs w:val="28"/>
-          <w:lang w:bidi="fa-IR"/>
-        </w:rPr>
-        <w:t xml:space="preserve"> runtime is responsible for the actual creation of the container by configuring namespaces, </w:t>
-      </w:r>
-      <w:proofErr w:type="spellStart"/>
-      <w:r>
-        <w:rPr>
-          <w:rFonts w:asciiTheme="majorBidi" w:hAnsiTheme="majorBidi" w:cstheme="majorBidi"/>
-          <w:sz w:val="28"/>
-          <w:szCs w:val="28"/>
-          <w:lang w:bidi="fa-IR"/>
-        </w:rPr>
-        <w:t>cgroups</w:t>
-      </w:r>
-      <w:proofErr w:type="spellEnd"/>
-      <w:r>
-        <w:rPr>
-          <w:rFonts w:asciiTheme="majorBidi" w:hAnsiTheme="majorBidi" w:cstheme="majorBidi"/>
-          <w:sz w:val="28"/>
-          <w:szCs w:val="28"/>
-          <w:lang w:bidi="fa-IR"/>
-        </w:rPr>
-        <w:t>, filesystem mounts, and then starting the container process.</w:t>
-      </w:r>
-    </w:p>
-    <w:p>
-      <w:pPr>
-        <w:jc w:val="both"/>
-        <w:rPr>
-          <w:rFonts w:asciiTheme="majorBidi" w:hAnsiTheme="majorBidi" w:cstheme="majorBidi"/>
-          <w:sz w:val="28"/>
-          <w:szCs w:val="28"/>
-          <w:lang w:bidi="fa-IR"/>
-        </w:rPr>
-      </w:pPr>
-      <w:r>
-        <w:rPr>
-          <w:rFonts w:asciiTheme="majorBidi" w:hAnsiTheme="majorBidi" w:cstheme="majorBidi"/>
-          <w:sz w:val="28"/>
-          <w:szCs w:val="28"/>
-          <w:lang w:bidi="fa-IR"/>
-        </w:rPr>
-        <w:t xml:space="preserve">When </w:t>
-      </w:r>
-      <w:proofErr w:type="spellStart"/>
-      <w:r>
-        <w:rPr>
-          <w:rFonts w:asciiTheme="majorBidi" w:hAnsiTheme="majorBidi" w:cstheme="majorBidi"/>
-          <w:sz w:val="28"/>
-          <w:szCs w:val="28"/>
-          <w:lang w:bidi="fa-IR"/>
-        </w:rPr>
-        <w:t>runC</w:t>
-      </w:r>
-      <w:proofErr w:type="spellEnd"/>
-      <w:r>
-        <w:rPr>
-          <w:rFonts w:asciiTheme="majorBidi" w:hAnsiTheme="majorBidi" w:cstheme="majorBidi"/>
-          <w:sz w:val="28"/>
-          <w:szCs w:val="28"/>
-          <w:lang w:bidi="fa-IR"/>
-        </w:rPr>
-        <w:t xml:space="preserve"> creates the container process, it does not remain as its long-term parent. Instead, </w:t>
-      </w:r>
-      <w:proofErr w:type="spellStart"/>
-      <w:r>
-        <w:rPr>
-          <w:rFonts w:asciiTheme="majorBidi" w:hAnsiTheme="majorBidi" w:cstheme="majorBidi"/>
-          <w:sz w:val="28"/>
-          <w:szCs w:val="28"/>
-          <w:lang w:bidi="fa-IR"/>
-        </w:rPr>
-        <w:t>containerd</w:t>
-      </w:r>
-      <w:proofErr w:type="spellEnd"/>
-      <w:r>
-        <w:rPr>
-          <w:rFonts w:asciiTheme="majorBidi" w:hAnsiTheme="majorBidi" w:cstheme="majorBidi"/>
-          <w:sz w:val="28"/>
-          <w:szCs w:val="28"/>
-          <w:lang w:bidi="fa-IR"/>
-        </w:rPr>
-        <w:t xml:space="preserve"> launches a separate process called </w:t>
-      </w:r>
-      <w:proofErr w:type="spellStart"/>
-      <w:r>
-        <w:rPr>
-          <w:rFonts w:asciiTheme="majorBidi" w:hAnsiTheme="majorBidi" w:cstheme="majorBidi"/>
-          <w:sz w:val="28"/>
-          <w:szCs w:val="28"/>
-          <w:lang w:bidi="fa-IR"/>
-        </w:rPr>
-        <w:t>containerd</w:t>
-      </w:r>
-      <w:proofErr w:type="spellEnd"/>
-      <w:r>
-        <w:rPr>
-          <w:rFonts w:asciiTheme="majorBidi" w:hAnsiTheme="majorBidi" w:cstheme="majorBidi"/>
-          <w:sz w:val="28"/>
-          <w:szCs w:val="28"/>
-          <w:lang w:bidi="fa-IR"/>
-        </w:rPr>
-        <w:t xml:space="preserve">-shim. The shim becomes the real parent of the container process. This design is extremely important. The shim keeps the container alive independently of </w:t>
-      </w:r>
-      <w:proofErr w:type="spellStart"/>
-      <w:r>
-        <w:rPr>
-          <w:rFonts w:asciiTheme="majorBidi" w:hAnsiTheme="majorBidi" w:cstheme="majorBidi"/>
-          <w:sz w:val="28"/>
-          <w:szCs w:val="28"/>
-          <w:lang w:bidi="fa-IR"/>
-        </w:rPr>
-        <w:t>containerd</w:t>
-      </w:r>
-      <w:proofErr w:type="spellEnd"/>
-      <w:r>
-        <w:rPr>
-          <w:rFonts w:asciiTheme="majorBidi" w:hAnsiTheme="majorBidi" w:cstheme="majorBidi"/>
-          <w:sz w:val="28"/>
-          <w:szCs w:val="28"/>
-          <w:lang w:bidi="fa-IR"/>
-        </w:rPr>
-        <w:t xml:space="preserve"> and Docker daemon, manages the container’s standard input/output streams, and reports the container’s exit status back to </w:t>
-      </w:r>
-      <w:proofErr w:type="spellStart"/>
-      <w:r>
-        <w:rPr>
-          <w:rFonts w:asciiTheme="majorBidi" w:hAnsiTheme="majorBidi" w:cstheme="majorBidi"/>
-          <w:sz w:val="28"/>
-          <w:szCs w:val="28"/>
-          <w:lang w:bidi="fa-IR"/>
-        </w:rPr>
-        <w:t>containerd</w:t>
-      </w:r>
-      <w:proofErr w:type="spellEnd"/>
-      <w:r>
-        <w:rPr>
-          <w:rFonts w:asciiTheme="majorBidi" w:hAnsiTheme="majorBidi" w:cstheme="majorBidi"/>
-          <w:sz w:val="28"/>
-          <w:szCs w:val="28"/>
-          <w:lang w:bidi="fa-IR"/>
-        </w:rPr>
-        <w:t xml:space="preserve">. </w:t>
-      </w:r>
-      <w:proofErr w:type="spellStart"/>
-      <w:r>
-        <w:rPr>
-          <w:rFonts w:asciiTheme="majorBidi" w:hAnsiTheme="majorBidi" w:cstheme="majorBidi"/>
-          <w:sz w:val="28"/>
-          <w:szCs w:val="28"/>
-          <w:lang w:bidi="fa-IR"/>
-        </w:rPr>
-        <w:t>RunC</w:t>
-      </w:r>
-      <w:proofErr w:type="spellEnd"/>
-      <w:r>
-        <w:rPr>
-          <w:rFonts w:asciiTheme="majorBidi" w:hAnsiTheme="majorBidi" w:cstheme="majorBidi"/>
-          <w:sz w:val="28"/>
-          <w:szCs w:val="28"/>
-          <w:lang w:bidi="fa-IR"/>
-        </w:rPr>
-        <w:t xml:space="preserve"> itself exits immediately after creating the container. This does not create a zombie process, because the shim correctly adopts and manages the container process. In Linux, zombie processes only occur when a child exits and the parent does not read its exit status. Here, the shim correctly fulfills the parent role and prevents that problem.</w:t>
-      </w:r>
-    </w:p>
-    <w:p>
-      <w:pPr>
-        <w:jc w:val="both"/>
-        <w:rPr>
-          <w:rFonts w:asciiTheme="majorBidi" w:hAnsiTheme="majorBidi" w:cstheme="majorBidi"/>
-          <w:sz w:val="28"/>
-          <w:szCs w:val="28"/>
-          <w:lang w:bidi="fa-IR"/>
-        </w:rPr>
-      </w:pPr>
-      <w:r>
-        <w:rPr>
-          <w:rFonts w:asciiTheme="majorBidi" w:hAnsiTheme="majorBidi" w:cstheme="majorBidi"/>
-          <w:sz w:val="28"/>
-          <w:szCs w:val="28"/>
-          <w:lang w:bidi="fa-IR"/>
-        </w:rPr>
-        <w:t xml:space="preserve">The final architecture chain looks like this in practice: Docker CLI sends a command to </w:t>
-      </w:r>
-      <w:proofErr w:type="spellStart"/>
-      <w:r>
-        <w:rPr>
-          <w:rFonts w:asciiTheme="majorBidi" w:hAnsiTheme="majorBidi" w:cstheme="majorBidi"/>
-          <w:sz w:val="28"/>
-          <w:szCs w:val="28"/>
-          <w:lang w:bidi="fa-IR"/>
-        </w:rPr>
-        <w:t>dockerd</w:t>
-      </w:r>
-      <w:proofErr w:type="spellEnd"/>
-      <w:r>
-        <w:rPr>
-          <w:rFonts w:asciiTheme="majorBidi" w:hAnsiTheme="majorBidi" w:cstheme="majorBidi"/>
-          <w:sz w:val="28"/>
-          <w:szCs w:val="28"/>
-          <w:lang w:bidi="fa-IR"/>
-        </w:rPr>
-        <w:t xml:space="preserve">, </w:t>
-      </w:r>
-      <w:proofErr w:type="spellStart"/>
-      <w:r>
-        <w:rPr>
-          <w:rFonts w:asciiTheme="majorBidi" w:hAnsiTheme="majorBidi" w:cstheme="majorBidi"/>
-          <w:sz w:val="28"/>
-          <w:szCs w:val="28"/>
-          <w:lang w:bidi="fa-IR"/>
-        </w:rPr>
-        <w:t>dockerd</w:t>
-      </w:r>
-      <w:proofErr w:type="spellEnd"/>
-      <w:r>
-        <w:rPr>
-          <w:rFonts w:asciiTheme="majorBidi" w:hAnsiTheme="majorBidi" w:cstheme="majorBidi"/>
-          <w:sz w:val="28"/>
-          <w:szCs w:val="28"/>
-          <w:lang w:bidi="fa-IR"/>
-        </w:rPr>
-        <w:t xml:space="preserve"> delegates to </w:t>
-      </w:r>
-      <w:proofErr w:type="spellStart"/>
-      <w:r>
-        <w:rPr>
-          <w:rFonts w:asciiTheme="majorBidi" w:hAnsiTheme="majorBidi" w:cstheme="majorBidi"/>
-          <w:sz w:val="28"/>
-          <w:szCs w:val="28"/>
-          <w:lang w:bidi="fa-IR"/>
-        </w:rPr>
-        <w:t>containerd</w:t>
-      </w:r>
-      <w:proofErr w:type="spellEnd"/>
-      <w:r>
-        <w:rPr>
-          <w:rFonts w:asciiTheme="majorBidi" w:hAnsiTheme="majorBidi" w:cstheme="majorBidi"/>
-          <w:sz w:val="28"/>
-          <w:szCs w:val="28"/>
-          <w:lang w:bidi="fa-IR"/>
-        </w:rPr>
-        <w:t xml:space="preserve">, </w:t>
-      </w:r>
-      <w:proofErr w:type="spellStart"/>
-      <w:r>
-        <w:rPr>
-          <w:rFonts w:asciiTheme="majorBidi" w:hAnsiTheme="majorBidi" w:cstheme="majorBidi"/>
-          <w:sz w:val="28"/>
-          <w:szCs w:val="28"/>
-          <w:lang w:bidi="fa-IR"/>
-        </w:rPr>
-        <w:t>containerd</w:t>
-      </w:r>
-      <w:proofErr w:type="spellEnd"/>
-      <w:r>
-        <w:rPr>
-          <w:rFonts w:asciiTheme="majorBidi" w:hAnsiTheme="majorBidi" w:cstheme="majorBidi"/>
-          <w:sz w:val="28"/>
-          <w:szCs w:val="28"/>
-          <w:lang w:bidi="fa-IR"/>
-        </w:rPr>
-        <w:t xml:space="preserve"> starts </w:t>
-      </w:r>
-      <w:proofErr w:type="spellStart"/>
-      <w:r>
-        <w:rPr>
-          <w:rFonts w:asciiTheme="majorBidi" w:hAnsiTheme="majorBidi" w:cstheme="majorBidi"/>
-          <w:sz w:val="28"/>
-          <w:szCs w:val="28"/>
-          <w:lang w:bidi="fa-IR"/>
-        </w:rPr>
-        <w:t>containerd</w:t>
-      </w:r>
-      <w:proofErr w:type="spellEnd"/>
-      <w:r>
-        <w:rPr>
-          <w:rFonts w:asciiTheme="majorBidi" w:hAnsiTheme="majorBidi" w:cstheme="majorBidi"/>
-          <w:sz w:val="28"/>
-          <w:szCs w:val="28"/>
-          <w:lang w:bidi="fa-IR"/>
-        </w:rPr>
-        <w:t xml:space="preserve">-shim, the shim invokes </w:t>
-      </w:r>
-      <w:proofErr w:type="spellStart"/>
-      <w:r>
-        <w:rPr>
-          <w:rFonts w:asciiTheme="majorBidi" w:hAnsiTheme="majorBidi" w:cstheme="majorBidi"/>
-          <w:sz w:val="28"/>
-          <w:szCs w:val="28"/>
-          <w:lang w:bidi="fa-IR"/>
-        </w:rPr>
-        <w:t>runC</w:t>
-      </w:r>
-      <w:proofErr w:type="spellEnd"/>
-      <w:r>
-        <w:rPr>
-          <w:rFonts w:asciiTheme="majorBidi" w:hAnsiTheme="majorBidi" w:cstheme="majorBidi"/>
-          <w:sz w:val="28"/>
-          <w:szCs w:val="28"/>
-          <w:lang w:bidi="fa-IR"/>
-        </w:rPr>
-        <w:t xml:space="preserve"> to create the container, </w:t>
-      </w:r>
-      <w:proofErr w:type="spellStart"/>
-      <w:r>
-        <w:rPr>
-          <w:rFonts w:asciiTheme="majorBidi" w:hAnsiTheme="majorBidi" w:cstheme="majorBidi"/>
-          <w:sz w:val="28"/>
-          <w:szCs w:val="28"/>
-          <w:lang w:bidi="fa-IR"/>
-        </w:rPr>
-        <w:t>runC</w:t>
-      </w:r>
-      <w:proofErr w:type="spellEnd"/>
-      <w:r>
-        <w:rPr>
-          <w:rFonts w:asciiTheme="majorBidi" w:hAnsiTheme="majorBidi" w:cstheme="majorBidi"/>
-          <w:sz w:val="28"/>
-          <w:szCs w:val="28"/>
-          <w:lang w:bidi="fa-IR"/>
-        </w:rPr>
-        <w:t xml:space="preserve"> exits, and the shim becomes the container’s long-term parent and </w:t>
+        <w:t>In the early days of Docker, the Docker daemon (dockerd) was a large monolithic program that relied on LXC (Linux Containers) to actually create containers. LXC was responsible for interacting with kernel features like namespaces and cgroups, because Docker itself did not directly manage those low-level kernel primitives. This created two problems. First, LXC was a general Linux project, not designed specifically for Docker, so Docker was dependent on external design decisions. Second, LXC was tightly coupled to Linux, which made it difficult for Docker to evolve toward supporting other platforms like Windows. To solve this, Docker developers created their own library called libcontainer, which directly interacted with the Linux kernel to configure namespaces, cgroups, mounts, and other isolation features. This removed Docker’s dependency on LXC and gave Docker full control over container creation. Later, libcontainer was extracted and standardized as runC, which became a reference implementation of the OCI (Open Container Initiative) runtime specification.</w:t>
+      </w:r>
+    </w:p>
+    <w:p>
+      <w:pPr>
+        <w:jc w:val="both"/>
+        <w:rPr>
+          <w:rFonts w:asciiTheme="majorBidi" w:hAnsiTheme="majorBidi" w:cstheme="majorBidi"/>
+          <w:sz w:val="28"/>
+          <w:szCs w:val="28"/>
+          <w:lang w:bidi="fa-IR"/>
+        </w:rPr>
+      </w:pPr>
+      <w:r>
+        <w:rPr>
+          <w:rFonts w:asciiTheme="majorBidi" w:hAnsiTheme="majorBidi" w:cstheme="majorBidi"/>
+          <w:sz w:val="28"/>
+          <w:szCs w:val="28"/>
+          <w:lang w:bidi="fa-IR"/>
+        </w:rPr>
+        <w:t>As Docker evolved further, its architecture was refactored from a monolithic daemon into a more modular system. Today, when you run a command like docker run, the Docker CLI sends the request to the Docker daemon (dockerd) through a Unix socket or TCP connection. The Docker daemon does not create containers directly anymore. Instead, it delegates container lifecycle management to containerd, which is a specialized container manager responsible for tasks like pulling images, managing container state, and supervising execution. However, containerd itself still does not directly create containers at the kernel level. For that, it uses a low-level runtime called runC. The runC runtime is responsible for the actual creation of the container by configuring namespaces, cgroups, filesystem mounts, and then starting the container process.</w:t>
+      </w:r>
+    </w:p>
+    <w:p>
+      <w:pPr>
+        <w:jc w:val="both"/>
+        <w:rPr>
+          <w:rFonts w:asciiTheme="majorBidi" w:hAnsiTheme="majorBidi" w:cstheme="majorBidi"/>
+          <w:sz w:val="28"/>
+          <w:szCs w:val="28"/>
+          <w:lang w:bidi="fa-IR"/>
+        </w:rPr>
+      </w:pPr>
+      <w:r>
+        <w:rPr>
+          <w:rFonts w:asciiTheme="majorBidi" w:hAnsiTheme="majorBidi" w:cstheme="majorBidi"/>
+          <w:sz w:val="28"/>
+          <w:szCs w:val="28"/>
+          <w:lang w:bidi="fa-IR"/>
+        </w:rPr>
+        <w:t>When runC creates the container process, it does not remain as its long-term parent. Instead, containerd launches a separate process called containerd-shim. The shim becomes the real parent of the container process. This design is extremely important. The shim keeps the container alive independently of containerd and Docker daemon, manages the container’s standard input/output streams, and reports the container’s exit status back to containerd. RunC itself exits immediately after creating the container. This does not create a zombie process, because the shim correctly adopts and manages the container process. In Linux, zombie processes only occur when a child exits and the parent does not read its exit status. Here, the shim correctly fulfills the parent role and prevents that problem.</w:t>
+      </w:r>
+    </w:p>
+    <w:p>
+      <w:pPr>
+        <w:jc w:val="both"/>
+        <w:rPr>
+          <w:rFonts w:asciiTheme="majorBidi" w:hAnsiTheme="majorBidi" w:cstheme="majorBidi"/>
+          <w:sz w:val="28"/>
+          <w:szCs w:val="28"/>
+          <w:lang w:bidi="fa-IR"/>
+        </w:rPr>
+      </w:pPr>
+      <w:r>
+        <w:rPr>
+          <w:rFonts w:asciiTheme="majorBidi" w:hAnsiTheme="majorBidi" w:cstheme="majorBidi"/>
+          <w:sz w:val="28"/>
+          <w:szCs w:val="28"/>
+          <w:lang w:bidi="fa-IR"/>
+        </w:rPr>
+        <w:t xml:space="preserve">The final architecture chain looks like this in practice: Docker CLI sends a command to dockerd, dockerd delegates to containerd, containerd starts containerd-shim, the shim invokes runC to create the container, runC exits, and the shim becomes the container’s long-term parent and </w:t>
       </w:r>
       <w:r>
         <w:rPr>
@@ -10821,87 +9790,27 @@
           <w:szCs w:val="28"/>
           <w:lang w:bidi="fa-IR"/>
         </w:rPr>
-        <w:t xml:space="preserve">to use </w:t>
-      </w:r>
-      <w:proofErr w:type="spellStart"/>
-      <w:r>
-        <w:rPr>
-          <w:rFonts w:asciiTheme="majorBidi" w:hAnsiTheme="majorBidi" w:cstheme="majorBidi"/>
-          <w:sz w:val="28"/>
-          <w:szCs w:val="28"/>
-          <w:lang w:bidi="fa-IR"/>
-        </w:rPr>
-        <w:t>containerd</w:t>
-      </w:r>
-      <w:proofErr w:type="spellEnd"/>
-      <w:r>
-        <w:rPr>
-          <w:rFonts w:asciiTheme="majorBidi" w:hAnsiTheme="majorBidi" w:cstheme="majorBidi"/>
-          <w:sz w:val="28"/>
-          <w:szCs w:val="28"/>
-          <w:lang w:bidi="fa-IR"/>
-        </w:rPr>
-        <w:t xml:space="preserve"> and </w:t>
-      </w:r>
-      <w:proofErr w:type="spellStart"/>
-      <w:r>
-        <w:rPr>
-          <w:rFonts w:asciiTheme="majorBidi" w:hAnsiTheme="majorBidi" w:cstheme="majorBidi"/>
-          <w:sz w:val="28"/>
-          <w:szCs w:val="28"/>
-          <w:lang w:bidi="fa-IR"/>
-        </w:rPr>
-        <w:t>runC</w:t>
-      </w:r>
-      <w:proofErr w:type="spellEnd"/>
-      <w:r>
-        <w:rPr>
-          <w:rFonts w:asciiTheme="majorBidi" w:hAnsiTheme="majorBidi" w:cstheme="majorBidi"/>
-          <w:sz w:val="28"/>
-          <w:szCs w:val="28"/>
-          <w:lang w:bidi="fa-IR"/>
-        </w:rPr>
-        <w:t xml:space="preserve"> directly.</w:t>
-      </w:r>
-    </w:p>
-    <w:p>
-      <w:pPr>
-        <w:jc w:val="both"/>
-        <w:rPr>
-          <w:rFonts w:asciiTheme="majorBidi" w:hAnsiTheme="majorBidi" w:cstheme="majorBidi"/>
-          <w:sz w:val="28"/>
-          <w:szCs w:val="28"/>
-          <w:lang w:bidi="fa-IR"/>
-        </w:rPr>
-      </w:pPr>
-      <w:r>
-        <w:rPr>
-          <w:rFonts w:asciiTheme="majorBidi" w:hAnsiTheme="majorBidi" w:cstheme="majorBidi"/>
-          <w:sz w:val="28"/>
-          <w:szCs w:val="28"/>
-          <w:lang w:bidi="fa-IR"/>
-        </w:rPr>
-        <w:t xml:space="preserve">The deep truth hiding underneath all this abstraction is that a container is not a magical object. It is just a normal Linux process, started in a carefully constructed illusion created by namespaces, constrained by </w:t>
-      </w:r>
-      <w:proofErr w:type="spellStart"/>
-      <w:r>
-        <w:rPr>
-          <w:rFonts w:asciiTheme="majorBidi" w:hAnsiTheme="majorBidi" w:cstheme="majorBidi"/>
-          <w:sz w:val="28"/>
-          <w:szCs w:val="28"/>
-          <w:lang w:bidi="fa-IR"/>
-        </w:rPr>
-        <w:t>cgroups</w:t>
-      </w:r>
-      <w:proofErr w:type="spellEnd"/>
-      <w:r>
-        <w:rPr>
-          <w:rFonts w:asciiTheme="majorBidi" w:hAnsiTheme="majorBidi" w:cstheme="majorBidi"/>
-          <w:sz w:val="28"/>
-          <w:szCs w:val="28"/>
-          <w:lang w:bidi="fa-IR"/>
-        </w:rPr>
-        <w:t>, and supervised by shim processes acting like shepherds in the kernel wilderness.</w:t>
+        <w:t>to use containerd and runC directly.</w:t>
+      </w:r>
+    </w:p>
+    <w:p>
+      <w:pPr>
+        <w:jc w:val="both"/>
+        <w:rPr>
+          <w:rFonts w:asciiTheme="majorBidi" w:hAnsiTheme="majorBidi" w:cstheme="majorBidi"/>
+          <w:sz w:val="28"/>
+          <w:szCs w:val="28"/>
+          <w:lang w:bidi="fa-IR"/>
+        </w:rPr>
+      </w:pPr>
+      <w:r>
+        <w:rPr>
+          <w:rFonts w:asciiTheme="majorBidi" w:hAnsiTheme="majorBidi" w:cstheme="majorBidi"/>
+          <w:sz w:val="28"/>
+          <w:szCs w:val="28"/>
+          <w:lang w:bidi="fa-IR"/>
+        </w:rPr>
+        <w:t>The deep truth hiding underneath all this abstraction is that a container is not a magical object. It is just a normal Linux process, started in a carefully constructed illusion created by namespaces, constrained by cgroups, and supervised by shim processes acting like shepherds in the kernel wilderness.</w:t>
       </w:r>
     </w:p>
     <w:p>
@@ -10946,27 +9855,7 @@
           <w:szCs w:val="28"/>
           <w:lang w:bidi="fa-IR"/>
         </w:rPr>
-        <w:t xml:space="preserve">docker run → Docker CLI sends request to </w:t>
-      </w:r>
-      <w:proofErr w:type="spellStart"/>
-      <w:r>
-        <w:rPr>
-          <w:rFonts w:asciiTheme="majorBidi" w:hAnsiTheme="majorBidi" w:cstheme="majorBidi"/>
-          <w:sz w:val="28"/>
-          <w:szCs w:val="28"/>
-          <w:lang w:bidi="fa-IR"/>
-        </w:rPr>
-        <w:t>dockerd</w:t>
-      </w:r>
-      <w:proofErr w:type="spellEnd"/>
-      <w:r>
-        <w:rPr>
-          <w:rFonts w:asciiTheme="majorBidi" w:hAnsiTheme="majorBidi" w:cstheme="majorBidi"/>
-          <w:sz w:val="28"/>
-          <w:szCs w:val="28"/>
-          <w:lang w:bidi="fa-IR"/>
-        </w:rPr>
-        <w:t>.</w:t>
+        <w:t>docker run → Docker CLI sends request to dockerd.</w:t>
       </w:r>
     </w:p>
     <w:p>
@@ -10985,45 +9874,14 @@
           <w:lang w:bidi="fa-IR"/>
         </w:rPr>
       </w:pPr>
-      <w:proofErr w:type="spellStart"/>
-      <w:r>
-        <w:rPr>
-          <w:rFonts w:asciiTheme="majorBidi" w:hAnsiTheme="majorBidi" w:cstheme="majorBidi"/>
-          <w:sz w:val="28"/>
-          <w:szCs w:val="28"/>
-          <w:lang w:bidi="fa-IR"/>
-        </w:rPr>
-        <w:t>dockerd</w:t>
-      </w:r>
-      <w:proofErr w:type="spellEnd"/>
-      <w:r>
-        <w:rPr>
-          <w:rFonts w:asciiTheme="majorBidi" w:hAnsiTheme="majorBidi" w:cstheme="majorBidi"/>
-          <w:sz w:val="28"/>
-          <w:szCs w:val="28"/>
-          <w:lang w:bidi="fa-IR"/>
-        </w:rPr>
-        <w:t xml:space="preserve"> → asks </w:t>
-      </w:r>
-      <w:proofErr w:type="spellStart"/>
-      <w:r>
-        <w:rPr>
-          <w:rFonts w:asciiTheme="majorBidi" w:hAnsiTheme="majorBidi" w:cstheme="majorBidi"/>
-          <w:sz w:val="28"/>
-          <w:szCs w:val="28"/>
-          <w:lang w:bidi="fa-IR"/>
-        </w:rPr>
-        <w:t>containerd</w:t>
-      </w:r>
-      <w:proofErr w:type="spellEnd"/>
-      <w:r>
-        <w:rPr>
-          <w:rFonts w:asciiTheme="majorBidi" w:hAnsiTheme="majorBidi" w:cstheme="majorBidi"/>
-          <w:sz w:val="28"/>
-          <w:szCs w:val="28"/>
-          <w:lang w:bidi="fa-IR"/>
-        </w:rPr>
-        <w:t xml:space="preserve"> to create and start a container.</w:t>
+      <w:r>
+        <w:rPr>
+          <w:rFonts w:asciiTheme="majorBidi" w:hAnsiTheme="majorBidi" w:cstheme="majorBidi"/>
+          <w:sz w:val="28"/>
+          <w:szCs w:val="28"/>
+          <w:lang w:bidi="fa-IR"/>
+        </w:rPr>
+        <w:t>dockerd → asks containerd to create and start a container.</w:t>
       </w:r>
     </w:p>
     <w:p>
@@ -11042,25 +9900,14 @@
           <w:lang w:bidi="fa-IR"/>
         </w:rPr>
       </w:pPr>
-      <w:proofErr w:type="spellStart"/>
-      <w:r>
-        <w:rPr>
-          <w:rFonts w:asciiTheme="majorBidi" w:hAnsiTheme="majorBidi" w:cstheme="majorBidi"/>
-          <w:sz w:val="28"/>
-          <w:szCs w:val="28"/>
-          <w:lang w:bidi="fa-IR"/>
-        </w:rPr>
-        <w:t>containerd</w:t>
-      </w:r>
-      <w:proofErr w:type="spellEnd"/>
-      <w:r>
-        <w:rPr>
-          <w:rFonts w:asciiTheme="majorBidi" w:hAnsiTheme="majorBidi" w:cstheme="majorBidi"/>
-          <w:sz w:val="28"/>
-          <w:szCs w:val="28"/>
-          <w:lang w:bidi="fa-IR"/>
-        </w:rPr>
-        <w:t xml:space="preserve"> prepares the container metadata (filesystem snapshot, config, OCI spec).</w:t>
+      <w:r>
+        <w:rPr>
+          <w:rFonts w:asciiTheme="majorBidi" w:hAnsiTheme="majorBidi" w:cstheme="majorBidi"/>
+          <w:sz w:val="28"/>
+          <w:szCs w:val="28"/>
+          <w:lang w:bidi="fa-IR"/>
+        </w:rPr>
+        <w:t>containerd prepares the container metadata (filesystem snapshot, config, OCI spec).</w:t>
       </w:r>
     </w:p>
     <w:p>
@@ -11079,45 +9926,14 @@
           <w:lang w:bidi="fa-IR"/>
         </w:rPr>
       </w:pPr>
-      <w:proofErr w:type="spellStart"/>
-      <w:r>
-        <w:rPr>
-          <w:rFonts w:asciiTheme="majorBidi" w:hAnsiTheme="majorBidi" w:cstheme="majorBidi"/>
-          <w:sz w:val="28"/>
-          <w:szCs w:val="28"/>
-          <w:lang w:bidi="fa-IR"/>
-        </w:rPr>
-        <w:t>containerd</w:t>
-      </w:r>
-      <w:proofErr w:type="spellEnd"/>
-      <w:r>
-        <w:rPr>
-          <w:rFonts w:asciiTheme="majorBidi" w:hAnsiTheme="majorBidi" w:cstheme="majorBidi"/>
-          <w:sz w:val="28"/>
-          <w:szCs w:val="28"/>
-          <w:lang w:bidi="fa-IR"/>
-        </w:rPr>
-        <w:t xml:space="preserve"> then starts a </w:t>
-      </w:r>
-      <w:proofErr w:type="spellStart"/>
-      <w:r>
-        <w:rPr>
-          <w:rFonts w:asciiTheme="majorBidi" w:hAnsiTheme="majorBidi" w:cstheme="majorBidi"/>
-          <w:sz w:val="28"/>
-          <w:szCs w:val="28"/>
-          <w:lang w:bidi="fa-IR"/>
-        </w:rPr>
-        <w:t>containerd</w:t>
-      </w:r>
-      <w:proofErr w:type="spellEnd"/>
-      <w:r>
-        <w:rPr>
-          <w:rFonts w:asciiTheme="majorBidi" w:hAnsiTheme="majorBidi" w:cstheme="majorBidi"/>
-          <w:sz w:val="28"/>
-          <w:szCs w:val="28"/>
-          <w:lang w:bidi="fa-IR"/>
-        </w:rPr>
-        <w:t>-shim process for that container.</w:t>
+      <w:r>
+        <w:rPr>
+          <w:rFonts w:asciiTheme="majorBidi" w:hAnsiTheme="majorBidi" w:cstheme="majorBidi"/>
+          <w:sz w:val="28"/>
+          <w:szCs w:val="28"/>
+          <w:lang w:bidi="fa-IR"/>
+        </w:rPr>
+        <w:t>containerd then starts a containerd-shim process for that container.</w:t>
       </w:r>
     </w:p>
     <w:p>
@@ -11143,47 +9959,7 @@
           <w:szCs w:val="28"/>
           <w:lang w:bidi="fa-IR"/>
         </w:rPr>
-        <w:t xml:space="preserve">The shim then invokes </w:t>
-      </w:r>
-      <w:proofErr w:type="spellStart"/>
-      <w:r>
-        <w:rPr>
-          <w:rFonts w:asciiTheme="majorBidi" w:hAnsiTheme="majorBidi" w:cstheme="majorBidi"/>
-          <w:sz w:val="28"/>
-          <w:szCs w:val="28"/>
-          <w:lang w:bidi="fa-IR"/>
-        </w:rPr>
-        <w:t>runc</w:t>
-      </w:r>
-      <w:proofErr w:type="spellEnd"/>
-      <w:r>
-        <w:rPr>
-          <w:rFonts w:asciiTheme="majorBidi" w:hAnsiTheme="majorBidi" w:cstheme="majorBidi"/>
-          <w:sz w:val="28"/>
-          <w:szCs w:val="28"/>
-          <w:lang w:bidi="fa-IR"/>
-        </w:rPr>
-        <w:t xml:space="preserve"> to actually create the container (set up namespaces, </w:t>
-      </w:r>
-      <w:proofErr w:type="spellStart"/>
-      <w:r>
-        <w:rPr>
-          <w:rFonts w:asciiTheme="majorBidi" w:hAnsiTheme="majorBidi" w:cstheme="majorBidi"/>
-          <w:sz w:val="28"/>
-          <w:szCs w:val="28"/>
-          <w:lang w:bidi="fa-IR"/>
-        </w:rPr>
-        <w:t>cgroups</w:t>
-      </w:r>
-      <w:proofErr w:type="spellEnd"/>
-      <w:r>
-        <w:rPr>
-          <w:rFonts w:asciiTheme="majorBidi" w:hAnsiTheme="majorBidi" w:cstheme="majorBidi"/>
-          <w:sz w:val="28"/>
-          <w:szCs w:val="28"/>
-          <w:lang w:bidi="fa-IR"/>
-        </w:rPr>
-        <w:t>, mounts, and exec the process).</w:t>
+        <w:t>The shim then invokes runc to actually create the container (set up namespaces, cgroups, mounts, and exec the process).</w:t>
       </w:r>
     </w:p>
     <w:p>
@@ -11202,25 +9978,14 @@
           <w:lang w:bidi="fa-IR"/>
         </w:rPr>
       </w:pPr>
-      <w:proofErr w:type="spellStart"/>
-      <w:r>
-        <w:rPr>
-          <w:rFonts w:asciiTheme="majorBidi" w:hAnsiTheme="majorBidi" w:cstheme="majorBidi"/>
-          <w:sz w:val="28"/>
-          <w:szCs w:val="28"/>
-          <w:lang w:bidi="fa-IR"/>
-        </w:rPr>
-        <w:t>runc</w:t>
-      </w:r>
-      <w:proofErr w:type="spellEnd"/>
-      <w:r>
-        <w:rPr>
-          <w:rFonts w:asciiTheme="majorBidi" w:hAnsiTheme="majorBidi" w:cstheme="majorBidi"/>
-          <w:sz w:val="28"/>
-          <w:szCs w:val="28"/>
-          <w:lang w:bidi="fa-IR"/>
-        </w:rPr>
-        <w:t xml:space="preserve"> creates the container process and immediately exits.</w:t>
+      <w:r>
+        <w:rPr>
+          <w:rFonts w:asciiTheme="majorBidi" w:hAnsiTheme="majorBidi" w:cstheme="majorBidi"/>
+          <w:sz w:val="28"/>
+          <w:szCs w:val="28"/>
+          <w:lang w:bidi="fa-IR"/>
+        </w:rPr>
+        <w:t>runc creates the container process and immediately exits.</w:t>
       </w:r>
     </w:p>
     <w:p>
@@ -11275,27 +10040,7 @@
           <w:szCs w:val="28"/>
           <w:lang w:bidi="fa-IR"/>
         </w:rPr>
-        <w:t xml:space="preserve">in modern Docker, the shim exists before </w:t>
-      </w:r>
-      <w:proofErr w:type="spellStart"/>
-      <w:r>
-        <w:rPr>
-          <w:rFonts w:asciiTheme="majorBidi" w:hAnsiTheme="majorBidi" w:cstheme="majorBidi"/>
-          <w:sz w:val="28"/>
-          <w:szCs w:val="28"/>
-          <w:lang w:bidi="fa-IR"/>
-        </w:rPr>
-        <w:t>runc</w:t>
-      </w:r>
-      <w:proofErr w:type="spellEnd"/>
-      <w:r>
-        <w:rPr>
-          <w:rFonts w:asciiTheme="majorBidi" w:hAnsiTheme="majorBidi" w:cstheme="majorBidi"/>
-          <w:sz w:val="28"/>
-          <w:szCs w:val="28"/>
-          <w:lang w:bidi="fa-IR"/>
-        </w:rPr>
-        <w:t xml:space="preserve"> finishes its job, and it is intentionally placed in the middle so that:</w:t>
+        <w:t>in modern Docker, the shim exists before runc finishes its job, and it is intentionally placed in the middle so that:</w:t>
       </w:r>
     </w:p>
     <w:p>
@@ -11321,27 +10066,7 @@
           <w:szCs w:val="28"/>
           <w:lang w:bidi="fa-IR"/>
         </w:rPr>
-        <w:t xml:space="preserve">The container does not die if </w:t>
-      </w:r>
-      <w:proofErr w:type="spellStart"/>
-      <w:r>
-        <w:rPr>
-          <w:rFonts w:asciiTheme="majorBidi" w:hAnsiTheme="majorBidi" w:cstheme="majorBidi"/>
-          <w:sz w:val="28"/>
-          <w:szCs w:val="28"/>
-          <w:lang w:bidi="fa-IR"/>
-        </w:rPr>
-        <w:t>containerd</w:t>
-      </w:r>
-      <w:proofErr w:type="spellEnd"/>
-      <w:r>
-        <w:rPr>
-          <w:rFonts w:asciiTheme="majorBidi" w:hAnsiTheme="majorBidi" w:cstheme="majorBidi"/>
-          <w:sz w:val="28"/>
-          <w:szCs w:val="28"/>
-          <w:lang w:bidi="fa-IR"/>
-        </w:rPr>
-        <w:t xml:space="preserve"> crashes.</w:t>
+        <w:t>The container does not die if containerd crashes.</w:t>
       </w:r>
     </w:p>
     <w:p>
@@ -11367,27 +10092,7 @@
           <w:szCs w:val="28"/>
           <w:lang w:bidi="fa-IR"/>
         </w:rPr>
-        <w:t xml:space="preserve">The container’s </w:t>
-      </w:r>
-      <w:proofErr w:type="spellStart"/>
-      <w:r>
-        <w:rPr>
-          <w:rFonts w:asciiTheme="majorBidi" w:hAnsiTheme="majorBidi" w:cstheme="majorBidi"/>
-          <w:sz w:val="28"/>
-          <w:szCs w:val="28"/>
-          <w:lang w:bidi="fa-IR"/>
-        </w:rPr>
-        <w:t>stdio</w:t>
-      </w:r>
-      <w:proofErr w:type="spellEnd"/>
-      <w:r>
-        <w:rPr>
-          <w:rFonts w:asciiTheme="majorBidi" w:hAnsiTheme="majorBidi" w:cstheme="majorBidi"/>
-          <w:sz w:val="28"/>
-          <w:szCs w:val="28"/>
-          <w:lang w:bidi="fa-IR"/>
-        </w:rPr>
-        <w:t xml:space="preserve"> streams are handled independently.</w:t>
+        <w:t>The container’s stdio streams are handled independently.</w:t>
       </w:r>
     </w:p>
     <w:p>
@@ -11442,47 +10147,7 @@
           <w:szCs w:val="28"/>
           <w:lang w:bidi="fa-IR"/>
         </w:rPr>
-        <w:t xml:space="preserve">he shim does not “create” the container itself. It is more accurate to say the shim spawns </w:t>
-      </w:r>
-      <w:proofErr w:type="spellStart"/>
-      <w:r>
-        <w:rPr>
-          <w:rFonts w:asciiTheme="majorBidi" w:hAnsiTheme="majorBidi" w:cstheme="majorBidi"/>
-          <w:sz w:val="28"/>
-          <w:szCs w:val="28"/>
-          <w:lang w:bidi="fa-IR"/>
-        </w:rPr>
-        <w:t>runc</w:t>
-      </w:r>
-      <w:proofErr w:type="spellEnd"/>
-      <w:r>
-        <w:rPr>
-          <w:rFonts w:asciiTheme="majorBidi" w:hAnsiTheme="majorBidi" w:cstheme="majorBidi"/>
-          <w:sz w:val="28"/>
-          <w:szCs w:val="28"/>
-          <w:lang w:bidi="fa-IR"/>
-        </w:rPr>
-        <w:t xml:space="preserve">, and </w:t>
-      </w:r>
-      <w:proofErr w:type="spellStart"/>
-      <w:r>
-        <w:rPr>
-          <w:rFonts w:asciiTheme="majorBidi" w:hAnsiTheme="majorBidi" w:cstheme="majorBidi"/>
-          <w:sz w:val="28"/>
-          <w:szCs w:val="28"/>
-          <w:lang w:bidi="fa-IR"/>
-        </w:rPr>
-        <w:t>runc</w:t>
-      </w:r>
-      <w:proofErr w:type="spellEnd"/>
-      <w:r>
-        <w:rPr>
-          <w:rFonts w:asciiTheme="majorBidi" w:hAnsiTheme="majorBidi" w:cstheme="majorBidi"/>
-          <w:sz w:val="28"/>
-          <w:szCs w:val="28"/>
-          <w:lang w:bidi="fa-IR"/>
-        </w:rPr>
-        <w:t xml:space="preserve"> performs the actual low-level container creation according to the OCI runtime specification.</w:t>
+        <w:t>he shim does not “create” the container itself. It is more accurate to say the shim spawns runc, and runc performs the actual low-level container creation according to the OCI runtime specification.</w:t>
       </w:r>
     </w:p>
     <w:p>
@@ -11521,25 +10186,14 @@
           <w:lang w:bidi="fa-IR"/>
         </w:rPr>
       </w:pPr>
-      <w:proofErr w:type="spellStart"/>
-      <w:r>
-        <w:rPr>
-          <w:rFonts w:asciiTheme="majorBidi" w:hAnsiTheme="majorBidi" w:cstheme="majorBidi"/>
-          <w:sz w:val="28"/>
-          <w:szCs w:val="28"/>
-          <w:lang w:bidi="fa-IR"/>
-        </w:rPr>
-        <w:t>containerd</w:t>
-      </w:r>
-      <w:proofErr w:type="spellEnd"/>
-      <w:r>
-        <w:rPr>
-          <w:rFonts w:asciiTheme="majorBidi" w:hAnsiTheme="majorBidi" w:cstheme="majorBidi"/>
-          <w:sz w:val="28"/>
-          <w:szCs w:val="28"/>
-          <w:lang w:bidi="fa-IR"/>
-        </w:rPr>
-        <w:t xml:space="preserve"> manages lifecycle.</w:t>
+      <w:r>
+        <w:rPr>
+          <w:rFonts w:asciiTheme="majorBidi" w:hAnsiTheme="majorBidi" w:cstheme="majorBidi"/>
+          <w:sz w:val="28"/>
+          <w:szCs w:val="28"/>
+          <w:lang w:bidi="fa-IR"/>
+        </w:rPr>
+        <w:t>containerd manages lifecycle.</w:t>
       </w:r>
     </w:p>
     <w:p>
@@ -11557,25 +10211,14 @@
           <w:lang w:bidi="fa-IR"/>
         </w:rPr>
       </w:pPr>
-      <w:proofErr w:type="spellStart"/>
-      <w:r>
-        <w:rPr>
-          <w:rFonts w:asciiTheme="majorBidi" w:hAnsiTheme="majorBidi" w:cstheme="majorBidi"/>
-          <w:sz w:val="28"/>
-          <w:szCs w:val="28"/>
-          <w:lang w:bidi="fa-IR"/>
-        </w:rPr>
-        <w:t>runc</w:t>
-      </w:r>
-      <w:proofErr w:type="spellEnd"/>
-      <w:r>
-        <w:rPr>
-          <w:rFonts w:asciiTheme="majorBidi" w:hAnsiTheme="majorBidi" w:cstheme="majorBidi"/>
-          <w:sz w:val="28"/>
-          <w:szCs w:val="28"/>
-          <w:lang w:bidi="fa-IR"/>
-        </w:rPr>
-        <w:t xml:space="preserve"> performs low-level container creation.</w:t>
+      <w:r>
+        <w:rPr>
+          <w:rFonts w:asciiTheme="majorBidi" w:hAnsiTheme="majorBidi" w:cstheme="majorBidi"/>
+          <w:sz w:val="28"/>
+          <w:szCs w:val="28"/>
+          <w:lang w:bidi="fa-IR"/>
+        </w:rPr>
+        <w:t>runc performs low-level container creation.</w:t>
       </w:r>
     </w:p>
     <w:p>
@@ -11639,25 +10282,14 @@
           <w:lang w:bidi="fa-IR"/>
         </w:rPr>
       </w:pPr>
-      <w:proofErr w:type="spellStart"/>
-      <w:r>
-        <w:rPr>
-          <w:rFonts w:asciiTheme="majorBidi" w:hAnsiTheme="majorBidi" w:cstheme="majorBidi"/>
-          <w:sz w:val="28"/>
-          <w:szCs w:val="28"/>
-          <w:lang w:bidi="fa-IR"/>
-        </w:rPr>
-        <w:t>containerd</w:t>
-      </w:r>
-      <w:proofErr w:type="spellEnd"/>
-      <w:r>
-        <w:rPr>
-          <w:rFonts w:asciiTheme="majorBidi" w:hAnsiTheme="majorBidi" w:cstheme="majorBidi"/>
-          <w:sz w:val="28"/>
-          <w:szCs w:val="28"/>
-          <w:lang w:bidi="fa-IR"/>
-        </w:rPr>
-        <w:t xml:space="preserve"> = mission control</w:t>
+      <w:r>
+        <w:rPr>
+          <w:rFonts w:asciiTheme="majorBidi" w:hAnsiTheme="majorBidi" w:cstheme="majorBidi"/>
+          <w:sz w:val="28"/>
+          <w:szCs w:val="28"/>
+          <w:lang w:bidi="fa-IR"/>
+        </w:rPr>
+        <w:t>containerd = mission control</w:t>
       </w:r>
     </w:p>
     <w:p>
@@ -11701,25 +10333,14 @@
           <w:lang w:bidi="fa-IR"/>
         </w:rPr>
       </w:pPr>
-      <w:proofErr w:type="spellStart"/>
-      <w:r>
-        <w:rPr>
-          <w:rFonts w:asciiTheme="majorBidi" w:hAnsiTheme="majorBidi" w:cstheme="majorBidi"/>
-          <w:sz w:val="28"/>
-          <w:szCs w:val="28"/>
-          <w:lang w:bidi="fa-IR"/>
-        </w:rPr>
-        <w:t>runc</w:t>
-      </w:r>
-      <w:proofErr w:type="spellEnd"/>
-      <w:r>
-        <w:rPr>
-          <w:rFonts w:asciiTheme="majorBidi" w:hAnsiTheme="majorBidi" w:cstheme="majorBidi"/>
-          <w:sz w:val="28"/>
-          <w:szCs w:val="28"/>
-          <w:lang w:bidi="fa-IR"/>
-        </w:rPr>
-        <w:t xml:space="preserve"> = ignition system that fires once and leaves</w:t>
+      <w:r>
+        <w:rPr>
+          <w:rFonts w:asciiTheme="majorBidi" w:hAnsiTheme="majorBidi" w:cstheme="majorBidi"/>
+          <w:sz w:val="28"/>
+          <w:szCs w:val="28"/>
+          <w:lang w:bidi="fa-IR"/>
+        </w:rPr>
+        <w:t>runc = ignition system that fires once and leaves</w:t>
       </w:r>
     </w:p>
     <w:p>
@@ -11762,60 +10383,19 @@
           <w:szCs w:val="28"/>
           <w:lang w:bidi="fa-IR"/>
         </w:rPr>
-        <w:t>In modern Docker/</w:t>
-      </w:r>
-      <w:proofErr w:type="spellStart"/>
-      <w:r>
-        <w:rPr>
-          <w:rFonts w:asciiTheme="majorBidi" w:hAnsiTheme="majorBidi" w:cstheme="majorBidi"/>
-          <w:sz w:val="28"/>
-          <w:szCs w:val="28"/>
-          <w:lang w:bidi="fa-IR"/>
-        </w:rPr>
-        <w:t>containerd</w:t>
-      </w:r>
-      <w:proofErr w:type="spellEnd"/>
-      <w:r>
-        <w:rPr>
-          <w:rFonts w:asciiTheme="majorBidi" w:hAnsiTheme="majorBidi" w:cstheme="majorBidi"/>
-          <w:sz w:val="28"/>
-          <w:szCs w:val="28"/>
-          <w:lang w:bidi="fa-IR"/>
-        </w:rPr>
-        <w:t xml:space="preserve"> architecture, the shim exists before </w:t>
-      </w:r>
-      <w:proofErr w:type="spellStart"/>
-      <w:r>
-        <w:rPr>
-          <w:rFonts w:asciiTheme="majorBidi" w:hAnsiTheme="majorBidi" w:cstheme="majorBidi"/>
-          <w:sz w:val="28"/>
-          <w:szCs w:val="28"/>
-          <w:lang w:bidi="fa-IR"/>
-        </w:rPr>
-        <w:t>runc</w:t>
-      </w:r>
-      <w:proofErr w:type="spellEnd"/>
-      <w:r>
-        <w:rPr>
-          <w:rFonts w:asciiTheme="majorBidi" w:hAnsiTheme="majorBidi" w:cstheme="majorBidi"/>
-          <w:sz w:val="28"/>
-          <w:szCs w:val="28"/>
-          <w:lang w:bidi="fa-IR"/>
-        </w:rPr>
-        <w:t xml:space="preserve"> creates the container process. But this detail needs precise wording to avoid forming the wrong mental model.</w:t>
-      </w:r>
-    </w:p>
-    <w:p>
-      <w:pPr>
-        <w:jc w:val="both"/>
-        <w:rPr>
-          <w:rFonts w:asciiTheme="majorBidi" w:hAnsiTheme="majorBidi" w:cstheme="majorBidi"/>
-          <w:sz w:val="28"/>
-          <w:szCs w:val="28"/>
-          <w:lang w:bidi="fa-IR"/>
-        </w:rPr>
-      </w:pPr>
-      <w:proofErr w:type="spellStart"/>
+        <w:t>In modern Docker/containerd architecture, the shim exists before runc creates the container process. But this detail needs precise wording to avoid forming the wrong mental model.</w:t>
+      </w:r>
+    </w:p>
+    <w:p>
+      <w:pPr>
+        <w:jc w:val="both"/>
+        <w:rPr>
+          <w:rFonts w:asciiTheme="majorBidi" w:hAnsiTheme="majorBidi" w:cstheme="majorBidi"/>
+          <w:sz w:val="28"/>
+          <w:szCs w:val="28"/>
+          <w:lang w:bidi="fa-IR"/>
+        </w:rPr>
+      </w:pPr>
       <w:r>
         <w:rPr>
           <w:rFonts w:asciiTheme="majorBidi" w:hAnsiTheme="majorBidi" w:cstheme="majorBidi"/>
@@ -11824,97 +10404,7 @@
           <w:lang w:bidi="fa-IR"/>
         </w:rPr>
         <w:lastRenderedPageBreak/>
-        <w:t>containerd</w:t>
-      </w:r>
-      <w:proofErr w:type="spellEnd"/>
-      <w:r>
-        <w:rPr>
-          <w:rFonts w:asciiTheme="majorBidi" w:hAnsiTheme="majorBidi" w:cstheme="majorBidi"/>
-          <w:sz w:val="28"/>
-          <w:szCs w:val="28"/>
-          <w:lang w:bidi="fa-IR"/>
-        </w:rPr>
-        <w:t xml:space="preserve"> does not directly run </w:t>
-      </w:r>
-      <w:proofErr w:type="spellStart"/>
-      <w:r>
-        <w:rPr>
-          <w:rFonts w:asciiTheme="majorBidi" w:hAnsiTheme="majorBidi" w:cstheme="majorBidi"/>
-          <w:sz w:val="28"/>
-          <w:szCs w:val="28"/>
-          <w:lang w:bidi="fa-IR"/>
-        </w:rPr>
-        <w:t>runc</w:t>
-      </w:r>
-      <w:proofErr w:type="spellEnd"/>
-      <w:r>
-        <w:rPr>
-          <w:rFonts w:asciiTheme="majorBidi" w:hAnsiTheme="majorBidi" w:cstheme="majorBidi"/>
-          <w:sz w:val="28"/>
-          <w:szCs w:val="28"/>
-          <w:lang w:bidi="fa-IR"/>
-        </w:rPr>
-        <w:t xml:space="preserve"> by itself as the long-term parent. Instead, </w:t>
-      </w:r>
-      <w:proofErr w:type="spellStart"/>
-      <w:r>
-        <w:rPr>
-          <w:rFonts w:asciiTheme="majorBidi" w:hAnsiTheme="majorBidi" w:cstheme="majorBidi"/>
-          <w:sz w:val="28"/>
-          <w:szCs w:val="28"/>
-          <w:lang w:bidi="fa-IR"/>
-        </w:rPr>
-        <w:t>containerd</w:t>
-      </w:r>
-      <w:proofErr w:type="spellEnd"/>
-      <w:r>
-        <w:rPr>
-          <w:rFonts w:asciiTheme="majorBidi" w:hAnsiTheme="majorBidi" w:cstheme="majorBidi"/>
-          <w:sz w:val="28"/>
-          <w:szCs w:val="28"/>
-          <w:lang w:bidi="fa-IR"/>
-        </w:rPr>
-        <w:t xml:space="preserve"> launches a </w:t>
-      </w:r>
-      <w:proofErr w:type="spellStart"/>
-      <w:r>
-        <w:rPr>
-          <w:rFonts w:asciiTheme="majorBidi" w:hAnsiTheme="majorBidi" w:cstheme="majorBidi"/>
-          <w:sz w:val="28"/>
-          <w:szCs w:val="28"/>
-          <w:lang w:bidi="fa-IR"/>
-        </w:rPr>
-        <w:t>containerd</w:t>
-      </w:r>
-      <w:proofErr w:type="spellEnd"/>
-      <w:r>
-        <w:rPr>
-          <w:rFonts w:asciiTheme="majorBidi" w:hAnsiTheme="majorBidi" w:cstheme="majorBidi"/>
-          <w:sz w:val="28"/>
-          <w:szCs w:val="28"/>
-          <w:lang w:bidi="fa-IR"/>
-        </w:rPr>
-        <w:t xml:space="preserve">-shim process first, and then the shim process invokes </w:t>
-      </w:r>
-      <w:proofErr w:type="spellStart"/>
-      <w:r>
-        <w:rPr>
-          <w:rFonts w:asciiTheme="majorBidi" w:hAnsiTheme="majorBidi" w:cstheme="majorBidi"/>
-          <w:sz w:val="28"/>
-          <w:szCs w:val="28"/>
-          <w:lang w:bidi="fa-IR"/>
-        </w:rPr>
-        <w:t>runc</w:t>
-      </w:r>
-      <w:proofErr w:type="spellEnd"/>
-      <w:r>
-        <w:rPr>
-          <w:rFonts w:asciiTheme="majorBidi" w:hAnsiTheme="majorBidi" w:cstheme="majorBidi"/>
-          <w:sz w:val="28"/>
-          <w:szCs w:val="28"/>
-          <w:lang w:bidi="fa-IR"/>
-        </w:rPr>
-        <w:t xml:space="preserve"> to create the container.</w:t>
+        <w:t>containerd does not directly run runc by itself as the long-term parent. Instead, containerd launches a containerd-shim process first, and then the shim process invokes runc to create the container.</w:t>
       </w:r>
     </w:p>
     <w:p>
@@ -12010,7 +10500,6 @@
                                 <w:szCs w:val="28"/>
                               </w:rPr>
                             </w:pPr>
-                            <w:proofErr w:type="spellStart"/>
                             <w:r>
                               <w:rPr>
                                 <w:rFonts w:asciiTheme="majorBidi" w:hAnsiTheme="majorBidi" w:cstheme="majorBidi"/>
@@ -12019,7 +10508,6 @@
                               </w:rPr>
                               <w:t>containerd</w:t>
                             </w:r>
-                            <w:proofErr w:type="spellEnd"/>
                             <w:r>
                               <w:rPr>
                                 <w:rFonts w:asciiTheme="majorBidi" w:hAnsiTheme="majorBidi" w:cstheme="majorBidi"/>
@@ -12027,25 +10515,7 @@
                                 <w:szCs w:val="28"/>
                               </w:rPr>
                               <w:br/>
-                              <w:t xml:space="preserve">└── </w:t>
-                            </w:r>
-                            <w:proofErr w:type="spellStart"/>
-                            <w:r>
-                              <w:rPr>
-                                <w:rFonts w:asciiTheme="majorBidi" w:hAnsiTheme="majorBidi" w:cstheme="majorBidi"/>
-                                <w:sz w:val="28"/>
-                                <w:szCs w:val="28"/>
-                              </w:rPr>
-                              <w:t>containerd</w:t>
-                            </w:r>
-                            <w:proofErr w:type="spellEnd"/>
-                            <w:r>
-                              <w:rPr>
-                                <w:rFonts w:asciiTheme="majorBidi" w:hAnsiTheme="majorBidi" w:cstheme="majorBidi"/>
-                                <w:sz w:val="28"/>
-                                <w:szCs w:val="28"/>
-                              </w:rPr>
-                              <w:t>-shim</w:t>
+                              <w:t>└── containerd-shim</w:t>
                             </w:r>
                             <w:r>
                               <w:rPr>
@@ -12069,25 +10539,7 @@
                                 <w:sz w:val="28"/>
                                 <w:szCs w:val="28"/>
                               </w:rPr>
-                              <w:t xml:space="preserve">└── </w:t>
-                            </w:r>
-                            <w:proofErr w:type="spellStart"/>
-                            <w:r>
-                              <w:rPr>
-                                <w:rFonts w:asciiTheme="majorBidi" w:hAnsiTheme="majorBidi" w:cstheme="majorBidi"/>
-                                <w:sz w:val="28"/>
-                                <w:szCs w:val="28"/>
-                              </w:rPr>
-                              <w:t>runc</w:t>
-                            </w:r>
-                            <w:proofErr w:type="spellEnd"/>
-                            <w:r>
-                              <w:rPr>
-                                <w:rFonts w:asciiTheme="majorBidi" w:hAnsiTheme="majorBidi" w:cstheme="majorBidi"/>
-                                <w:sz w:val="28"/>
-                                <w:szCs w:val="28"/>
-                              </w:rPr>
-                              <w:t xml:space="preserve"> (temporary)</w:t>
+                              <w:t>└── runc (temporary)</w:t>
                             </w:r>
                             <w:r>
                               <w:rPr>
@@ -12310,47 +10762,7 @@
           <w:szCs w:val="28"/>
           <w:lang w:bidi="fa-IR"/>
         </w:rPr>
-        <w:t xml:space="preserve">But here’s the crucial nuance: </w:t>
-      </w:r>
-      <w:proofErr w:type="spellStart"/>
-      <w:r>
-        <w:rPr>
-          <w:rFonts w:asciiTheme="majorBidi" w:hAnsiTheme="majorBidi" w:cstheme="majorBidi"/>
-          <w:sz w:val="28"/>
-          <w:szCs w:val="28"/>
-          <w:lang w:bidi="fa-IR"/>
-        </w:rPr>
-        <w:t>runc</w:t>
-      </w:r>
-      <w:proofErr w:type="spellEnd"/>
-      <w:r>
-        <w:rPr>
-          <w:rFonts w:asciiTheme="majorBidi" w:hAnsiTheme="majorBidi" w:cstheme="majorBidi"/>
-          <w:sz w:val="28"/>
-          <w:szCs w:val="28"/>
-          <w:lang w:bidi="fa-IR"/>
-        </w:rPr>
-        <w:t xml:space="preserve"> is still the program that actually creates the container. The shim is a supervisor that exists specifically so that </w:t>
-      </w:r>
-      <w:proofErr w:type="spellStart"/>
-      <w:r>
-        <w:rPr>
-          <w:rFonts w:asciiTheme="majorBidi" w:hAnsiTheme="majorBidi" w:cstheme="majorBidi"/>
-          <w:sz w:val="28"/>
-          <w:szCs w:val="28"/>
-          <w:lang w:bidi="fa-IR"/>
-        </w:rPr>
-        <w:t>containerd</w:t>
-      </w:r>
-      <w:proofErr w:type="spellEnd"/>
-      <w:r>
-        <w:rPr>
-          <w:rFonts w:asciiTheme="majorBidi" w:hAnsiTheme="majorBidi" w:cstheme="majorBidi"/>
-          <w:sz w:val="28"/>
-          <w:szCs w:val="28"/>
-          <w:lang w:bidi="fa-IR"/>
-        </w:rPr>
-        <w:t xml:space="preserve"> does not have to remain the direct parent of the container.</w:t>
+        <w:t>But here’s the crucial nuance: runc is still the program that actually creates the container. The shim is a supervisor that exists specifically so that containerd does not have to remain the direct parent of the container.</w:t>
       </w:r>
     </w:p>
     <w:p>
@@ -12389,25 +10801,14 @@
           <w:lang w:bidi="fa-IR"/>
         </w:rPr>
       </w:pPr>
-      <w:proofErr w:type="spellStart"/>
-      <w:r>
-        <w:rPr>
-          <w:rFonts w:asciiTheme="majorBidi" w:hAnsiTheme="majorBidi" w:cstheme="majorBidi"/>
-          <w:sz w:val="28"/>
-          <w:szCs w:val="28"/>
-          <w:lang w:bidi="fa-IR"/>
-        </w:rPr>
-        <w:t>containerd</w:t>
-      </w:r>
-      <w:proofErr w:type="spellEnd"/>
-      <w:r>
-        <w:rPr>
-          <w:rFonts w:asciiTheme="majorBidi" w:hAnsiTheme="majorBidi" w:cstheme="majorBidi"/>
-          <w:sz w:val="28"/>
-          <w:szCs w:val="28"/>
-          <w:lang w:bidi="fa-IR"/>
-        </w:rPr>
-        <w:t xml:space="preserve"> starts shim</w:t>
+      <w:r>
+        <w:rPr>
+          <w:rFonts w:asciiTheme="majorBidi" w:hAnsiTheme="majorBidi" w:cstheme="majorBidi"/>
+          <w:sz w:val="28"/>
+          <w:szCs w:val="28"/>
+          <w:lang w:bidi="fa-IR"/>
+        </w:rPr>
+        <w:t>containerd starts shim</w:t>
       </w:r>
     </w:p>
     <w:p>
@@ -12433,19 +10834,8 @@
           <w:szCs w:val="28"/>
           <w:lang w:bidi="fa-IR"/>
         </w:rPr>
-        <w:t xml:space="preserve">shim starts </w:t>
-      </w:r>
-      <w:proofErr w:type="spellStart"/>
-      <w:r>
-        <w:rPr>
-          <w:rFonts w:asciiTheme="majorBidi" w:hAnsiTheme="majorBidi" w:cstheme="majorBidi"/>
-          <w:sz w:val="28"/>
-          <w:szCs w:val="28"/>
-          <w:lang w:bidi="fa-IR"/>
-        </w:rPr>
-        <w:t>runc</w:t>
-      </w:r>
-      <w:proofErr w:type="spellEnd"/>
+        <w:t>shim starts runc</w:t>
+      </w:r>
     </w:p>
     <w:p>
       <w:pPr>
@@ -12463,25 +10853,14 @@
           <w:lang w:bidi="fa-IR"/>
         </w:rPr>
       </w:pPr>
-      <w:proofErr w:type="spellStart"/>
-      <w:r>
-        <w:rPr>
-          <w:rFonts w:asciiTheme="majorBidi" w:hAnsiTheme="majorBidi" w:cstheme="majorBidi"/>
-          <w:sz w:val="28"/>
-          <w:szCs w:val="28"/>
-          <w:lang w:bidi="fa-IR"/>
-        </w:rPr>
-        <w:t>runc</w:t>
-      </w:r>
-      <w:proofErr w:type="spellEnd"/>
-      <w:r>
-        <w:rPr>
-          <w:rFonts w:asciiTheme="majorBidi" w:hAnsiTheme="majorBidi" w:cstheme="majorBidi"/>
-          <w:sz w:val="28"/>
-          <w:szCs w:val="28"/>
-          <w:lang w:bidi="fa-IR"/>
-        </w:rPr>
-        <w:t xml:space="preserve"> creates the container process</w:t>
+      <w:r>
+        <w:rPr>
+          <w:rFonts w:asciiTheme="majorBidi" w:hAnsiTheme="majorBidi" w:cstheme="majorBidi"/>
+          <w:sz w:val="28"/>
+          <w:szCs w:val="28"/>
+          <w:lang w:bidi="fa-IR"/>
+        </w:rPr>
+        <w:t>runc creates the container process</w:t>
       </w:r>
     </w:p>
     <w:p>
@@ -12500,25 +10879,14 @@
           <w:lang w:bidi="fa-IR"/>
         </w:rPr>
       </w:pPr>
-      <w:proofErr w:type="spellStart"/>
-      <w:r>
-        <w:rPr>
-          <w:rFonts w:asciiTheme="majorBidi" w:hAnsiTheme="majorBidi" w:cstheme="majorBidi"/>
-          <w:sz w:val="28"/>
-          <w:szCs w:val="28"/>
-          <w:lang w:bidi="fa-IR"/>
-        </w:rPr>
-        <w:t>runc</w:t>
-      </w:r>
-      <w:proofErr w:type="spellEnd"/>
-      <w:r>
-        <w:rPr>
-          <w:rFonts w:asciiTheme="majorBidi" w:hAnsiTheme="majorBidi" w:cstheme="majorBidi"/>
-          <w:sz w:val="28"/>
-          <w:szCs w:val="28"/>
-          <w:lang w:bidi="fa-IR"/>
-        </w:rPr>
-        <w:t xml:space="preserve"> exits immediately</w:t>
+      <w:r>
+        <w:rPr>
+          <w:rFonts w:asciiTheme="majorBidi" w:hAnsiTheme="majorBidi" w:cstheme="majorBidi"/>
+          <w:sz w:val="28"/>
+          <w:szCs w:val="28"/>
+          <w:lang w:bidi="fa-IR"/>
+        </w:rPr>
+        <w:t>runc exits immediately</w:t>
       </w:r>
     </w:p>
     <w:p>
@@ -12621,7 +10989,6 @@
                                 <w:szCs w:val="28"/>
                               </w:rPr>
                             </w:pPr>
-                            <w:proofErr w:type="spellStart"/>
                             <w:r>
                               <w:rPr>
                                 <w:rFonts w:asciiTheme="majorBidi" w:hAnsiTheme="majorBidi" w:cstheme="majorBidi"/>
@@ -12630,7 +10997,6 @@
                               </w:rPr>
                               <w:t>containerd</w:t>
                             </w:r>
-                            <w:proofErr w:type="spellEnd"/>
                           </w:p>
                           <w:p>
                             <w:pPr>
@@ -12647,25 +11013,7 @@
                                 <w:sz w:val="28"/>
                                 <w:szCs w:val="28"/>
                               </w:rPr>
-                              <w:t xml:space="preserve">   └── </w:t>
-                            </w:r>
-                            <w:proofErr w:type="spellStart"/>
-                            <w:r>
-                              <w:rPr>
-                                <w:rFonts w:asciiTheme="majorBidi" w:hAnsiTheme="majorBidi" w:cstheme="majorBidi"/>
-                                <w:sz w:val="28"/>
-                                <w:szCs w:val="28"/>
-                              </w:rPr>
-                              <w:t>containerd</w:t>
-                            </w:r>
-                            <w:proofErr w:type="spellEnd"/>
-                            <w:r>
-                              <w:rPr>
-                                <w:rFonts w:asciiTheme="majorBidi" w:hAnsiTheme="majorBidi" w:cstheme="majorBidi"/>
-                                <w:sz w:val="28"/>
-                                <w:szCs w:val="28"/>
-                              </w:rPr>
-                              <w:t>-shim</w:t>
+                              <w:t xml:space="preserve">   └── containerd-shim</w:t>
                             </w:r>
                           </w:p>
                           <w:p>
@@ -12845,145 +11193,54 @@
           <w:lang w:bidi="fa-IR"/>
         </w:rPr>
       </w:pPr>
-      <w:proofErr w:type="spellStart"/>
-      <w:r>
-        <w:rPr>
-          <w:rFonts w:asciiTheme="majorBidi" w:hAnsiTheme="majorBidi" w:cstheme="majorBidi"/>
-          <w:sz w:val="28"/>
-          <w:szCs w:val="28"/>
-          <w:lang w:bidi="fa-IR"/>
-        </w:rPr>
-        <w:t>runc</w:t>
-      </w:r>
-      <w:proofErr w:type="spellEnd"/>
-      <w:r>
-        <w:rPr>
-          <w:rFonts w:asciiTheme="majorBidi" w:hAnsiTheme="majorBidi" w:cstheme="majorBidi"/>
-          <w:sz w:val="28"/>
-          <w:szCs w:val="28"/>
-          <w:lang w:bidi="fa-IR"/>
-        </w:rPr>
-        <w:t xml:space="preserve"> disappears completely.</w:t>
-      </w:r>
-    </w:p>
-    <w:p>
-      <w:pPr>
-        <w:jc w:val="both"/>
-        <w:rPr>
-          <w:rFonts w:asciiTheme="majorBidi" w:hAnsiTheme="majorBidi" w:cstheme="majorBidi"/>
-          <w:sz w:val="28"/>
-          <w:szCs w:val="28"/>
-          <w:lang w:bidi="fa-IR"/>
-        </w:rPr>
-      </w:pPr>
-      <w:r>
-        <w:rPr>
-          <w:rFonts w:asciiTheme="majorBidi" w:hAnsiTheme="majorBidi" w:cstheme="majorBidi"/>
-          <w:sz w:val="28"/>
-          <w:szCs w:val="28"/>
-          <w:lang w:bidi="fa-IR"/>
-        </w:rPr>
-        <w:t xml:space="preserve">Why this design exists is deeply tied to Unix process parenting rules. In Linux, every process must have a parent. If </w:t>
-      </w:r>
-      <w:proofErr w:type="spellStart"/>
-      <w:r>
-        <w:rPr>
-          <w:rFonts w:asciiTheme="majorBidi" w:hAnsiTheme="majorBidi" w:cstheme="majorBidi"/>
-          <w:sz w:val="28"/>
-          <w:szCs w:val="28"/>
-          <w:lang w:bidi="fa-IR"/>
-        </w:rPr>
-        <w:t>containerd</w:t>
-      </w:r>
-      <w:proofErr w:type="spellEnd"/>
-      <w:r>
-        <w:rPr>
-          <w:rFonts w:asciiTheme="majorBidi" w:hAnsiTheme="majorBidi" w:cstheme="majorBidi"/>
-          <w:sz w:val="28"/>
-          <w:szCs w:val="28"/>
-          <w:lang w:bidi="fa-IR"/>
-        </w:rPr>
-        <w:t xml:space="preserve"> itself were the parent and </w:t>
-      </w:r>
-      <w:proofErr w:type="spellStart"/>
-      <w:r>
-        <w:rPr>
-          <w:rFonts w:asciiTheme="majorBidi" w:hAnsiTheme="majorBidi" w:cstheme="majorBidi"/>
-          <w:sz w:val="28"/>
-          <w:szCs w:val="28"/>
-          <w:lang w:bidi="fa-IR"/>
-        </w:rPr>
-        <w:t>containerd</w:t>
-      </w:r>
-      <w:proofErr w:type="spellEnd"/>
-      <w:r>
-        <w:rPr>
-          <w:rFonts w:asciiTheme="majorBidi" w:hAnsiTheme="majorBidi" w:cstheme="majorBidi"/>
-          <w:sz w:val="28"/>
-          <w:szCs w:val="28"/>
-          <w:lang w:bidi="fa-IR"/>
-        </w:rPr>
-        <w:t xml:space="preserve"> crashed or restarted, it would disrupt container management. The shim acts as a stable, minimal supervisor whose only job is to stay alive and watch the container.</w:t>
-      </w:r>
-    </w:p>
-    <w:p>
-      <w:pPr>
-        <w:jc w:val="both"/>
-        <w:rPr>
-          <w:rFonts w:asciiTheme="majorBidi" w:hAnsiTheme="majorBidi" w:cstheme="majorBidi"/>
-          <w:sz w:val="28"/>
-          <w:szCs w:val="28"/>
-          <w:lang w:bidi="fa-IR"/>
-        </w:rPr>
-      </w:pPr>
-      <w:r>
-        <w:rPr>
-          <w:rFonts w:asciiTheme="majorBidi" w:hAnsiTheme="majorBidi" w:cstheme="majorBidi"/>
-          <w:sz w:val="28"/>
-          <w:szCs w:val="28"/>
-          <w:lang w:bidi="fa-IR"/>
-        </w:rPr>
-        <w:t>Another critical reason is daemon independence. You can restart Docker daemon (</w:t>
-      </w:r>
-      <w:proofErr w:type="spellStart"/>
-      <w:r>
-        <w:rPr>
-          <w:rFonts w:asciiTheme="majorBidi" w:hAnsiTheme="majorBidi" w:cstheme="majorBidi"/>
-          <w:sz w:val="28"/>
-          <w:szCs w:val="28"/>
-          <w:lang w:bidi="fa-IR"/>
-        </w:rPr>
-        <w:t>dockerd</w:t>
-      </w:r>
-      <w:proofErr w:type="spellEnd"/>
-      <w:r>
-        <w:rPr>
-          <w:rFonts w:asciiTheme="majorBidi" w:hAnsiTheme="majorBidi" w:cstheme="majorBidi"/>
-          <w:sz w:val="28"/>
-          <w:szCs w:val="28"/>
-          <w:lang w:bidi="fa-IR"/>
-        </w:rPr>
-        <w:t xml:space="preserve">) and </w:t>
-      </w:r>
-      <w:proofErr w:type="spellStart"/>
-      <w:r>
-        <w:rPr>
-          <w:rFonts w:asciiTheme="majorBidi" w:hAnsiTheme="majorBidi" w:cstheme="majorBidi"/>
-          <w:sz w:val="28"/>
-          <w:szCs w:val="28"/>
-          <w:lang w:bidi="fa-IR"/>
-        </w:rPr>
-        <w:t>containerd</w:t>
-      </w:r>
-      <w:proofErr w:type="spellEnd"/>
-      <w:r>
-        <w:rPr>
-          <w:rFonts w:asciiTheme="majorBidi" w:hAnsiTheme="majorBidi" w:cstheme="majorBidi"/>
-          <w:sz w:val="28"/>
-          <w:szCs w:val="28"/>
-          <w:lang w:bidi="fa-IR"/>
-        </w:rPr>
-        <w:t>, and your containers will still keep running. That would not be possible without shim acting as the persistent parent.</w:t>
+      <w:r>
+        <w:rPr>
+          <w:rFonts w:asciiTheme="majorBidi" w:hAnsiTheme="majorBidi" w:cstheme="majorBidi"/>
+          <w:sz w:val="28"/>
+          <w:szCs w:val="28"/>
+          <w:lang w:bidi="fa-IR"/>
+        </w:rPr>
+        <w:t>runc disappears completely.</w:t>
+      </w:r>
+    </w:p>
+    <w:p>
+      <w:pPr>
+        <w:jc w:val="both"/>
+        <w:rPr>
+          <w:rFonts w:asciiTheme="majorBidi" w:hAnsiTheme="majorBidi" w:cstheme="majorBidi"/>
+          <w:sz w:val="28"/>
+          <w:szCs w:val="28"/>
+          <w:lang w:bidi="fa-IR"/>
+        </w:rPr>
+      </w:pPr>
+      <w:r>
+        <w:rPr>
+          <w:rFonts w:asciiTheme="majorBidi" w:hAnsiTheme="majorBidi" w:cstheme="majorBidi"/>
+          <w:sz w:val="28"/>
+          <w:szCs w:val="28"/>
+          <w:lang w:bidi="fa-IR"/>
+        </w:rPr>
+        <w:t>Why this design exists is deeply tied to Unix process parenting rules. In Linux, every process must have a parent. If containerd itself were the parent and containerd crashed or restarted, it would disrupt container management. The shim acts as a stable, minimal supervisor whose only job is to stay alive and watch the container.</w:t>
+      </w:r>
+    </w:p>
+    <w:p>
+      <w:pPr>
+        <w:jc w:val="both"/>
+        <w:rPr>
+          <w:rFonts w:asciiTheme="majorBidi" w:hAnsiTheme="majorBidi" w:cstheme="majorBidi"/>
+          <w:sz w:val="28"/>
+          <w:szCs w:val="28"/>
+          <w:lang w:bidi="fa-IR"/>
+        </w:rPr>
+      </w:pPr>
+      <w:r>
+        <w:rPr>
+          <w:rFonts w:asciiTheme="majorBidi" w:hAnsiTheme="majorBidi" w:cstheme="majorBidi"/>
+          <w:sz w:val="28"/>
+          <w:szCs w:val="28"/>
+          <w:lang w:bidi="fa-IR"/>
+        </w:rPr>
+        <w:t>Another critical reason is daemon independence. You can restart Docker daemon (dockerd) and containerd, and your containers will still keep running. That would not be possible without shim acting as the persistent parent.</w:t>
       </w:r>
     </w:p>
     <w:p>
@@ -13009,47 +11266,7 @@
           <w:szCs w:val="28"/>
           <w:lang w:bidi="fa-IR"/>
         </w:rPr>
-        <w:t xml:space="preserve">In Linux, when a parent process dies, its child processes do NOT die automatically. Instead, they become orphans, and the kernel reassigns them to a special process called </w:t>
-      </w:r>
-      <w:proofErr w:type="spellStart"/>
-      <w:r>
-        <w:rPr>
-          <w:rFonts w:asciiTheme="majorBidi" w:hAnsiTheme="majorBidi" w:cstheme="majorBidi"/>
-          <w:sz w:val="28"/>
-          <w:szCs w:val="28"/>
-          <w:lang w:bidi="fa-IR"/>
-        </w:rPr>
-        <w:t>init</w:t>
-      </w:r>
-      <w:proofErr w:type="spellEnd"/>
-      <w:r>
-        <w:rPr>
-          <w:rFonts w:asciiTheme="majorBidi" w:hAnsiTheme="majorBidi" w:cstheme="majorBidi"/>
-          <w:sz w:val="28"/>
-          <w:szCs w:val="28"/>
-          <w:lang w:bidi="fa-IR"/>
-        </w:rPr>
-        <w:t xml:space="preserve"> (PID 1), or more precisely in modern systems, usually </w:t>
-      </w:r>
-      <w:proofErr w:type="spellStart"/>
-      <w:r>
-        <w:rPr>
-          <w:rFonts w:asciiTheme="majorBidi" w:hAnsiTheme="majorBidi" w:cstheme="majorBidi"/>
-          <w:sz w:val="28"/>
-          <w:szCs w:val="28"/>
-          <w:lang w:bidi="fa-IR"/>
-        </w:rPr>
-        <w:t>systemd</w:t>
-      </w:r>
-      <w:proofErr w:type="spellEnd"/>
-      <w:r>
-        <w:rPr>
-          <w:rFonts w:asciiTheme="majorBidi" w:hAnsiTheme="majorBidi" w:cstheme="majorBidi"/>
-          <w:sz w:val="28"/>
-          <w:szCs w:val="28"/>
-          <w:lang w:bidi="fa-IR"/>
-        </w:rPr>
-        <w:t>.</w:t>
+        <w:t>In Linux, when a parent process dies, its child processes do NOT die automatically. Instead, they become orphans, and the kernel reassigns them to a special process called init (PID 1), or more precisely in modern systems, usually systemd.</w:t>
       </w:r>
     </w:p>
     <w:p>
@@ -13292,7 +11509,6 @@
                                 <w:lang w:bidi="fa-IR"/>
                               </w:rPr>
                             </w:pPr>
-                            <w:proofErr w:type="spellStart"/>
                             <w:r>
                               <w:rPr>
                                 <w:rFonts w:asciiTheme="majorBidi" w:hAnsiTheme="majorBidi" w:cstheme="majorBidi"/>
@@ -13300,17 +11516,7 @@
                                 <w:szCs w:val="28"/>
                                 <w:lang w:bidi="fa-IR"/>
                               </w:rPr>
-                              <w:t>containerd</w:t>
-                            </w:r>
-                            <w:proofErr w:type="spellEnd"/>
-                            <w:r>
-                              <w:rPr>
-                                <w:rFonts w:asciiTheme="majorBidi" w:hAnsiTheme="majorBidi" w:cstheme="majorBidi"/>
-                                <w:sz w:val="28"/>
-                                <w:szCs w:val="28"/>
-                                <w:lang w:bidi="fa-IR"/>
-                              </w:rPr>
-                              <w:t xml:space="preserve"> (PID 100)</w:t>
+                              <w:t>containerd (PID 100)</w:t>
                             </w:r>
                           </w:p>
                           <w:p>
@@ -13527,27 +11733,7 @@
           <w:szCs w:val="28"/>
           <w:lang w:bidi="fa-IR"/>
         </w:rPr>
-        <w:t xml:space="preserve">If </w:t>
-      </w:r>
-      <w:proofErr w:type="spellStart"/>
-      <w:r>
-        <w:rPr>
-          <w:rFonts w:asciiTheme="majorBidi" w:hAnsiTheme="majorBidi" w:cstheme="majorBidi"/>
-          <w:sz w:val="28"/>
-          <w:szCs w:val="28"/>
-          <w:lang w:bidi="fa-IR"/>
-        </w:rPr>
-        <w:t>containerd</w:t>
-      </w:r>
-      <w:proofErr w:type="spellEnd"/>
-      <w:r>
-        <w:rPr>
-          <w:rFonts w:asciiTheme="majorBidi" w:hAnsiTheme="majorBidi" w:cstheme="majorBidi"/>
-          <w:sz w:val="28"/>
-          <w:szCs w:val="28"/>
-          <w:lang w:bidi="fa-IR"/>
-        </w:rPr>
-        <w:t xml:space="preserve"> crashes:</w:t>
+        <w:t>If containerd crashes:</w:t>
       </w:r>
     </w:p>
     <w:p>
@@ -13625,7 +11811,6 @@
                                 <w:lang w:bidi="fa-IR"/>
                               </w:rPr>
                             </w:pPr>
-                            <w:proofErr w:type="spellStart"/>
                             <w:r>
                               <w:rPr>
                                 <w:rFonts w:asciiTheme="majorBidi" w:hAnsiTheme="majorBidi" w:cstheme="majorBidi"/>
@@ -13633,17 +11818,7 @@
                                 <w:szCs w:val="28"/>
                                 <w:lang w:bidi="fa-IR"/>
                               </w:rPr>
-                              <w:t>systemd</w:t>
-                            </w:r>
-                            <w:proofErr w:type="spellEnd"/>
-                            <w:r>
-                              <w:rPr>
-                                <w:rFonts w:asciiTheme="majorBidi" w:hAnsiTheme="majorBidi" w:cstheme="majorBidi"/>
-                                <w:sz w:val="28"/>
-                                <w:szCs w:val="28"/>
-                                <w:lang w:bidi="fa-IR"/>
-                              </w:rPr>
-                              <w:t xml:space="preserve"> (PID 1)</w:t>
+                              <w:t>systemd (PID 1)</w:t>
                             </w:r>
                           </w:p>
                           <w:p>
@@ -13935,25 +12110,14 @@
         </w:rPr>
         <w:t xml:space="preserve"> </w:t>
       </w:r>
-      <w:proofErr w:type="spellStart"/>
-      <w:r>
-        <w:rPr>
-          <w:rFonts w:asciiTheme="majorBidi" w:hAnsiTheme="majorBidi" w:cstheme="majorBidi"/>
-          <w:sz w:val="28"/>
-          <w:szCs w:val="28"/>
-          <w:lang w:bidi="fa-IR"/>
-        </w:rPr>
-        <w:t>Containerd</w:t>
-      </w:r>
-      <w:proofErr w:type="spellEnd"/>
-      <w:r>
-        <w:rPr>
-          <w:rFonts w:asciiTheme="majorBidi" w:hAnsiTheme="majorBidi" w:cstheme="majorBidi"/>
-          <w:sz w:val="28"/>
-          <w:szCs w:val="28"/>
-          <w:lang w:bidi="fa-IR"/>
-        </w:rPr>
-        <w:t xml:space="preserve"> is responsible for:</w:t>
+      <w:r>
+        <w:rPr>
+          <w:rFonts w:asciiTheme="majorBidi" w:hAnsiTheme="majorBidi" w:cstheme="majorBidi"/>
+          <w:sz w:val="28"/>
+          <w:szCs w:val="28"/>
+          <w:lang w:bidi="fa-IR"/>
+        </w:rPr>
+        <w:t>Containerd is responsible for:</w:t>
       </w:r>
     </w:p>
     <w:p>
@@ -14005,19 +12169,8 @@
           <w:szCs w:val="28"/>
           <w:lang w:bidi="fa-IR"/>
         </w:rPr>
-        <w:t>Managing stdin/</w:t>
-      </w:r>
-      <w:proofErr w:type="spellStart"/>
-      <w:r>
-        <w:rPr>
-          <w:rFonts w:asciiTheme="majorBidi" w:hAnsiTheme="majorBidi" w:cstheme="majorBidi"/>
-          <w:sz w:val="28"/>
-          <w:szCs w:val="28"/>
-          <w:lang w:bidi="fa-IR"/>
-        </w:rPr>
-        <w:t>stdout</w:t>
-      </w:r>
-      <w:proofErr w:type="spellEnd"/>
+        <w:t>Managing stdin/stdout</w:t>
+      </w:r>
     </w:p>
     <w:p>
       <w:pPr>
@@ -14089,47 +12242,7 @@
           <w:szCs w:val="28"/>
           <w:lang w:bidi="fa-IR"/>
         </w:rPr>
-        <w:t xml:space="preserve">If </w:t>
-      </w:r>
-      <w:proofErr w:type="spellStart"/>
-      <w:r>
-        <w:rPr>
-          <w:rFonts w:asciiTheme="majorBidi" w:hAnsiTheme="majorBidi" w:cstheme="majorBidi"/>
-          <w:sz w:val="28"/>
-          <w:szCs w:val="28"/>
-          <w:lang w:bidi="fa-IR"/>
-        </w:rPr>
-        <w:t>containerd</w:t>
-      </w:r>
-      <w:proofErr w:type="spellEnd"/>
-      <w:r>
-        <w:rPr>
-          <w:rFonts w:asciiTheme="majorBidi" w:hAnsiTheme="majorBidi" w:cstheme="majorBidi"/>
-          <w:sz w:val="28"/>
-          <w:szCs w:val="28"/>
-          <w:lang w:bidi="fa-IR"/>
-        </w:rPr>
-        <w:t xml:space="preserve"> were the direct parent and it crashed, even though the container would still run, </w:t>
-      </w:r>
-      <w:proofErr w:type="spellStart"/>
-      <w:r>
-        <w:rPr>
-          <w:rFonts w:asciiTheme="majorBidi" w:hAnsiTheme="majorBidi" w:cstheme="majorBidi"/>
-          <w:sz w:val="28"/>
-          <w:szCs w:val="28"/>
-          <w:lang w:bidi="fa-IR"/>
-        </w:rPr>
-        <w:t>containerd</w:t>
-      </w:r>
-      <w:proofErr w:type="spellEnd"/>
-      <w:r>
-        <w:rPr>
-          <w:rFonts w:asciiTheme="majorBidi" w:hAnsiTheme="majorBidi" w:cstheme="majorBidi"/>
-          <w:sz w:val="28"/>
-          <w:szCs w:val="28"/>
-          <w:lang w:bidi="fa-IR"/>
-        </w:rPr>
-        <w:t xml:space="preserve"> would lose track of it completely. It would not know:</w:t>
+        <w:t>If containerd were the direct parent and it crashed, even though the container would still run, containerd would lose track of it completely. It would not know:</w:t>
       </w:r>
     </w:p>
     <w:p>
@@ -14246,27 +12359,7 @@
           <w:szCs w:val="28"/>
           <w:lang w:bidi="fa-IR"/>
         </w:rPr>
-        <w:t xml:space="preserve">When </w:t>
-      </w:r>
-      <w:proofErr w:type="spellStart"/>
-      <w:r>
-        <w:rPr>
-          <w:rFonts w:asciiTheme="majorBidi" w:hAnsiTheme="majorBidi" w:cstheme="majorBidi"/>
-          <w:sz w:val="28"/>
-          <w:szCs w:val="28"/>
-          <w:lang w:bidi="fa-IR"/>
-        </w:rPr>
-        <w:t>containerd</w:t>
-      </w:r>
-      <w:proofErr w:type="spellEnd"/>
-      <w:r>
-        <w:rPr>
-          <w:rFonts w:asciiTheme="majorBidi" w:hAnsiTheme="majorBidi" w:cstheme="majorBidi"/>
-          <w:sz w:val="28"/>
-          <w:szCs w:val="28"/>
-          <w:lang w:bidi="fa-IR"/>
-        </w:rPr>
-        <w:t xml:space="preserve"> restarts, it reconnects to the shim and regains control.</w:t>
+        <w:t>When containerd restarts, it reconnects to the shim and regains control.</w:t>
       </w:r>
       <w:r>
         <w:rPr>
@@ -14284,27 +12377,7 @@
           <w:szCs w:val="28"/>
           <w:lang w:bidi="fa-IR"/>
         </w:rPr>
-        <w:t xml:space="preserve">Without shim, </w:t>
-      </w:r>
-      <w:proofErr w:type="spellStart"/>
-      <w:r>
-        <w:rPr>
-          <w:rFonts w:asciiTheme="majorBidi" w:hAnsiTheme="majorBidi" w:cstheme="majorBidi"/>
-          <w:sz w:val="28"/>
-          <w:szCs w:val="28"/>
-          <w:lang w:bidi="fa-IR"/>
-        </w:rPr>
-        <w:t>containerd</w:t>
-      </w:r>
-      <w:proofErr w:type="spellEnd"/>
-      <w:r>
-        <w:rPr>
-          <w:rFonts w:asciiTheme="majorBidi" w:hAnsiTheme="majorBidi" w:cstheme="majorBidi"/>
-          <w:sz w:val="28"/>
-          <w:szCs w:val="28"/>
-          <w:lang w:bidi="fa-IR"/>
-        </w:rPr>
-        <w:t xml:space="preserve"> would lose visibility.</w:t>
+        <w:t>Without shim, containerd would lose visibility.</w:t>
       </w:r>
       <w:r>
         <w:rPr>
@@ -14322,27 +12395,7 @@
           <w:szCs w:val="28"/>
           <w:lang w:bidi="fa-IR"/>
         </w:rPr>
-        <w:t xml:space="preserve">With shim, </w:t>
-      </w:r>
-      <w:proofErr w:type="spellStart"/>
-      <w:r>
-        <w:rPr>
-          <w:rFonts w:asciiTheme="majorBidi" w:hAnsiTheme="majorBidi" w:cstheme="majorBidi"/>
-          <w:sz w:val="28"/>
-          <w:szCs w:val="28"/>
-          <w:lang w:bidi="fa-IR"/>
-        </w:rPr>
-        <w:t>containerd</w:t>
-      </w:r>
-      <w:proofErr w:type="spellEnd"/>
-      <w:r>
-        <w:rPr>
-          <w:rFonts w:asciiTheme="majorBidi" w:hAnsiTheme="majorBidi" w:cstheme="majorBidi"/>
-          <w:sz w:val="28"/>
-          <w:szCs w:val="28"/>
-          <w:lang w:bidi="fa-IR"/>
-        </w:rPr>
-        <w:t xml:space="preserve"> can recover state.</w:t>
+        <w:t>With shim, containerd can recover state.</w:t>
       </w:r>
     </w:p>
     <w:p>
@@ -14363,27 +12416,7 @@
           <w:szCs w:val="28"/>
           <w:lang w:bidi="fa-IR"/>
         </w:rPr>
-        <w:t>Another extremely important reason is stdin/</w:t>
-      </w:r>
-      <w:proofErr w:type="spellStart"/>
-      <w:r>
-        <w:rPr>
-          <w:rFonts w:asciiTheme="majorBidi" w:hAnsiTheme="majorBidi" w:cstheme="majorBidi"/>
-          <w:sz w:val="28"/>
-          <w:szCs w:val="28"/>
-          <w:lang w:bidi="fa-IR"/>
-        </w:rPr>
-        <w:t>stdout</w:t>
-      </w:r>
-      <w:proofErr w:type="spellEnd"/>
-      <w:r>
-        <w:rPr>
-          <w:rFonts w:asciiTheme="majorBidi" w:hAnsiTheme="majorBidi" w:cstheme="majorBidi"/>
-          <w:sz w:val="28"/>
-          <w:szCs w:val="28"/>
-          <w:lang w:bidi="fa-IR"/>
-        </w:rPr>
-        <w:t xml:space="preserve"> handling.</w:t>
+        <w:t>Another extremely important reason is stdin/stdout handling.</w:t>
       </w:r>
     </w:p>
     <w:p>
@@ -14590,47 +12623,7 @@
           <w:szCs w:val="28"/>
           <w:lang w:bidi="fa-IR"/>
         </w:rPr>
-        <w:t xml:space="preserve">Container config (environment variables, </w:t>
-      </w:r>
-      <w:proofErr w:type="spellStart"/>
-      <w:r>
-        <w:rPr>
-          <w:rFonts w:asciiTheme="majorBidi" w:hAnsiTheme="majorBidi" w:cstheme="majorBidi"/>
-          <w:sz w:val="28"/>
-          <w:szCs w:val="28"/>
-          <w:lang w:bidi="fa-IR"/>
-        </w:rPr>
-        <w:t>entrypoint</w:t>
-      </w:r>
-      <w:proofErr w:type="spellEnd"/>
-      <w:r>
-        <w:rPr>
-          <w:rFonts w:asciiTheme="majorBidi" w:hAnsiTheme="majorBidi" w:cstheme="majorBidi"/>
-          <w:sz w:val="28"/>
-          <w:szCs w:val="28"/>
-          <w:lang w:bidi="fa-IR"/>
-        </w:rPr>
-        <w:t xml:space="preserve">, </w:t>
-      </w:r>
-      <w:proofErr w:type="spellStart"/>
-      <w:r>
-        <w:rPr>
-          <w:rFonts w:asciiTheme="majorBidi" w:hAnsiTheme="majorBidi" w:cstheme="majorBidi"/>
-          <w:sz w:val="28"/>
-          <w:szCs w:val="28"/>
-          <w:lang w:bidi="fa-IR"/>
-        </w:rPr>
-        <w:t>cmd</w:t>
-      </w:r>
-      <w:proofErr w:type="spellEnd"/>
-      <w:r>
-        <w:rPr>
-          <w:rFonts w:asciiTheme="majorBidi" w:hAnsiTheme="majorBidi" w:cstheme="majorBidi"/>
-          <w:sz w:val="28"/>
-          <w:szCs w:val="28"/>
-          <w:lang w:bidi="fa-IR"/>
-        </w:rPr>
-        <w:t>)</w:t>
+        <w:t>Container config (environment variables, entrypoint, cmd)</w:t>
       </w:r>
     </w:p>
     <w:p>
@@ -14806,27 +12799,7 @@
           <w:szCs w:val="28"/>
           <w:lang w:bidi="fa-IR"/>
         </w:rPr>
-        <w:t xml:space="preserve">For images → it shows layers, architecture, </w:t>
-      </w:r>
-      <w:proofErr w:type="spellStart"/>
-      <w:r>
-        <w:rPr>
-          <w:rFonts w:asciiTheme="majorBidi" w:hAnsiTheme="majorBidi" w:cstheme="majorBidi"/>
-          <w:sz w:val="28"/>
-          <w:szCs w:val="28"/>
-          <w:lang w:bidi="fa-IR"/>
-        </w:rPr>
-        <w:t>entrypoint</w:t>
-      </w:r>
-      <w:proofErr w:type="spellEnd"/>
-      <w:r>
-        <w:rPr>
-          <w:rFonts w:asciiTheme="majorBidi" w:hAnsiTheme="majorBidi" w:cstheme="majorBidi"/>
-          <w:sz w:val="28"/>
-          <w:szCs w:val="28"/>
-          <w:lang w:bidi="fa-IR"/>
-        </w:rPr>
-        <w:t>, default command, labels, etc.</w:t>
+        <w:t>For images → it shows layers, architecture, entrypoint, default command, labels, etc.</w:t>
       </w:r>
     </w:p>
     <w:p>
@@ -14950,35 +12923,7 @@
           <w:szCs w:val="28"/>
           <w:lang w:bidi="fa-IR"/>
         </w:rPr>
-        <w:t>docker inspect -f '{{.</w:t>
-      </w:r>
-      <w:proofErr w:type="spellStart"/>
-      <w:r>
-        <w:rPr>
-          <w:rFonts w:asciiTheme="majorBidi" w:hAnsiTheme="majorBidi" w:cstheme="majorBidi"/>
-          <w:b/>
-          <w:bCs/>
-          <w:i/>
-          <w:iCs/>
-          <w:sz w:val="28"/>
-          <w:szCs w:val="28"/>
-          <w:lang w:bidi="fa-IR"/>
-        </w:rPr>
-        <w:t>State.Pid</w:t>
-      </w:r>
-      <w:proofErr w:type="spellEnd"/>
-      <w:r>
-        <w:rPr>
-          <w:rFonts w:asciiTheme="majorBidi" w:hAnsiTheme="majorBidi" w:cstheme="majorBidi"/>
-          <w:b/>
-          <w:bCs/>
-          <w:i/>
-          <w:iCs/>
-          <w:sz w:val="28"/>
-          <w:szCs w:val="28"/>
-          <w:lang w:bidi="fa-IR"/>
-        </w:rPr>
-        <w:t>}}' my-container</w:t>
+        <w:t>docker inspect -f '{{.State.Pid}}' my-container</w:t>
       </w:r>
       <w:r>
         <w:rPr>
@@ -15050,23 +12995,8 @@
           <w:szCs w:val="28"/>
           <w:lang w:bidi="fa-IR"/>
         </w:rPr>
-        <w:t xml:space="preserve">docker </w:t>
-      </w:r>
-      <w:proofErr w:type="spellStart"/>
-      <w:r>
-        <w:rPr>
-          <w:rFonts w:asciiTheme="majorBidi" w:hAnsiTheme="majorBidi" w:cstheme="majorBidi"/>
-          <w:b/>
-          <w:bCs/>
-          <w:i/>
-          <w:iCs/>
-          <w:sz w:val="28"/>
-          <w:szCs w:val="28"/>
-          <w:lang w:bidi="fa-IR"/>
-        </w:rPr>
-        <w:t>ps</w:t>
-      </w:r>
-      <w:proofErr w:type="spellEnd"/>
+        <w:t>docker ps</w:t>
+      </w:r>
       <w:r>
         <w:rPr>
           <w:rFonts w:asciiTheme="majorBidi" w:hAnsiTheme="majorBidi" w:cstheme="majorBidi"/>
@@ -15293,23 +13223,8 @@
           <w:szCs w:val="28"/>
           <w:lang w:bidi="fa-IR"/>
         </w:rPr>
-        <w:t xml:space="preserve">docker system </w:t>
-      </w:r>
-      <w:proofErr w:type="spellStart"/>
-      <w:r>
-        <w:rPr>
-          <w:rFonts w:asciiTheme="majorBidi" w:hAnsiTheme="majorBidi" w:cstheme="majorBidi"/>
-          <w:b/>
-          <w:bCs/>
-          <w:i/>
-          <w:iCs/>
-          <w:sz w:val="28"/>
-          <w:szCs w:val="28"/>
-          <w:lang w:bidi="fa-IR"/>
-        </w:rPr>
-        <w:t>df</w:t>
-      </w:r>
-      <w:proofErr w:type="spellEnd"/>
+        <w:t>docker system df</w:t>
+      </w:r>
       <w:r>
         <w:rPr>
           <w:rFonts w:asciiTheme="majorBidi" w:hAnsiTheme="majorBidi" w:cstheme="majorBidi"/>

</xml_diff>